<commit_message>
Added Schwab API and authorized it.  Created a file to send live trades to ToS.
</commit_message>
<xml_diff>
--- a/Admin/Earnings Advantage Work Flow Doc.docx
+++ b/Admin/Earnings Advantage Work Flow Doc.docx
@@ -231,7 +231,43 @@
           <w:sz w:val="22"/>
           <w:szCs w:val="22"/>
         </w:rPr>
-        <w:t>Send_Live_Trade_</w:t>
+        <w:t>Open</w:t>
+      </w:r>
+      <w:r>
+        <w:rPr>
+          <w:b/>
+          <w:bCs/>
+          <w:sz w:val="22"/>
+          <w:szCs w:val="22"/>
+        </w:rPr>
+        <w:t>_T</w:t>
+      </w:r>
+      <w:r>
+        <w:rPr>
+          <w:b/>
+          <w:bCs/>
+          <w:sz w:val="22"/>
+          <w:szCs w:val="22"/>
+        </w:rPr>
+        <w:t>rade</w:t>
+      </w:r>
+      <w:r>
+        <w:rPr>
+          <w:b/>
+          <w:bCs/>
+          <w:sz w:val="22"/>
+          <w:szCs w:val="22"/>
+        </w:rPr>
+        <w:t>s</w:t>
+      </w:r>
+      <w:r>
+        <w:rPr>
+          <w:b/>
+          <w:bCs/>
+          <w:sz w:val="22"/>
+          <w:szCs w:val="22"/>
+        </w:rPr>
+        <w:t>_</w:t>
       </w:r>
       <w:r>
         <w:rPr>
@@ -588,7 +624,25 @@
           <w:sz w:val="22"/>
           <w:szCs w:val="22"/>
         </w:rPr>
-        <w:t>GW_Auto</w:t>
+        <w:t>IB</w:t>
+      </w:r>
+      <w:r>
+        <w:rPr>
+          <w:b/>
+          <w:bCs/>
+          <w:sz w:val="22"/>
+          <w:szCs w:val="22"/>
+        </w:rPr>
+        <w:t>_</w:t>
+      </w:r>
+      <w:r>
+        <w:rPr>
+          <w:b/>
+          <w:bCs/>
+          <w:sz w:val="22"/>
+          <w:szCs w:val="22"/>
+        </w:rPr>
+        <w:t>via_GW</w:t>
       </w:r>
       <w:proofErr w:type="spellEnd"/>
       <w:r>
@@ -762,7 +816,16 @@
           <w:sz w:val="22"/>
           <w:szCs w:val="22"/>
         </w:rPr>
-        <w:t>_Opens_Auto</w:t>
+        <w:t>_Opens_</w:t>
+      </w:r>
+      <w:r>
+        <w:rPr>
+          <w:b/>
+          <w:bCs/>
+          <w:sz w:val="22"/>
+          <w:szCs w:val="22"/>
+        </w:rPr>
+        <w:t>IB</w:t>
       </w:r>
       <w:proofErr w:type="spellEnd"/>
       <w:r>
@@ -992,7 +1055,7 @@
           <w:sz w:val="22"/>
           <w:szCs w:val="22"/>
         </w:rPr>
-        <w:t>Get_C</w:t>
+        <w:t>Get_</w:t>
       </w:r>
       <w:r>
         <w:rPr>
@@ -1001,7 +1064,7 @@
           <w:sz w:val="22"/>
           <w:szCs w:val="22"/>
         </w:rPr>
-        <w:t>P</w:t>
+        <w:t>Closes</w:t>
       </w:r>
       <w:r>
         <w:rPr>
@@ -1019,7 +1082,7 @@
           <w:sz w:val="22"/>
           <w:szCs w:val="22"/>
         </w:rPr>
-        <w:t>Auto</w:t>
+        <w:t>IB</w:t>
       </w:r>
       <w:proofErr w:type="spellEnd"/>
       <w:r>
@@ -1252,6 +1315,17 @@
           <w:szCs w:val="22"/>
         </w:rPr>
       </w:pPr>
+    </w:p>
+    <w:p>
+      <w:pPr>
+        <w:pStyle w:val="ListParagraph"/>
+        <w:rPr>
+          <w:i/>
+          <w:iCs/>
+          <w:sz w:val="22"/>
+          <w:szCs w:val="22"/>
+        </w:rPr>
+      </w:pPr>
       <w:r>
         <w:rPr>
           <w:noProof/>
@@ -1259,18 +1333,18 @@
         <mc:AlternateContent>
           <mc:Choice Requires="wps">
             <w:drawing>
-              <wp:anchor distT="0" distB="0" distL="114300" distR="114300" simplePos="0" relativeHeight="251704320" behindDoc="0" locked="0" layoutInCell="1" allowOverlap="1" wp14:anchorId="58686D95" wp14:editId="269325EA">
+              <wp:anchor distT="0" distB="0" distL="114300" distR="114300" simplePos="0" relativeHeight="251671552" behindDoc="0" locked="0" layoutInCell="1" allowOverlap="1" wp14:anchorId="39DC5772" wp14:editId="47A4E342">
                 <wp:simplePos x="0" y="0"/>
                 <wp:positionH relativeFrom="column">
-                  <wp:posOffset>556340</wp:posOffset>
+                  <wp:posOffset>3571875</wp:posOffset>
                 </wp:positionH>
                 <wp:positionV relativeFrom="paragraph">
-                  <wp:posOffset>1638757</wp:posOffset>
+                  <wp:posOffset>259715</wp:posOffset>
                 </wp:positionV>
-                <wp:extent cx="6017749" cy="829967"/>
-                <wp:effectExtent l="0" t="57150" r="21590" b="27305"/>
+                <wp:extent cx="548640" cy="548640"/>
+                <wp:effectExtent l="0" t="0" r="22860" b="22860"/>
                 <wp:wrapNone/>
-                <wp:docPr id="1080643459" name="Freeform: Shape 21"/>
+                <wp:docPr id="514764047" name="Rectangle: Rounded Corners 1"/>
                 <wp:cNvGraphicFramePr/>
                 <a:graphic xmlns:a="http://schemas.openxmlformats.org/drawingml/2006/main">
                   <a:graphicData uri="http://schemas.microsoft.com/office/word/2010/wordprocessingShape">
@@ -1279,132 +1353,130 @@
                       <wps:spPr>
                         <a:xfrm>
                           <a:off x="0" y="0"/>
-                          <a:ext cx="6017749" cy="829967"/>
+                          <a:ext cx="548640" cy="548640"/>
                         </a:xfrm>
-                        <a:custGeom>
+                        <a:prstGeom prst="roundRect">
                           <a:avLst/>
-                          <a:gdLst>
-                            <a:gd name="csX0" fmla="*/ 5745705 w 6017749"/>
-                            <a:gd name="csY0" fmla="*/ 0 h 829967"/>
-                            <a:gd name="csX1" fmla="*/ 6016367 w 6017749"/>
-                            <a:gd name="csY1" fmla="*/ 468173 h 829967"/>
-                            <a:gd name="csX2" fmla="*/ 5643292 w 6017749"/>
-                            <a:gd name="csY2" fmla="*/ 768096 h 829967"/>
-                            <a:gd name="csX3" fmla="*/ 4948348 w 6017749"/>
-                            <a:gd name="csY3" fmla="*/ 826618 h 829967"/>
-                            <a:gd name="csX4" fmla="*/ 1773551 w 6017749"/>
-                            <a:gd name="csY4" fmla="*/ 819303 h 829967"/>
-                            <a:gd name="csX5" fmla="*/ 376348 w 6017749"/>
-                            <a:gd name="csY5" fmla="*/ 790042 h 829967"/>
-                            <a:gd name="csX6" fmla="*/ 83740 w 6017749"/>
-                            <a:gd name="csY6" fmla="*/ 607162 h 829967"/>
-                            <a:gd name="csX7" fmla="*/ 10588 w 6017749"/>
-                            <a:gd name="csY7" fmla="*/ 138989 h 829967"/>
-                            <a:gd name="csX8" fmla="*/ 273935 w 6017749"/>
-                            <a:gd name="csY8" fmla="*/ 7315 h 829967"/>
-                          </a:gdLst>
-                          <a:ahLst/>
-                          <a:cxnLst>
-                            <a:cxn ang="0">
-                              <a:pos x="csX0" y="csY0"/>
-                            </a:cxn>
-                            <a:cxn ang="0">
-                              <a:pos x="csX1" y="csY1"/>
-                            </a:cxn>
-                            <a:cxn ang="0">
-                              <a:pos x="csX2" y="csY2"/>
-                            </a:cxn>
-                            <a:cxn ang="0">
-                              <a:pos x="csX3" y="csY3"/>
-                            </a:cxn>
-                            <a:cxn ang="0">
-                              <a:pos x="csX4" y="csY4"/>
-                            </a:cxn>
-                            <a:cxn ang="0">
-                              <a:pos x="csX5" y="csY5"/>
-                            </a:cxn>
-                            <a:cxn ang="0">
-                              <a:pos x="csX6" y="csY6"/>
-                            </a:cxn>
-                            <a:cxn ang="0">
-                              <a:pos x="csX7" y="csY7"/>
-                            </a:cxn>
-                            <a:cxn ang="0">
-                              <a:pos x="csX8" y="csY8"/>
-                            </a:cxn>
-                          </a:cxnLst>
-                          <a:rect l="l" t="t" r="r" b="b"/>
-                          <a:pathLst>
-                            <a:path w="6017749" h="829967">
-                              <a:moveTo>
-                                <a:pt x="5745705" y="0"/>
-                              </a:moveTo>
-                              <a:cubicBezTo>
-                                <a:pt x="5889570" y="170078"/>
-                                <a:pt x="6033436" y="340157"/>
-                                <a:pt x="6016367" y="468173"/>
-                              </a:cubicBezTo>
-                              <a:cubicBezTo>
-                                <a:pt x="5999298" y="596189"/>
-                                <a:pt x="5821295" y="708355"/>
-                                <a:pt x="5643292" y="768096"/>
-                              </a:cubicBezTo>
-                              <a:cubicBezTo>
-                                <a:pt x="5465289" y="827837"/>
-                                <a:pt x="5593305" y="818084"/>
-                                <a:pt x="4948348" y="826618"/>
-                              </a:cubicBezTo>
-                              <a:cubicBezTo>
-                                <a:pt x="4303391" y="835153"/>
-                                <a:pt x="2535551" y="825399"/>
-                                <a:pt x="1773551" y="819303"/>
-                              </a:cubicBezTo>
-                              <a:cubicBezTo>
-                                <a:pt x="1011551" y="813207"/>
-                                <a:pt x="657983" y="825399"/>
-                                <a:pt x="376348" y="790042"/>
-                              </a:cubicBezTo>
-                              <a:cubicBezTo>
-                                <a:pt x="94713" y="754685"/>
-                                <a:pt x="144700" y="715671"/>
-                                <a:pt x="83740" y="607162"/>
-                              </a:cubicBezTo>
-                              <a:cubicBezTo>
-                                <a:pt x="22780" y="498653"/>
-                                <a:pt x="-21111" y="238963"/>
-                                <a:pt x="10588" y="138989"/>
-                              </a:cubicBezTo>
-                              <a:cubicBezTo>
-                                <a:pt x="42287" y="39015"/>
-                                <a:pt x="158111" y="23165"/>
-                                <a:pt x="273935" y="7315"/>
-                              </a:cubicBezTo>
-                            </a:path>
-                          </a:pathLst>
-                        </a:custGeom>
-                        <a:noFill/>
-                        <a:ln w="9525">
-                          <a:headEnd type="none" w="med" len="med"/>
-                          <a:tailEnd type="triangle" w="med" len="med"/>
-                        </a:ln>
+                        </a:prstGeom>
                       </wps:spPr>
                       <wps:style>
                         <a:lnRef idx="2">
-                          <a:schemeClr val="accent1">
+                          <a:schemeClr val="accent6">
                             <a:shade val="15000"/>
                           </a:schemeClr>
                         </a:lnRef>
                         <a:fillRef idx="1">
-                          <a:schemeClr val="accent1"/>
+                          <a:schemeClr val="accent6"/>
                         </a:fillRef>
                         <a:effectRef idx="0">
-                          <a:schemeClr val="accent1"/>
+                          <a:schemeClr val="accent6"/>
                         </a:effectRef>
                         <a:fontRef idx="minor">
                           <a:schemeClr val="lt1"/>
                         </a:fontRef>
                       </wps:style>
-                      <wps:bodyPr rot="0" spcFirstLastPara="0" vertOverflow="overflow" horzOverflow="overflow" vert="horz" wrap="square" lIns="91440" tIns="45720" rIns="91440" bIns="45720" numCol="1" spcCol="0" rtlCol="0" fromWordArt="0" anchor="ctr" anchorCtr="0" forceAA="0" compatLnSpc="1">
+                      <wps:txbx>
+                        <w:txbxContent>
+                          <w:p>
+                            <w:pPr>
+                              <w:spacing w:after="0"/>
+                              <w:jc w:val="center"/>
+                              <w:rPr>
+                                <w:b/>
+                                <w:bCs/>
+                                <w:color w:val="000000" w:themeColor="text1"/>
+                                <w14:textOutline w14:w="9525" w14:cap="rnd" w14:cmpd="sng" w14:algn="ctr">
+                                  <w14:noFill/>
+                                  <w14:prstDash w14:val="solid"/>
+                                  <w14:bevel/>
+                                </w14:textOutline>
+                              </w:rPr>
+                            </w:pPr>
+                            <w:r>
+                              <w:rPr>
+                                <w:b/>
+                                <w:bCs/>
+                                <w:color w:val="000000" w:themeColor="text1"/>
+                                <w14:textOutline w14:w="9525" w14:cap="rnd" w14:cmpd="sng" w14:algn="ctr">
+                                  <w14:noFill/>
+                                  <w14:prstDash w14:val="solid"/>
+                                  <w14:bevel/>
+                                </w14:textOutline>
+                              </w:rPr>
+                              <w:t>C</w:t>
+                            </w:r>
+                          </w:p>
+                          <w:p>
+                            <w:pPr>
+                              <w:spacing w:after="0"/>
+                              <w:jc w:val="center"/>
+                              <w:rPr>
+                                <w:color w:val="000000" w:themeColor="text1"/>
+                                <w:sz w:val="14"/>
+                                <w:szCs w:val="14"/>
+                                <w14:textOutline w14:w="9525" w14:cap="rnd" w14:cmpd="sng" w14:algn="ctr">
+                                  <w14:noFill/>
+                                  <w14:prstDash w14:val="solid"/>
+                                  <w14:bevel/>
+                                </w14:textOutline>
+                              </w:rPr>
+                            </w:pPr>
+                            <w:r>
+                              <w:rPr>
+                                <w:color w:val="000000" w:themeColor="text1"/>
+                                <w:sz w:val="14"/>
+                                <w:szCs w:val="14"/>
+                                <w14:textOutline w14:w="9525" w14:cap="rnd" w14:cmpd="sng" w14:algn="ctr">
+                                  <w14:noFill/>
+                                  <w14:prstDash w14:val="solid"/>
+                                  <w14:bevel/>
+                                </w14:textOutline>
+                              </w:rPr>
+                              <w:t xml:space="preserve">Actualize </w:t>
+                            </w:r>
+                            <w:r>
+                              <w:rPr>
+                                <w:color w:val="000000" w:themeColor="text1"/>
+                                <w:sz w:val="14"/>
+                                <w:szCs w:val="14"/>
+                                <w14:textOutline w14:w="9525" w14:cap="rnd" w14:cmpd="sng" w14:algn="ctr">
+                                  <w14:noFill/>
+                                  <w14:prstDash w14:val="solid"/>
+                                  <w14:bevel/>
+                                </w14:textOutline>
+                              </w:rPr>
+                              <w:t>Exit (</w:t>
+                            </w:r>
+                            <w:r>
+                              <w:rPr>
+                                <w:color w:val="000000" w:themeColor="text1"/>
+                                <w:sz w:val="14"/>
+                                <w:szCs w:val="14"/>
+                                <w14:textOutline w14:w="9525" w14:cap="rnd" w14:cmpd="sng" w14:algn="ctr">
+                                  <w14:noFill/>
+                                  <w14:prstDash w14:val="solid"/>
+                                  <w14:bevel/>
+                                </w14:textOutline>
+                              </w:rPr>
+                              <w:t>Open</w:t>
+                            </w:r>
+                            <w:r>
+                              <w:rPr>
+                                <w:color w:val="000000" w:themeColor="text1"/>
+                                <w:sz w:val="14"/>
+                                <w:szCs w:val="14"/>
+                                <w14:textOutline w14:w="9525" w14:cap="rnd" w14:cmpd="sng" w14:algn="ctr">
+                                  <w14:noFill/>
+                                  <w14:prstDash w14:val="solid"/>
+                                  <w14:bevel/>
+                                </w14:textOutline>
+                              </w:rPr>
+                              <w:t>)</w:t>
+                            </w:r>
+                          </w:p>
+                        </w:txbxContent>
+                      </wps:txbx>
+                      <wps:bodyPr rot="0" spcFirstLastPara="0" vertOverflow="overflow" horzOverflow="overflow" vert="horz" wrap="square" lIns="0" tIns="0" rIns="0" bIns="0" numCol="1" spcCol="0" rtlCol="0" fromWordArt="0" anchor="ctr" anchorCtr="0" forceAA="0" compatLnSpc="1">
                         <a:prstTxWarp prst="textNoShape">
                           <a:avLst/>
                         </a:prstTxWarp>
@@ -1413,14 +1485,199 @@
                     </wps:wsp>
                   </a:graphicData>
                 </a:graphic>
+                <wp14:sizeRelH relativeFrom="margin">
+                  <wp14:pctWidth>0</wp14:pctWidth>
+                </wp14:sizeRelH>
+                <wp14:sizeRelV relativeFrom="margin">
+                  <wp14:pctHeight>0</wp14:pctHeight>
+                </wp14:sizeRelV>
               </wp:anchor>
             </w:drawing>
           </mc:Choice>
           <mc:Fallback>
             <w:pict>
-              <v:shape w14:anchorId="52EEFE40" id="Freeform: Shape 21" o:spid="_x0000_s1026" style="position:absolute;margin-left:43.8pt;margin-top:129.05pt;width:473.85pt;height:65.35pt;z-index:251704320;visibility:visible;mso-wrap-style:square;mso-wrap-distance-left:9pt;mso-wrap-distance-top:0;mso-wrap-distance-right:9pt;mso-wrap-distance-bottom:0;mso-position-horizontal:absolute;mso-position-horizontal-relative:text;mso-position-vertical:absolute;mso-position-vertical-relative:text;v-text-anchor:middle" coordsize="6017749,829967" o:gfxdata="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" path="m5745705,v143865,170078,287731,340157,270662,468173c5999298,596189,5821295,708355,5643292,768096v-178003,59741,-49987,49988,-694944,58522c4303391,835153,2535551,825399,1773551,819303,1011551,813207,657983,825399,376348,790042,94713,754685,144700,715671,83740,607162,22780,498653,-21111,238963,10588,138989,42287,39015,158111,23165,273935,7315e" filled="f" strokecolor="#030e13 [484]">
+              <v:roundrect w14:anchorId="39DC5772" id="Rectangle: Rounded Corners 1" o:spid="_x0000_s1026" style="position:absolute;left:0;text-align:left;margin-left:281.25pt;margin-top:20.45pt;width:43.2pt;height:43.2pt;z-index:251671552;visibility:visible;mso-wrap-style:square;mso-width-percent:0;mso-height-percent:0;mso-wrap-distance-left:9pt;mso-wrap-distance-top:0;mso-wrap-distance-right:9pt;mso-wrap-distance-bottom:0;mso-position-horizontal:absolute;mso-position-horizontal-relative:text;mso-position-vertical:absolute;mso-position-vertical-relative:text;mso-width-percent:0;mso-height-percent:0;mso-width-relative:margin;mso-height-relative:margin;v-text-anchor:middle" arcsize="10923f" o:gfxdata="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" fillcolor="#4ea72e [3209]" strokecolor="#0b1807 [489]" strokeweight="1pt">
+                <v:stroke joinstyle="miter"/>
+                <v:textbox inset="0,0,0,0">
+                  <w:txbxContent>
+                    <w:p>
+                      <w:pPr>
+                        <w:spacing w:after="0"/>
+                        <w:jc w:val="center"/>
+                        <w:rPr>
+                          <w:b/>
+                          <w:bCs/>
+                          <w:color w:val="000000" w:themeColor="text1"/>
+                          <w14:textOutline w14:w="9525" w14:cap="rnd" w14:cmpd="sng" w14:algn="ctr">
+                            <w14:noFill/>
+                            <w14:prstDash w14:val="solid"/>
+                            <w14:bevel/>
+                          </w14:textOutline>
+                        </w:rPr>
+                      </w:pPr>
+                      <w:r>
+                        <w:rPr>
+                          <w:b/>
+                          <w:bCs/>
+                          <w:color w:val="000000" w:themeColor="text1"/>
+                          <w14:textOutline w14:w="9525" w14:cap="rnd" w14:cmpd="sng" w14:algn="ctr">
+                            <w14:noFill/>
+                            <w14:prstDash w14:val="solid"/>
+                            <w14:bevel/>
+                          </w14:textOutline>
+                        </w:rPr>
+                        <w:t>C</w:t>
+                      </w:r>
+                    </w:p>
+                    <w:p>
+                      <w:pPr>
+                        <w:spacing w:after="0"/>
+                        <w:jc w:val="center"/>
+                        <w:rPr>
+                          <w:color w:val="000000" w:themeColor="text1"/>
+                          <w:sz w:val="14"/>
+                          <w:szCs w:val="14"/>
+                          <w14:textOutline w14:w="9525" w14:cap="rnd" w14:cmpd="sng" w14:algn="ctr">
+                            <w14:noFill/>
+                            <w14:prstDash w14:val="solid"/>
+                            <w14:bevel/>
+                          </w14:textOutline>
+                        </w:rPr>
+                      </w:pPr>
+                      <w:r>
+                        <w:rPr>
+                          <w:color w:val="000000" w:themeColor="text1"/>
+                          <w:sz w:val="14"/>
+                          <w:szCs w:val="14"/>
+                          <w14:textOutline w14:w="9525" w14:cap="rnd" w14:cmpd="sng" w14:algn="ctr">
+                            <w14:noFill/>
+                            <w14:prstDash w14:val="solid"/>
+                            <w14:bevel/>
+                          </w14:textOutline>
+                        </w:rPr>
+                        <w:t xml:space="preserve">Actualize </w:t>
+                      </w:r>
+                      <w:r>
+                        <w:rPr>
+                          <w:color w:val="000000" w:themeColor="text1"/>
+                          <w:sz w:val="14"/>
+                          <w:szCs w:val="14"/>
+                          <w14:textOutline w14:w="9525" w14:cap="rnd" w14:cmpd="sng" w14:algn="ctr">
+                            <w14:noFill/>
+                            <w14:prstDash w14:val="solid"/>
+                            <w14:bevel/>
+                          </w14:textOutline>
+                        </w:rPr>
+                        <w:t>Exit (</w:t>
+                      </w:r>
+                      <w:r>
+                        <w:rPr>
+                          <w:color w:val="000000" w:themeColor="text1"/>
+                          <w:sz w:val="14"/>
+                          <w:szCs w:val="14"/>
+                          <w14:textOutline w14:w="9525" w14:cap="rnd" w14:cmpd="sng" w14:algn="ctr">
+                            <w14:noFill/>
+                            <w14:prstDash w14:val="solid"/>
+                            <w14:bevel/>
+                          </w14:textOutline>
+                        </w:rPr>
+                        <w:t>Open</w:t>
+                      </w:r>
+                      <w:r>
+                        <w:rPr>
+                          <w:color w:val="000000" w:themeColor="text1"/>
+                          <w:sz w:val="14"/>
+                          <w:szCs w:val="14"/>
+                          <w14:textOutline w14:w="9525" w14:cap="rnd" w14:cmpd="sng" w14:algn="ctr">
+                            <w14:noFill/>
+                            <w14:prstDash w14:val="solid"/>
+                            <w14:bevel/>
+                          </w14:textOutline>
+                        </w:rPr>
+                        <w:t>)</w:t>
+                      </w:r>
+                    </w:p>
+                  </w:txbxContent>
+                </v:textbox>
+              </v:roundrect>
+            </w:pict>
+          </mc:Fallback>
+        </mc:AlternateContent>
+      </w:r>
+      <w:r>
+        <w:rPr>
+          <w:noProof/>
+        </w:rPr>
+        <mc:AlternateContent>
+          <mc:Choice Requires="wps">
+            <w:drawing>
+              <wp:anchor distT="0" distB="0" distL="114300" distR="114300" simplePos="0" relativeHeight="251687936" behindDoc="0" locked="0" layoutInCell="1" allowOverlap="1" wp14:anchorId="19243F2D" wp14:editId="0621541F">
+                <wp:simplePos x="0" y="0"/>
+                <wp:positionH relativeFrom="column">
+                  <wp:posOffset>3279775</wp:posOffset>
+                </wp:positionH>
+                <wp:positionV relativeFrom="paragraph">
+                  <wp:posOffset>537845</wp:posOffset>
+                </wp:positionV>
+                <wp:extent cx="274320" cy="0"/>
+                <wp:effectExtent l="0" t="76200" r="11430" b="95250"/>
+                <wp:wrapNone/>
+                <wp:docPr id="846869872" name="Straight Arrow Connector 2"/>
+                <wp:cNvGraphicFramePr/>
+                <a:graphic xmlns:a="http://schemas.openxmlformats.org/drawingml/2006/main">
+                  <a:graphicData uri="http://schemas.microsoft.com/office/word/2010/wordprocessingShape">
+                    <wps:wsp>
+                      <wps:cNvCnPr/>
+                      <wps:spPr>
+                        <a:xfrm>
+                          <a:off x="0" y="0"/>
+                          <a:ext cx="274320" cy="0"/>
+                        </a:xfrm>
+                        <a:prstGeom prst="straightConnector1">
+                          <a:avLst/>
+                        </a:prstGeom>
+                        <a:ln>
+                          <a:solidFill>
+                            <a:schemeClr val="tx1"/>
+                          </a:solidFill>
+                          <a:tailEnd type="triangle"/>
+                        </a:ln>
+                      </wps:spPr>
+                      <wps:style>
+                        <a:lnRef idx="1">
+                          <a:schemeClr val="accent1"/>
+                        </a:lnRef>
+                        <a:fillRef idx="0">
+                          <a:schemeClr val="accent1"/>
+                        </a:fillRef>
+                        <a:effectRef idx="0">
+                          <a:schemeClr val="accent1"/>
+                        </a:effectRef>
+                        <a:fontRef idx="minor">
+                          <a:schemeClr val="tx1"/>
+                        </a:fontRef>
+                      </wps:style>
+                      <wps:bodyPr/>
+                    </wps:wsp>
+                  </a:graphicData>
+                </a:graphic>
+                <wp14:sizeRelH relativeFrom="margin">
+                  <wp14:pctWidth>0</wp14:pctWidth>
+                </wp14:sizeRelH>
+                <wp14:sizeRelV relativeFrom="margin">
+                  <wp14:pctHeight>0</wp14:pctHeight>
+                </wp14:sizeRelV>
+              </wp:anchor>
+            </w:drawing>
+          </mc:Choice>
+          <mc:Fallback>
+            <w:pict>
+              <v:shapetype w14:anchorId="651C060B" id="_x0000_t32" coordsize="21600,21600" o:spt="32" o:oned="t" path="m,l21600,21600e" filled="f">
+                <v:path arrowok="t" fillok="f" o:connecttype="none"/>
+                <o:lock v:ext="edit" shapetype="t"/>
+              </v:shapetype>
+              <v:shape id="Straight Arrow Connector 2" o:spid="_x0000_s1026" type="#_x0000_t32" style="position:absolute;margin-left:258.25pt;margin-top:42.35pt;width:21.6pt;height:0;z-index:251687936;visibility:visible;mso-wrap-style:square;mso-width-percent:0;mso-height-percent:0;mso-wrap-distance-left:9pt;mso-wrap-distance-top:0;mso-wrap-distance-right:9pt;mso-wrap-distance-bottom:0;mso-position-horizontal:absolute;mso-position-horizontal-relative:text;mso-position-vertical:absolute;mso-position-vertical-relative:text;mso-width-percent:0;mso-height-percent:0;mso-width-relative:margin;mso-height-relative:margin" o:gfxdata="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" strokecolor="black [3213]" strokeweight=".5pt">
                 <v:stroke endarrow="block" joinstyle="miter"/>
-                <v:path arrowok="t" o:connecttype="custom" o:connectlocs="5745705,0;6016367,468173;5643292,768096;4948348,826618;1773551,819303;376348,790042;83740,607162;10588,138989;273935,7315" o:connectangles="0,0,0,0,0,0,0,0,0"/>
               </v:shape>
             </w:pict>
           </mc:Fallback>
@@ -1431,17 +1688,1445 @@
           <w:noProof/>
         </w:rPr>
         <mc:AlternateContent>
+          <mc:Choice Requires="wpg">
+            <w:drawing>
+              <wp:anchor distT="0" distB="0" distL="114300" distR="114300" simplePos="0" relativeHeight="251701248" behindDoc="0" locked="0" layoutInCell="1" allowOverlap="1" wp14:anchorId="4A8FF138" wp14:editId="11ABC7EC">
+                <wp:simplePos x="0" y="0"/>
+                <wp:positionH relativeFrom="column">
+                  <wp:posOffset>3042920</wp:posOffset>
+                </wp:positionH>
+                <wp:positionV relativeFrom="paragraph">
+                  <wp:posOffset>79375</wp:posOffset>
+                </wp:positionV>
+                <wp:extent cx="314325" cy="914400"/>
+                <wp:effectExtent l="0" t="0" r="9525" b="19050"/>
+                <wp:wrapNone/>
+                <wp:docPr id="1700941268" name="Group 21"/>
+                <wp:cNvGraphicFramePr/>
+                <a:graphic xmlns:a="http://schemas.openxmlformats.org/drawingml/2006/main">
+                  <a:graphicData uri="http://schemas.microsoft.com/office/word/2010/wordprocessingGroup">
+                    <wpg:wgp>
+                      <wpg:cNvGrpSpPr/>
+                      <wpg:grpSpPr>
+                        <a:xfrm>
+                          <a:off x="0" y="0"/>
+                          <a:ext cx="314325" cy="914400"/>
+                          <a:chOff x="0" y="0"/>
+                          <a:chExt cx="314325" cy="914400"/>
+                        </a:xfrm>
+                      </wpg:grpSpPr>
+                      <wps:wsp>
+                        <wps:cNvPr id="1913799266" name="Text Box 9"/>
+                        <wps:cNvSpPr txBox="1"/>
+                        <wps:spPr>
+                          <a:xfrm>
+                            <a:off x="0" y="14630"/>
+                            <a:ext cx="314325" cy="123825"/>
+                          </a:xfrm>
+                          <a:prstGeom prst="rect">
+                            <a:avLst/>
+                          </a:prstGeom>
+                          <a:noFill/>
+                          <a:ln w="6350">
+                            <a:noFill/>
+                          </a:ln>
+                        </wps:spPr>
+                        <wps:txbx>
+                          <w:txbxContent>
+                            <w:p>
+                              <w:pPr>
+                                <w:rPr>
+                                  <w:color w:val="215E99" w:themeColor="text2" w:themeTint="BF"/>
+                                  <w:sz w:val="14"/>
+                                  <w:szCs w:val="14"/>
+                                </w:rPr>
+                              </w:pPr>
+                              <w:r>
+                                <w:rPr>
+                                  <w:color w:val="215E99" w:themeColor="text2" w:themeTint="BF"/>
+                                  <w:sz w:val="14"/>
+                                  <w:szCs w:val="14"/>
+                                </w:rPr>
+                                <w:t>Exit</w:t>
+                              </w:r>
+                            </w:p>
+                          </w:txbxContent>
+                        </wps:txbx>
+                        <wps:bodyPr rot="0" spcFirstLastPara="0" vertOverflow="overflow" horzOverflow="overflow" vert="horz" wrap="square" lIns="0" tIns="0" rIns="0" bIns="0" numCol="1" spcCol="0" rtlCol="0" fromWordArt="0" anchor="t" anchorCtr="0" forceAA="0" compatLnSpc="1">
+                          <a:prstTxWarp prst="textNoShape">
+                            <a:avLst/>
+                          </a:prstTxWarp>
+                          <a:noAutofit/>
+                        </wps:bodyPr>
+                      </wps:wsp>
+                      <wps:wsp>
+                        <wps:cNvPr id="528175533" name="Straight Connector 8"/>
+                        <wps:cNvCnPr/>
+                        <wps:spPr>
+                          <a:xfrm>
+                            <a:off x="197510" y="0"/>
+                            <a:ext cx="0" cy="914400"/>
+                          </a:xfrm>
+                          <a:prstGeom prst="line">
+                            <a:avLst/>
+                          </a:prstGeom>
+                          <a:ln>
+                            <a:solidFill>
+                              <a:schemeClr val="tx2">
+                                <a:lumMod val="75000"/>
+                                <a:lumOff val="25000"/>
+                              </a:schemeClr>
+                            </a:solidFill>
+                            <a:prstDash val="dash"/>
+                          </a:ln>
+                        </wps:spPr>
+                        <wps:style>
+                          <a:lnRef idx="1">
+                            <a:schemeClr val="accent1"/>
+                          </a:lnRef>
+                          <a:fillRef idx="0">
+                            <a:schemeClr val="accent1"/>
+                          </a:fillRef>
+                          <a:effectRef idx="0">
+                            <a:schemeClr val="accent1"/>
+                          </a:effectRef>
+                          <a:fontRef idx="minor">
+                            <a:schemeClr val="tx1"/>
+                          </a:fontRef>
+                        </wps:style>
+                        <wps:bodyPr/>
+                      </wps:wsp>
+                    </wpg:wgp>
+                  </a:graphicData>
+                </a:graphic>
+              </wp:anchor>
+            </w:drawing>
+          </mc:Choice>
+          <mc:Fallback>
+            <w:pict>
+              <v:group w14:anchorId="4A8FF138" id="Group 21" o:spid="_x0000_s1027" style="position:absolute;left:0;text-align:left;margin-left:239.6pt;margin-top:6.25pt;width:24.75pt;height:1in;z-index:251701248" coordsize="3143,9144" o:gfxdata="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">
+                <v:shapetype id="_x0000_t202" coordsize="21600,21600" o:spt="202" path="m,l,21600r21600,l21600,xe">
+                  <v:stroke joinstyle="miter"/>
+                  <v:path gradientshapeok="t" o:connecttype="rect"/>
+                </v:shapetype>
+                <v:shape id="_x0000_s1028" type="#_x0000_t202" style="position:absolute;top:146;width:3143;height:1238;visibility:visible;mso-wrap-style:square;v-text-anchor:top" o:gfxdata="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" filled="f" stroked="f" strokeweight=".5pt">
+                  <v:textbox inset="0,0,0,0">
+                    <w:txbxContent>
+                      <w:p>
+                        <w:pPr>
+                          <w:rPr>
+                            <w:color w:val="215E99" w:themeColor="text2" w:themeTint="BF"/>
+                            <w:sz w:val="14"/>
+                            <w:szCs w:val="14"/>
+                          </w:rPr>
+                        </w:pPr>
+                        <w:r>
+                          <w:rPr>
+                            <w:color w:val="215E99" w:themeColor="text2" w:themeTint="BF"/>
+                            <w:sz w:val="14"/>
+                            <w:szCs w:val="14"/>
+                          </w:rPr>
+                          <w:t>Exit</w:t>
+                        </w:r>
+                      </w:p>
+                    </w:txbxContent>
+                  </v:textbox>
+                </v:shape>
+                <v:line id="Straight Connector 8" o:spid="_x0000_s1029" style="position:absolute;visibility:visible;mso-wrap-style:square" from="1975,0" to="1975,9144" o:connectortype="straight" o:gfxdata="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" strokecolor="#215e99 [2431]" strokeweight=".5pt">
+                  <v:stroke dashstyle="dash" joinstyle="miter"/>
+                </v:line>
+              </v:group>
+            </w:pict>
+          </mc:Fallback>
+        </mc:AlternateContent>
+      </w:r>
+      <w:r>
+        <w:rPr>
+          <w:noProof/>
+        </w:rPr>
+        <mc:AlternateContent>
           <mc:Choice Requires="wps">
             <w:drawing>
-              <wp:anchor distT="0" distB="0" distL="114300" distR="114300" simplePos="0" relativeHeight="251675648" behindDoc="0" locked="0" layoutInCell="1" allowOverlap="1" wp14:anchorId="5D44742A" wp14:editId="397825D5">
+              <wp:anchor distT="0" distB="0" distL="114300" distR="114300" simplePos="0" relativeHeight="251694080" behindDoc="0" locked="0" layoutInCell="1" allowOverlap="1" wp14:anchorId="41530CCC" wp14:editId="185F0E14">
                 <wp:simplePos x="0" y="0"/>
                 <wp:positionH relativeFrom="column">
-                  <wp:posOffset>4546397</wp:posOffset>
+                  <wp:posOffset>2652395</wp:posOffset>
                 </wp:positionH>
                 <wp:positionV relativeFrom="paragraph">
-                  <wp:posOffset>1368095</wp:posOffset>
+                  <wp:posOffset>259715</wp:posOffset>
                 </wp:positionV>
-                <wp:extent cx="1704441" cy="548640"/>
+                <wp:extent cx="548640" cy="548640"/>
+                <wp:effectExtent l="0" t="0" r="22860" b="22860"/>
+                <wp:wrapNone/>
+                <wp:docPr id="281996261" name="Rectangle: Rounded Corners 1"/>
+                <wp:cNvGraphicFramePr/>
+                <a:graphic xmlns:a="http://schemas.openxmlformats.org/drawingml/2006/main">
+                  <a:graphicData uri="http://schemas.microsoft.com/office/word/2010/wordprocessingShape">
+                    <wps:wsp>
+                      <wps:cNvSpPr/>
+                      <wps:spPr>
+                        <a:xfrm>
+                          <a:off x="0" y="0"/>
+                          <a:ext cx="548640" cy="548640"/>
+                        </a:xfrm>
+                        <a:prstGeom prst="roundRect">
+                          <a:avLst/>
+                        </a:prstGeom>
+                      </wps:spPr>
+                      <wps:style>
+                        <a:lnRef idx="2">
+                          <a:schemeClr val="accent6">
+                            <a:shade val="15000"/>
+                          </a:schemeClr>
+                        </a:lnRef>
+                        <a:fillRef idx="1">
+                          <a:schemeClr val="accent6"/>
+                        </a:fillRef>
+                        <a:effectRef idx="0">
+                          <a:schemeClr val="accent6"/>
+                        </a:effectRef>
+                        <a:fontRef idx="minor">
+                          <a:schemeClr val="lt1"/>
+                        </a:fontRef>
+                      </wps:style>
+                      <wps:txbx>
+                        <w:txbxContent>
+                          <w:p>
+                            <w:pPr>
+                              <w:spacing w:after="0"/>
+                              <w:jc w:val="center"/>
+                              <w:rPr>
+                                <w:b/>
+                                <w:bCs/>
+                                <w:color w:val="000000" w:themeColor="text1"/>
+                                <w14:textOutline w14:w="9525" w14:cap="rnd" w14:cmpd="sng" w14:algn="ctr">
+                                  <w14:noFill/>
+                                  <w14:prstDash w14:val="solid"/>
+                                  <w14:bevel/>
+                                </w14:textOutline>
+                              </w:rPr>
+                            </w:pPr>
+                            <w:r>
+                              <w:rPr>
+                                <w:b/>
+                                <w:bCs/>
+                                <w:color w:val="000000" w:themeColor="text1"/>
+                                <w14:textOutline w14:w="9525" w14:cap="rnd" w14:cmpd="sng" w14:algn="ctr">
+                                  <w14:noFill/>
+                                  <w14:prstDash w14:val="solid"/>
+                                  <w14:bevel/>
+                                </w14:textOutline>
+                              </w:rPr>
+                              <w:t>B</w:t>
+                            </w:r>
+                          </w:p>
+                          <w:p>
+                            <w:pPr>
+                              <w:spacing w:after="0"/>
+                              <w:jc w:val="center"/>
+                              <w:rPr>
+                                <w:color w:val="000000" w:themeColor="text1"/>
+                                <w:sz w:val="14"/>
+                                <w:szCs w:val="14"/>
+                                <w14:textOutline w14:w="9525" w14:cap="rnd" w14:cmpd="sng" w14:algn="ctr">
+                                  <w14:noFill/>
+                                  <w14:prstDash w14:val="solid"/>
+                                  <w14:bevel/>
+                                </w14:textOutline>
+                              </w:rPr>
+                            </w:pPr>
+                            <w:r>
+                              <w:rPr>
+                                <w:color w:val="000000" w:themeColor="text1"/>
+                                <w:sz w:val="14"/>
+                                <w:szCs w:val="14"/>
+                                <w14:textOutline w14:w="9525" w14:cap="rnd" w14:cmpd="sng" w14:algn="ctr">
+                                  <w14:noFill/>
+                                  <w14:prstDash w14:val="solid"/>
+                                  <w14:bevel/>
+                                </w14:textOutline>
+                              </w:rPr>
+                              <w:t>Send</w:t>
+                            </w:r>
+                            <w:r>
+                              <w:rPr>
+                                <w:color w:val="000000" w:themeColor="text1"/>
+                                <w:sz w:val="14"/>
+                                <w:szCs w:val="14"/>
+                                <w14:textOutline w14:w="9525" w14:cap="rnd" w14:cmpd="sng" w14:algn="ctr">
+                                  <w14:noFill/>
+                                  <w14:prstDash w14:val="solid"/>
+                                  <w14:bevel/>
+                                </w14:textOutline>
+                              </w:rPr>
+                              <w:t xml:space="preserve"> Exit Orders</w:t>
+                            </w:r>
+                            <w:r>
+                              <w:rPr>
+                                <w:color w:val="000000" w:themeColor="text1"/>
+                                <w:sz w:val="14"/>
+                                <w:szCs w:val="14"/>
+                                <w14:textOutline w14:w="9525" w14:cap="rnd" w14:cmpd="sng" w14:algn="ctr">
+                                  <w14:noFill/>
+                                  <w14:prstDash w14:val="solid"/>
+                                  <w14:bevel/>
+                                </w14:textOutline>
+                              </w:rPr>
+                              <w:t xml:space="preserve"> (AM)</w:t>
+                            </w:r>
+                          </w:p>
+                        </w:txbxContent>
+                      </wps:txbx>
+                      <wps:bodyPr rot="0" spcFirstLastPara="0" vertOverflow="overflow" horzOverflow="overflow" vert="horz" wrap="square" lIns="0" tIns="0" rIns="0" bIns="0" numCol="1" spcCol="0" rtlCol="0" fromWordArt="0" anchor="ctr" anchorCtr="0" forceAA="0" compatLnSpc="1">
+                        <a:prstTxWarp prst="textNoShape">
+                          <a:avLst/>
+                        </a:prstTxWarp>
+                        <a:noAutofit/>
+                      </wps:bodyPr>
+                    </wps:wsp>
+                  </a:graphicData>
+                </a:graphic>
+                <wp14:sizeRelH relativeFrom="margin">
+                  <wp14:pctWidth>0</wp14:pctWidth>
+                </wp14:sizeRelH>
+                <wp14:sizeRelV relativeFrom="margin">
+                  <wp14:pctHeight>0</wp14:pctHeight>
+                </wp14:sizeRelV>
+              </wp:anchor>
+            </w:drawing>
+          </mc:Choice>
+          <mc:Fallback>
+            <w:pict>
+              <v:roundrect w14:anchorId="41530CCC" id="_x0000_s1030" style="position:absolute;left:0;text-align:left;margin-left:208.85pt;margin-top:20.45pt;width:43.2pt;height:43.2pt;z-index:251694080;visibility:visible;mso-wrap-style:square;mso-width-percent:0;mso-height-percent:0;mso-wrap-distance-left:9pt;mso-wrap-distance-top:0;mso-wrap-distance-right:9pt;mso-wrap-distance-bottom:0;mso-position-horizontal:absolute;mso-position-horizontal-relative:text;mso-position-vertical:absolute;mso-position-vertical-relative:text;mso-width-percent:0;mso-height-percent:0;mso-width-relative:margin;mso-height-relative:margin;v-text-anchor:middle" arcsize="10923f" o:gfxdata="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" fillcolor="#4ea72e [3209]" strokecolor="#0b1807 [489]" strokeweight="1pt">
+                <v:stroke joinstyle="miter"/>
+                <v:textbox inset="0,0,0,0">
+                  <w:txbxContent>
+                    <w:p>
+                      <w:pPr>
+                        <w:spacing w:after="0"/>
+                        <w:jc w:val="center"/>
+                        <w:rPr>
+                          <w:b/>
+                          <w:bCs/>
+                          <w:color w:val="000000" w:themeColor="text1"/>
+                          <w14:textOutline w14:w="9525" w14:cap="rnd" w14:cmpd="sng" w14:algn="ctr">
+                            <w14:noFill/>
+                            <w14:prstDash w14:val="solid"/>
+                            <w14:bevel/>
+                          </w14:textOutline>
+                        </w:rPr>
+                      </w:pPr>
+                      <w:r>
+                        <w:rPr>
+                          <w:b/>
+                          <w:bCs/>
+                          <w:color w:val="000000" w:themeColor="text1"/>
+                          <w14:textOutline w14:w="9525" w14:cap="rnd" w14:cmpd="sng" w14:algn="ctr">
+                            <w14:noFill/>
+                            <w14:prstDash w14:val="solid"/>
+                            <w14:bevel/>
+                          </w14:textOutline>
+                        </w:rPr>
+                        <w:t>B</w:t>
+                      </w:r>
+                    </w:p>
+                    <w:p>
+                      <w:pPr>
+                        <w:spacing w:after="0"/>
+                        <w:jc w:val="center"/>
+                        <w:rPr>
+                          <w:color w:val="000000" w:themeColor="text1"/>
+                          <w:sz w:val="14"/>
+                          <w:szCs w:val="14"/>
+                          <w14:textOutline w14:w="9525" w14:cap="rnd" w14:cmpd="sng" w14:algn="ctr">
+                            <w14:noFill/>
+                            <w14:prstDash w14:val="solid"/>
+                            <w14:bevel/>
+                          </w14:textOutline>
+                        </w:rPr>
+                      </w:pPr>
+                      <w:r>
+                        <w:rPr>
+                          <w:color w:val="000000" w:themeColor="text1"/>
+                          <w:sz w:val="14"/>
+                          <w:szCs w:val="14"/>
+                          <w14:textOutline w14:w="9525" w14:cap="rnd" w14:cmpd="sng" w14:algn="ctr">
+                            <w14:noFill/>
+                            <w14:prstDash w14:val="solid"/>
+                            <w14:bevel/>
+                          </w14:textOutline>
+                        </w:rPr>
+                        <w:t>Send</w:t>
+                      </w:r>
+                      <w:r>
+                        <w:rPr>
+                          <w:color w:val="000000" w:themeColor="text1"/>
+                          <w:sz w:val="14"/>
+                          <w:szCs w:val="14"/>
+                          <w14:textOutline w14:w="9525" w14:cap="rnd" w14:cmpd="sng" w14:algn="ctr">
+                            <w14:noFill/>
+                            <w14:prstDash w14:val="solid"/>
+                            <w14:bevel/>
+                          </w14:textOutline>
+                        </w:rPr>
+                        <w:t xml:space="preserve"> Exit Orders</w:t>
+                      </w:r>
+                      <w:r>
+                        <w:rPr>
+                          <w:color w:val="000000" w:themeColor="text1"/>
+                          <w:sz w:val="14"/>
+                          <w:szCs w:val="14"/>
+                          <w14:textOutline w14:w="9525" w14:cap="rnd" w14:cmpd="sng" w14:algn="ctr">
+                            <w14:noFill/>
+                            <w14:prstDash w14:val="solid"/>
+                            <w14:bevel/>
+                          </w14:textOutline>
+                        </w:rPr>
+                        <w:t xml:space="preserve"> (AM)</w:t>
+                      </w:r>
+                    </w:p>
+                  </w:txbxContent>
+                </v:textbox>
+              </v:roundrect>
+            </w:pict>
+          </mc:Fallback>
+        </mc:AlternateContent>
+      </w:r>
+      <w:r>
+        <w:rPr>
+          <w:noProof/>
+        </w:rPr>
+        <mc:AlternateContent>
+          <mc:Choice Requires="wps">
+            <w:drawing>
+              <wp:anchor distT="0" distB="0" distL="114300" distR="114300" simplePos="0" relativeHeight="251677696" behindDoc="0" locked="0" layoutInCell="1" allowOverlap="1" wp14:anchorId="57F13C5B" wp14:editId="398E04E8">
+                <wp:simplePos x="0" y="0"/>
+                <wp:positionH relativeFrom="column">
+                  <wp:posOffset>800100</wp:posOffset>
+                </wp:positionH>
+                <wp:positionV relativeFrom="paragraph">
+                  <wp:posOffset>260350</wp:posOffset>
+                </wp:positionV>
+                <wp:extent cx="548640" cy="548640"/>
+                <wp:effectExtent l="0" t="0" r="22860" b="22860"/>
+                <wp:wrapNone/>
+                <wp:docPr id="336500431" name="Rectangle: Rounded Corners 1"/>
+                <wp:cNvGraphicFramePr/>
+                <a:graphic xmlns:a="http://schemas.openxmlformats.org/drawingml/2006/main">
+                  <a:graphicData uri="http://schemas.microsoft.com/office/word/2010/wordprocessingShape">
+                    <wps:wsp>
+                      <wps:cNvSpPr/>
+                      <wps:spPr>
+                        <a:xfrm>
+                          <a:off x="0" y="0"/>
+                          <a:ext cx="548640" cy="548640"/>
+                        </a:xfrm>
+                        <a:prstGeom prst="roundRect">
+                          <a:avLst/>
+                        </a:prstGeom>
+                      </wps:spPr>
+                      <wps:style>
+                        <a:lnRef idx="2">
+                          <a:schemeClr val="accent6">
+                            <a:shade val="15000"/>
+                          </a:schemeClr>
+                        </a:lnRef>
+                        <a:fillRef idx="1">
+                          <a:schemeClr val="accent6"/>
+                        </a:fillRef>
+                        <a:effectRef idx="0">
+                          <a:schemeClr val="accent6"/>
+                        </a:effectRef>
+                        <a:fontRef idx="minor">
+                          <a:schemeClr val="lt1"/>
+                        </a:fontRef>
+                      </wps:style>
+                      <wps:txbx>
+                        <w:txbxContent>
+                          <w:p>
+                            <w:pPr>
+                              <w:spacing w:after="0"/>
+                              <w:jc w:val="center"/>
+                              <w:rPr>
+                                <w:b/>
+                                <w:bCs/>
+                                <w:color w:val="000000" w:themeColor="text1"/>
+                                <w14:textOutline w14:w="9525" w14:cap="rnd" w14:cmpd="sng" w14:algn="ctr">
+                                  <w14:noFill/>
+                                  <w14:prstDash w14:val="solid"/>
+                                  <w14:bevel/>
+                                </w14:textOutline>
+                              </w:rPr>
+                            </w:pPr>
+                            <w:r>
+                              <w:rPr>
+                                <w:b/>
+                                <w:bCs/>
+                                <w:color w:val="000000" w:themeColor="text1"/>
+                                <w14:textOutline w14:w="9525" w14:cap="rnd" w14:cmpd="sng" w14:algn="ctr">
+                                  <w14:noFill/>
+                                  <w14:prstDash w14:val="solid"/>
+                                  <w14:bevel/>
+                                </w14:textOutline>
+                              </w:rPr>
+                              <w:t>E</w:t>
+                            </w:r>
+                          </w:p>
+                          <w:p>
+                            <w:pPr>
+                              <w:spacing w:after="0"/>
+                              <w:jc w:val="center"/>
+                              <w:rPr>
+                                <w:color w:val="000000" w:themeColor="text1"/>
+                                <w:sz w:val="14"/>
+                                <w:szCs w:val="14"/>
+                                <w14:textOutline w14:w="9525" w14:cap="rnd" w14:cmpd="sng" w14:algn="ctr">
+                                  <w14:noFill/>
+                                  <w14:prstDash w14:val="solid"/>
+                                  <w14:bevel/>
+                                </w14:textOutline>
+                              </w:rPr>
+                            </w:pPr>
+                            <w:r>
+                              <w:rPr>
+                                <w:color w:val="000000" w:themeColor="text1"/>
+                                <w:sz w:val="14"/>
+                                <w:szCs w:val="14"/>
+                                <w14:textOutline w14:w="9525" w14:cap="rnd" w14:cmpd="sng" w14:algn="ctr">
+                                  <w14:noFill/>
+                                  <w14:prstDash w14:val="solid"/>
+                                  <w14:bevel/>
+                                </w14:textOutline>
+                              </w:rPr>
+                              <w:t>S</w:t>
+                            </w:r>
+                            <w:r>
+                              <w:rPr>
+                                <w:color w:val="000000" w:themeColor="text1"/>
+                                <w:sz w:val="14"/>
+                                <w:szCs w:val="14"/>
+                                <w14:textOutline w14:w="9525" w14:cap="rnd" w14:cmpd="sng" w14:algn="ctr">
+                                  <w14:noFill/>
+                                  <w14:prstDash w14:val="solid"/>
+                                  <w14:bevel/>
+                                </w14:textOutline>
+                              </w:rPr>
+                              <w:t>tage</w:t>
+                            </w:r>
+                            <w:r>
+                              <w:rPr>
+                                <w:color w:val="000000" w:themeColor="text1"/>
+                                <w:sz w:val="14"/>
+                                <w:szCs w:val="14"/>
+                                <w14:textOutline w14:w="9525" w14:cap="rnd" w14:cmpd="sng" w14:algn="ctr">
+                                  <w14:noFill/>
+                                  <w14:prstDash w14:val="solid"/>
+                                  <w14:bevel/>
+                                </w14:textOutline>
+                              </w:rPr>
+                              <w:t xml:space="preserve"> Next</w:t>
+                            </w:r>
+                          </w:p>
+                          <w:p>
+                            <w:pPr>
+                              <w:spacing w:after="0"/>
+                              <w:jc w:val="center"/>
+                              <w:rPr>
+                                <w:color w:val="000000" w:themeColor="text1"/>
+                                <w:sz w:val="14"/>
+                                <w:szCs w:val="14"/>
+                                <w14:textOutline w14:w="9525" w14:cap="rnd" w14:cmpd="sng" w14:algn="ctr">
+                                  <w14:noFill/>
+                                  <w14:prstDash w14:val="solid"/>
+                                  <w14:bevel/>
+                                </w14:textOutline>
+                              </w:rPr>
+                            </w:pPr>
+                            <w:r>
+                              <w:rPr>
+                                <w:color w:val="000000" w:themeColor="text1"/>
+                                <w:sz w:val="14"/>
+                                <w:szCs w:val="14"/>
+                                <w14:textOutline w14:w="9525" w14:cap="rnd" w14:cmpd="sng" w14:algn="ctr">
+                                  <w14:noFill/>
+                                  <w14:prstDash w14:val="solid"/>
+                                  <w14:bevel/>
+                                </w14:textOutline>
+                              </w:rPr>
+                              <w:t>trades</w:t>
+                            </w:r>
+                          </w:p>
+                        </w:txbxContent>
+                      </wps:txbx>
+                      <wps:bodyPr rot="0" spcFirstLastPara="0" vertOverflow="overflow" horzOverflow="overflow" vert="horz" wrap="square" lIns="0" tIns="0" rIns="0" bIns="0" numCol="1" spcCol="0" rtlCol="0" fromWordArt="0" anchor="ctr" anchorCtr="0" forceAA="0" compatLnSpc="1">
+                        <a:prstTxWarp prst="textNoShape">
+                          <a:avLst/>
+                        </a:prstTxWarp>
+                        <a:noAutofit/>
+                      </wps:bodyPr>
+                    </wps:wsp>
+                  </a:graphicData>
+                </a:graphic>
+                <wp14:sizeRelH relativeFrom="margin">
+                  <wp14:pctWidth>0</wp14:pctWidth>
+                </wp14:sizeRelH>
+                <wp14:sizeRelV relativeFrom="margin">
+                  <wp14:pctHeight>0</wp14:pctHeight>
+                </wp14:sizeRelV>
+              </wp:anchor>
+            </w:drawing>
+          </mc:Choice>
+          <mc:Fallback>
+            <w:pict>
+              <v:roundrect w14:anchorId="57F13C5B" id="_x0000_s1031" style="position:absolute;left:0;text-align:left;margin-left:63pt;margin-top:20.5pt;width:43.2pt;height:43.2pt;z-index:251677696;visibility:visible;mso-wrap-style:square;mso-width-percent:0;mso-height-percent:0;mso-wrap-distance-left:9pt;mso-wrap-distance-top:0;mso-wrap-distance-right:9pt;mso-wrap-distance-bottom:0;mso-position-horizontal:absolute;mso-position-horizontal-relative:text;mso-position-vertical:absolute;mso-position-vertical-relative:text;mso-width-percent:0;mso-height-percent:0;mso-width-relative:margin;mso-height-relative:margin;v-text-anchor:middle" arcsize="10923f" o:gfxdata="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" fillcolor="#4ea72e [3209]" strokecolor="#0b1807 [489]" strokeweight="1pt">
+                <v:stroke joinstyle="miter"/>
+                <v:textbox inset="0,0,0,0">
+                  <w:txbxContent>
+                    <w:p>
+                      <w:pPr>
+                        <w:spacing w:after="0"/>
+                        <w:jc w:val="center"/>
+                        <w:rPr>
+                          <w:b/>
+                          <w:bCs/>
+                          <w:color w:val="000000" w:themeColor="text1"/>
+                          <w14:textOutline w14:w="9525" w14:cap="rnd" w14:cmpd="sng" w14:algn="ctr">
+                            <w14:noFill/>
+                            <w14:prstDash w14:val="solid"/>
+                            <w14:bevel/>
+                          </w14:textOutline>
+                        </w:rPr>
+                      </w:pPr>
+                      <w:r>
+                        <w:rPr>
+                          <w:b/>
+                          <w:bCs/>
+                          <w:color w:val="000000" w:themeColor="text1"/>
+                          <w14:textOutline w14:w="9525" w14:cap="rnd" w14:cmpd="sng" w14:algn="ctr">
+                            <w14:noFill/>
+                            <w14:prstDash w14:val="solid"/>
+                            <w14:bevel/>
+                          </w14:textOutline>
+                        </w:rPr>
+                        <w:t>E</w:t>
+                      </w:r>
+                    </w:p>
+                    <w:p>
+                      <w:pPr>
+                        <w:spacing w:after="0"/>
+                        <w:jc w:val="center"/>
+                        <w:rPr>
+                          <w:color w:val="000000" w:themeColor="text1"/>
+                          <w:sz w:val="14"/>
+                          <w:szCs w:val="14"/>
+                          <w14:textOutline w14:w="9525" w14:cap="rnd" w14:cmpd="sng" w14:algn="ctr">
+                            <w14:noFill/>
+                            <w14:prstDash w14:val="solid"/>
+                            <w14:bevel/>
+                          </w14:textOutline>
+                        </w:rPr>
+                      </w:pPr>
+                      <w:r>
+                        <w:rPr>
+                          <w:color w:val="000000" w:themeColor="text1"/>
+                          <w:sz w:val="14"/>
+                          <w:szCs w:val="14"/>
+                          <w14:textOutline w14:w="9525" w14:cap="rnd" w14:cmpd="sng" w14:algn="ctr">
+                            <w14:noFill/>
+                            <w14:prstDash w14:val="solid"/>
+                            <w14:bevel/>
+                          </w14:textOutline>
+                        </w:rPr>
+                        <w:t>S</w:t>
+                      </w:r>
+                      <w:r>
+                        <w:rPr>
+                          <w:color w:val="000000" w:themeColor="text1"/>
+                          <w:sz w:val="14"/>
+                          <w:szCs w:val="14"/>
+                          <w14:textOutline w14:w="9525" w14:cap="rnd" w14:cmpd="sng" w14:algn="ctr">
+                            <w14:noFill/>
+                            <w14:prstDash w14:val="solid"/>
+                            <w14:bevel/>
+                          </w14:textOutline>
+                        </w:rPr>
+                        <w:t>tage</w:t>
+                      </w:r>
+                      <w:r>
+                        <w:rPr>
+                          <w:color w:val="000000" w:themeColor="text1"/>
+                          <w:sz w:val="14"/>
+                          <w:szCs w:val="14"/>
+                          <w14:textOutline w14:w="9525" w14:cap="rnd" w14:cmpd="sng" w14:algn="ctr">
+                            <w14:noFill/>
+                            <w14:prstDash w14:val="solid"/>
+                            <w14:bevel/>
+                          </w14:textOutline>
+                        </w:rPr>
+                        <w:t xml:space="preserve"> Next</w:t>
+                      </w:r>
+                    </w:p>
+                    <w:p>
+                      <w:pPr>
+                        <w:spacing w:after="0"/>
+                        <w:jc w:val="center"/>
+                        <w:rPr>
+                          <w:color w:val="000000" w:themeColor="text1"/>
+                          <w:sz w:val="14"/>
+                          <w:szCs w:val="14"/>
+                          <w14:textOutline w14:w="9525" w14:cap="rnd" w14:cmpd="sng" w14:algn="ctr">
+                            <w14:noFill/>
+                            <w14:prstDash w14:val="solid"/>
+                            <w14:bevel/>
+                          </w14:textOutline>
+                        </w:rPr>
+                      </w:pPr>
+                      <w:r>
+                        <w:rPr>
+                          <w:color w:val="000000" w:themeColor="text1"/>
+                          <w:sz w:val="14"/>
+                          <w:szCs w:val="14"/>
+                          <w14:textOutline w14:w="9525" w14:cap="rnd" w14:cmpd="sng" w14:algn="ctr">
+                            <w14:noFill/>
+                            <w14:prstDash w14:val="solid"/>
+                            <w14:bevel/>
+                          </w14:textOutline>
+                        </w:rPr>
+                        <w:t>trades</w:t>
+                      </w:r>
+                    </w:p>
+                  </w:txbxContent>
+                </v:textbox>
+              </v:roundrect>
+            </w:pict>
+          </mc:Fallback>
+        </mc:AlternateContent>
+      </w:r>
+      <w:r>
+        <w:rPr>
+          <w:noProof/>
+        </w:rPr>
+        <mc:AlternateContent>
+          <mc:Choice Requires="wps">
+            <w:drawing>
+              <wp:anchor distT="0" distB="0" distL="114300" distR="114300" simplePos="0" relativeHeight="251683840" behindDoc="0" locked="0" layoutInCell="1" allowOverlap="1" wp14:anchorId="1AFC1A49" wp14:editId="1EBFA79D">
+                <wp:simplePos x="0" y="0"/>
+                <wp:positionH relativeFrom="column">
+                  <wp:posOffset>1386840</wp:posOffset>
+                </wp:positionH>
+                <wp:positionV relativeFrom="paragraph">
+                  <wp:posOffset>534035</wp:posOffset>
+                </wp:positionV>
+                <wp:extent cx="274320" cy="0"/>
+                <wp:effectExtent l="0" t="76200" r="11430" b="95250"/>
+                <wp:wrapNone/>
+                <wp:docPr id="2099500788" name="Straight Arrow Connector 2"/>
+                <wp:cNvGraphicFramePr/>
+                <a:graphic xmlns:a="http://schemas.openxmlformats.org/drawingml/2006/main">
+                  <a:graphicData uri="http://schemas.microsoft.com/office/word/2010/wordprocessingShape">
+                    <wps:wsp>
+                      <wps:cNvCnPr/>
+                      <wps:spPr>
+                        <a:xfrm>
+                          <a:off x="0" y="0"/>
+                          <a:ext cx="274320" cy="0"/>
+                        </a:xfrm>
+                        <a:prstGeom prst="straightConnector1">
+                          <a:avLst/>
+                        </a:prstGeom>
+                        <a:ln>
+                          <a:solidFill>
+                            <a:schemeClr val="tx1"/>
+                          </a:solidFill>
+                          <a:tailEnd type="triangle"/>
+                        </a:ln>
+                      </wps:spPr>
+                      <wps:style>
+                        <a:lnRef idx="1">
+                          <a:schemeClr val="accent1"/>
+                        </a:lnRef>
+                        <a:fillRef idx="0">
+                          <a:schemeClr val="accent1"/>
+                        </a:fillRef>
+                        <a:effectRef idx="0">
+                          <a:schemeClr val="accent1"/>
+                        </a:effectRef>
+                        <a:fontRef idx="minor">
+                          <a:schemeClr val="tx1"/>
+                        </a:fontRef>
+                      </wps:style>
+                      <wps:bodyPr/>
+                    </wps:wsp>
+                  </a:graphicData>
+                </a:graphic>
+                <wp14:sizeRelH relativeFrom="margin">
+                  <wp14:pctWidth>0</wp14:pctWidth>
+                </wp14:sizeRelH>
+                <wp14:sizeRelV relativeFrom="margin">
+                  <wp14:pctHeight>0</wp14:pctHeight>
+                </wp14:sizeRelV>
+              </wp:anchor>
+            </w:drawing>
+          </mc:Choice>
+          <mc:Fallback>
+            <w:pict>
+              <v:shape w14:anchorId="53FD0892" id="Straight Arrow Connector 2" o:spid="_x0000_s1026" type="#_x0000_t32" style="position:absolute;margin-left:109.2pt;margin-top:42.05pt;width:21.6pt;height:0;z-index:251683840;visibility:visible;mso-wrap-style:square;mso-width-percent:0;mso-height-percent:0;mso-wrap-distance-left:9pt;mso-wrap-distance-top:0;mso-wrap-distance-right:9pt;mso-wrap-distance-bottom:0;mso-position-horizontal:absolute;mso-position-horizontal-relative:text;mso-position-vertical:absolute;mso-position-vertical-relative:text;mso-width-percent:0;mso-height-percent:0;mso-width-relative:margin;mso-height-relative:margin" o:gfxdata="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" strokecolor="black [3213]" strokeweight=".5pt">
+                <v:stroke endarrow="block" joinstyle="miter"/>
+              </v:shape>
+            </w:pict>
+          </mc:Fallback>
+        </mc:AlternateContent>
+      </w:r>
+      <w:r>
+        <w:rPr>
+          <w:noProof/>
+        </w:rPr>
+        <mc:AlternateContent>
+          <mc:Choice Requires="wps">
+            <w:drawing>
+              <wp:anchor distT="0" distB="0" distL="114300" distR="114300" simplePos="0" relativeHeight="251667456" behindDoc="0" locked="0" layoutInCell="1" allowOverlap="1" wp14:anchorId="5BB26D04" wp14:editId="2567EB6E">
+                <wp:simplePos x="0" y="0"/>
+                <wp:positionH relativeFrom="column">
+                  <wp:posOffset>1717675</wp:posOffset>
+                </wp:positionH>
+                <wp:positionV relativeFrom="paragraph">
+                  <wp:posOffset>257810</wp:posOffset>
+                </wp:positionV>
+                <wp:extent cx="548640" cy="548640"/>
+                <wp:effectExtent l="0" t="0" r="22860" b="22860"/>
+                <wp:wrapNone/>
+                <wp:docPr id="1717604901" name="Rectangle: Rounded Corners 1"/>
+                <wp:cNvGraphicFramePr/>
+                <a:graphic xmlns:a="http://schemas.openxmlformats.org/drawingml/2006/main">
+                  <a:graphicData uri="http://schemas.microsoft.com/office/word/2010/wordprocessingShape">
+                    <wps:wsp>
+                      <wps:cNvSpPr/>
+                      <wps:spPr>
+                        <a:xfrm>
+                          <a:off x="0" y="0"/>
+                          <a:ext cx="548640" cy="548640"/>
+                        </a:xfrm>
+                        <a:prstGeom prst="roundRect">
+                          <a:avLst/>
+                        </a:prstGeom>
+                      </wps:spPr>
+                      <wps:style>
+                        <a:lnRef idx="2">
+                          <a:schemeClr val="accent6">
+                            <a:shade val="15000"/>
+                          </a:schemeClr>
+                        </a:lnRef>
+                        <a:fillRef idx="1">
+                          <a:schemeClr val="accent6"/>
+                        </a:fillRef>
+                        <a:effectRef idx="0">
+                          <a:schemeClr val="accent6"/>
+                        </a:effectRef>
+                        <a:fontRef idx="minor">
+                          <a:schemeClr val="lt1"/>
+                        </a:fontRef>
+                      </wps:style>
+                      <wps:txbx>
+                        <w:txbxContent>
+                          <w:p>
+                            <w:pPr>
+                              <w:spacing w:after="0" w:line="240" w:lineRule="auto"/>
+                              <w:jc w:val="center"/>
+                              <w:rPr>
+                                <w:b/>
+                                <w:bCs/>
+                                <w:color w:val="000000" w:themeColor="text1"/>
+                                <w14:textOutline w14:w="9525" w14:cap="rnd" w14:cmpd="sng" w14:algn="ctr">
+                                  <w14:noFill/>
+                                  <w14:prstDash w14:val="solid"/>
+                                  <w14:bevel/>
+                                </w14:textOutline>
+                              </w:rPr>
+                            </w:pPr>
+                            <w:r>
+                              <w:rPr>
+                                <w:b/>
+                                <w:bCs/>
+                                <w:color w:val="000000" w:themeColor="text1"/>
+                                <w14:textOutline w14:w="9525" w14:cap="rnd" w14:cmpd="sng" w14:algn="ctr">
+                                  <w14:noFill/>
+                                  <w14:prstDash w14:val="solid"/>
+                                  <w14:bevel/>
+                                </w14:textOutline>
+                              </w:rPr>
+                              <w:t>A</w:t>
+                            </w:r>
+                          </w:p>
+                          <w:p>
+                            <w:pPr>
+                              <w:spacing w:after="0" w:line="240" w:lineRule="auto"/>
+                              <w:jc w:val="center"/>
+                              <w:rPr>
+                                <w:color w:val="000000" w:themeColor="text1"/>
+                                <w:sz w:val="14"/>
+                                <w:szCs w:val="14"/>
+                                <w14:textOutline w14:w="9525" w14:cap="rnd" w14:cmpd="sng" w14:algn="ctr">
+                                  <w14:noFill/>
+                                  <w14:prstDash w14:val="solid"/>
+                                  <w14:bevel/>
+                                </w14:textOutline>
+                              </w:rPr>
+                            </w:pPr>
+                            <w:r>
+                              <w:rPr>
+                                <w:color w:val="000000" w:themeColor="text1"/>
+                                <w:sz w:val="14"/>
+                                <w:szCs w:val="14"/>
+                                <w14:textOutline w14:w="9525" w14:cap="rnd" w14:cmpd="sng" w14:algn="ctr">
+                                  <w14:noFill/>
+                                  <w14:prstDash w14:val="solid"/>
+                                  <w14:bevel/>
+                                </w14:textOutline>
+                              </w:rPr>
+                              <w:t xml:space="preserve">Send </w:t>
+                            </w:r>
+                            <w:r>
+                              <w:rPr>
+                                <w:color w:val="000000" w:themeColor="text1"/>
+                                <w:sz w:val="14"/>
+                                <w:szCs w:val="14"/>
+                                <w14:textOutline w14:w="9525" w14:cap="rnd" w14:cmpd="sng" w14:algn="ctr">
+                                  <w14:noFill/>
+                                  <w14:prstDash w14:val="solid"/>
+                                  <w14:bevel/>
+                                </w14:textOutline>
+                              </w:rPr>
+                              <w:t>Entry</w:t>
+                            </w:r>
+                            <w:r>
+                              <w:rPr>
+                                <w:color w:val="000000" w:themeColor="text1"/>
+                                <w:sz w:val="14"/>
+                                <w:szCs w:val="14"/>
+                                <w14:textOutline w14:w="9525" w14:cap="rnd" w14:cmpd="sng" w14:algn="ctr">
+                                  <w14:noFill/>
+                                  <w14:prstDash w14:val="solid"/>
+                                  <w14:bevel/>
+                                </w14:textOutline>
+                              </w:rPr>
+                              <w:t xml:space="preserve"> </w:t>
+                            </w:r>
+                            <w:r>
+                              <w:rPr>
+                                <w:color w:val="000000" w:themeColor="text1"/>
+                                <w:sz w:val="14"/>
+                                <w:szCs w:val="14"/>
+                                <w14:textOutline w14:w="9525" w14:cap="rnd" w14:cmpd="sng" w14:algn="ctr">
+                                  <w14:noFill/>
+                                  <w14:prstDash w14:val="solid"/>
+                                  <w14:bevel/>
+                                </w14:textOutline>
+                              </w:rPr>
+                              <w:t>O</w:t>
+                            </w:r>
+                            <w:r>
+                              <w:rPr>
+                                <w:color w:val="000000" w:themeColor="text1"/>
+                                <w:sz w:val="14"/>
+                                <w:szCs w:val="14"/>
+                                <w14:textOutline w14:w="9525" w14:cap="rnd" w14:cmpd="sng" w14:algn="ctr">
+                                  <w14:noFill/>
+                                  <w14:prstDash w14:val="solid"/>
+                                  <w14:bevel/>
+                                </w14:textOutline>
+                              </w:rPr>
+                              <w:t>rders</w:t>
+                            </w:r>
+                          </w:p>
+                        </w:txbxContent>
+                      </wps:txbx>
+                      <wps:bodyPr rot="0" spcFirstLastPara="0" vertOverflow="overflow" horzOverflow="overflow" vert="horz" wrap="square" lIns="0" tIns="0" rIns="0" bIns="0" numCol="1" spcCol="0" rtlCol="0" fromWordArt="0" anchor="ctr" anchorCtr="0" forceAA="0" compatLnSpc="1">
+                        <a:prstTxWarp prst="textNoShape">
+                          <a:avLst/>
+                        </a:prstTxWarp>
+                        <a:noAutofit/>
+                      </wps:bodyPr>
+                    </wps:wsp>
+                  </a:graphicData>
+                </a:graphic>
+                <wp14:sizeRelH relativeFrom="margin">
+                  <wp14:pctWidth>0</wp14:pctWidth>
+                </wp14:sizeRelH>
+                <wp14:sizeRelV relativeFrom="margin">
+                  <wp14:pctHeight>0</wp14:pctHeight>
+                </wp14:sizeRelV>
+              </wp:anchor>
+            </w:drawing>
+          </mc:Choice>
+          <mc:Fallback>
+            <w:pict>
+              <v:roundrect w14:anchorId="5BB26D04" id="_x0000_s1032" style="position:absolute;left:0;text-align:left;margin-left:135.25pt;margin-top:20.3pt;width:43.2pt;height:43.2pt;z-index:251667456;visibility:visible;mso-wrap-style:square;mso-width-percent:0;mso-height-percent:0;mso-wrap-distance-left:9pt;mso-wrap-distance-top:0;mso-wrap-distance-right:9pt;mso-wrap-distance-bottom:0;mso-position-horizontal:absolute;mso-position-horizontal-relative:text;mso-position-vertical:absolute;mso-position-vertical-relative:text;mso-width-percent:0;mso-height-percent:0;mso-width-relative:margin;mso-height-relative:margin;v-text-anchor:middle" arcsize="10923f" o:gfxdata="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" fillcolor="#4ea72e [3209]" strokecolor="#0b1807 [489]" strokeweight="1pt">
+                <v:stroke joinstyle="miter"/>
+                <v:textbox inset="0,0,0,0">
+                  <w:txbxContent>
+                    <w:p>
+                      <w:pPr>
+                        <w:spacing w:after="0" w:line="240" w:lineRule="auto"/>
+                        <w:jc w:val="center"/>
+                        <w:rPr>
+                          <w:b/>
+                          <w:bCs/>
+                          <w:color w:val="000000" w:themeColor="text1"/>
+                          <w14:textOutline w14:w="9525" w14:cap="rnd" w14:cmpd="sng" w14:algn="ctr">
+                            <w14:noFill/>
+                            <w14:prstDash w14:val="solid"/>
+                            <w14:bevel/>
+                          </w14:textOutline>
+                        </w:rPr>
+                      </w:pPr>
+                      <w:r>
+                        <w:rPr>
+                          <w:b/>
+                          <w:bCs/>
+                          <w:color w:val="000000" w:themeColor="text1"/>
+                          <w14:textOutline w14:w="9525" w14:cap="rnd" w14:cmpd="sng" w14:algn="ctr">
+                            <w14:noFill/>
+                            <w14:prstDash w14:val="solid"/>
+                            <w14:bevel/>
+                          </w14:textOutline>
+                        </w:rPr>
+                        <w:t>A</w:t>
+                      </w:r>
+                    </w:p>
+                    <w:p>
+                      <w:pPr>
+                        <w:spacing w:after="0" w:line="240" w:lineRule="auto"/>
+                        <w:jc w:val="center"/>
+                        <w:rPr>
+                          <w:color w:val="000000" w:themeColor="text1"/>
+                          <w:sz w:val="14"/>
+                          <w:szCs w:val="14"/>
+                          <w14:textOutline w14:w="9525" w14:cap="rnd" w14:cmpd="sng" w14:algn="ctr">
+                            <w14:noFill/>
+                            <w14:prstDash w14:val="solid"/>
+                            <w14:bevel/>
+                          </w14:textOutline>
+                        </w:rPr>
+                      </w:pPr>
+                      <w:r>
+                        <w:rPr>
+                          <w:color w:val="000000" w:themeColor="text1"/>
+                          <w:sz w:val="14"/>
+                          <w:szCs w:val="14"/>
+                          <w14:textOutline w14:w="9525" w14:cap="rnd" w14:cmpd="sng" w14:algn="ctr">
+                            <w14:noFill/>
+                            <w14:prstDash w14:val="solid"/>
+                            <w14:bevel/>
+                          </w14:textOutline>
+                        </w:rPr>
+                        <w:t xml:space="preserve">Send </w:t>
+                      </w:r>
+                      <w:r>
+                        <w:rPr>
+                          <w:color w:val="000000" w:themeColor="text1"/>
+                          <w:sz w:val="14"/>
+                          <w:szCs w:val="14"/>
+                          <w14:textOutline w14:w="9525" w14:cap="rnd" w14:cmpd="sng" w14:algn="ctr">
+                            <w14:noFill/>
+                            <w14:prstDash w14:val="solid"/>
+                            <w14:bevel/>
+                          </w14:textOutline>
+                        </w:rPr>
+                        <w:t>Entry</w:t>
+                      </w:r>
+                      <w:r>
+                        <w:rPr>
+                          <w:color w:val="000000" w:themeColor="text1"/>
+                          <w:sz w:val="14"/>
+                          <w:szCs w:val="14"/>
+                          <w14:textOutline w14:w="9525" w14:cap="rnd" w14:cmpd="sng" w14:algn="ctr">
+                            <w14:noFill/>
+                            <w14:prstDash w14:val="solid"/>
+                            <w14:bevel/>
+                          </w14:textOutline>
+                        </w:rPr>
+                        <w:t xml:space="preserve"> </w:t>
+                      </w:r>
+                      <w:r>
+                        <w:rPr>
+                          <w:color w:val="000000" w:themeColor="text1"/>
+                          <w:sz w:val="14"/>
+                          <w:szCs w:val="14"/>
+                          <w14:textOutline w14:w="9525" w14:cap="rnd" w14:cmpd="sng" w14:algn="ctr">
+                            <w14:noFill/>
+                            <w14:prstDash w14:val="solid"/>
+                            <w14:bevel/>
+                          </w14:textOutline>
+                        </w:rPr>
+                        <w:t>O</w:t>
+                      </w:r>
+                      <w:r>
+                        <w:rPr>
+                          <w:color w:val="000000" w:themeColor="text1"/>
+                          <w:sz w:val="14"/>
+                          <w:szCs w:val="14"/>
+                          <w14:textOutline w14:w="9525" w14:cap="rnd" w14:cmpd="sng" w14:algn="ctr">
+                            <w14:noFill/>
+                            <w14:prstDash w14:val="solid"/>
+                            <w14:bevel/>
+                          </w14:textOutline>
+                        </w:rPr>
+                        <w:t>rders</w:t>
+                      </w:r>
+                    </w:p>
+                  </w:txbxContent>
+                </v:textbox>
+              </v:roundrect>
+            </w:pict>
+          </mc:Fallback>
+        </mc:AlternateContent>
+      </w:r>
+      <w:r>
+        <w:rPr>
+          <w:noProof/>
+        </w:rPr>
+        <mc:AlternateContent>
+          <mc:Choice Requires="wps">
+            <w:drawing>
+              <wp:anchor distT="0" distB="0" distL="114300" distR="114300" simplePos="0" relativeHeight="251685888" behindDoc="0" locked="0" layoutInCell="1" allowOverlap="1" wp14:anchorId="46E3F4A9" wp14:editId="77C04019">
+                <wp:simplePos x="0" y="0"/>
+                <wp:positionH relativeFrom="column">
+                  <wp:posOffset>2313940</wp:posOffset>
+                </wp:positionH>
+                <wp:positionV relativeFrom="paragraph">
+                  <wp:posOffset>537210</wp:posOffset>
+                </wp:positionV>
+                <wp:extent cx="274320" cy="0"/>
+                <wp:effectExtent l="0" t="76200" r="11430" b="95250"/>
+                <wp:wrapNone/>
+                <wp:docPr id="312043052" name="Straight Arrow Connector 2"/>
+                <wp:cNvGraphicFramePr/>
+                <a:graphic xmlns:a="http://schemas.openxmlformats.org/drawingml/2006/main">
+                  <a:graphicData uri="http://schemas.microsoft.com/office/word/2010/wordprocessingShape">
+                    <wps:wsp>
+                      <wps:cNvCnPr/>
+                      <wps:spPr>
+                        <a:xfrm>
+                          <a:off x="0" y="0"/>
+                          <a:ext cx="274320" cy="0"/>
+                        </a:xfrm>
+                        <a:prstGeom prst="straightConnector1">
+                          <a:avLst/>
+                        </a:prstGeom>
+                        <a:ln>
+                          <a:solidFill>
+                            <a:schemeClr val="tx1"/>
+                          </a:solidFill>
+                          <a:tailEnd type="triangle"/>
+                        </a:ln>
+                      </wps:spPr>
+                      <wps:style>
+                        <a:lnRef idx="1">
+                          <a:schemeClr val="accent1"/>
+                        </a:lnRef>
+                        <a:fillRef idx="0">
+                          <a:schemeClr val="accent1"/>
+                        </a:fillRef>
+                        <a:effectRef idx="0">
+                          <a:schemeClr val="accent1"/>
+                        </a:effectRef>
+                        <a:fontRef idx="minor">
+                          <a:schemeClr val="tx1"/>
+                        </a:fontRef>
+                      </wps:style>
+                      <wps:bodyPr/>
+                    </wps:wsp>
+                  </a:graphicData>
+                </a:graphic>
+                <wp14:sizeRelH relativeFrom="margin">
+                  <wp14:pctWidth>0</wp14:pctWidth>
+                </wp14:sizeRelH>
+                <wp14:sizeRelV relativeFrom="margin">
+                  <wp14:pctHeight>0</wp14:pctHeight>
+                </wp14:sizeRelV>
+              </wp:anchor>
+            </w:drawing>
+          </mc:Choice>
+          <mc:Fallback>
+            <w:pict>
+              <v:shape w14:anchorId="21C75469" id="Straight Arrow Connector 2" o:spid="_x0000_s1026" type="#_x0000_t32" style="position:absolute;margin-left:182.2pt;margin-top:42.3pt;width:21.6pt;height:0;z-index:251685888;visibility:visible;mso-wrap-style:square;mso-width-percent:0;mso-height-percent:0;mso-wrap-distance-left:9pt;mso-wrap-distance-top:0;mso-wrap-distance-right:9pt;mso-wrap-distance-bottom:0;mso-position-horizontal:absolute;mso-position-horizontal-relative:text;mso-position-vertical:absolute;mso-position-vertical-relative:text;mso-width-percent:0;mso-height-percent:0;mso-width-relative:margin;mso-height-relative:margin" o:gfxdata="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" strokecolor="black [3213]" strokeweight=".5pt">
+                <v:stroke endarrow="block" joinstyle="miter"/>
+              </v:shape>
+            </w:pict>
+          </mc:Fallback>
+        </mc:AlternateContent>
+      </w:r>
+      <w:r>
+        <w:rPr>
+          <w:noProof/>
+        </w:rPr>
+        <mc:AlternateContent>
+          <mc:Choice Requires="wps">
+            <w:drawing>
+              <wp:anchor distT="0" distB="0" distL="114300" distR="114300" simplePos="0" relativeHeight="251695104" behindDoc="0" locked="0" layoutInCell="1" allowOverlap="1" wp14:anchorId="1658CC62" wp14:editId="434CE37E">
+                <wp:simplePos x="0" y="0"/>
+                <wp:positionH relativeFrom="column">
+                  <wp:posOffset>2593340</wp:posOffset>
+                </wp:positionH>
+                <wp:positionV relativeFrom="paragraph">
+                  <wp:posOffset>57785</wp:posOffset>
+                </wp:positionV>
+                <wp:extent cx="0" cy="914400"/>
+                <wp:effectExtent l="0" t="0" r="38100" b="19050"/>
+                <wp:wrapNone/>
+                <wp:docPr id="384368207" name="Straight Connector 8"/>
+                <wp:cNvGraphicFramePr/>
+                <a:graphic xmlns:a="http://schemas.openxmlformats.org/drawingml/2006/main">
+                  <a:graphicData uri="http://schemas.microsoft.com/office/word/2010/wordprocessingShape">
+                    <wps:wsp>
+                      <wps:cNvCnPr/>
+                      <wps:spPr>
+                        <a:xfrm>
+                          <a:off x="0" y="0"/>
+                          <a:ext cx="0" cy="914400"/>
+                        </a:xfrm>
+                        <a:prstGeom prst="line">
+                          <a:avLst/>
+                        </a:prstGeom>
+                        <a:ln>
+                          <a:solidFill>
+                            <a:srgbClr val="EE0000"/>
+                          </a:solidFill>
+                          <a:prstDash val="dash"/>
+                        </a:ln>
+                      </wps:spPr>
+                      <wps:style>
+                        <a:lnRef idx="1">
+                          <a:schemeClr val="accent1"/>
+                        </a:lnRef>
+                        <a:fillRef idx="0">
+                          <a:schemeClr val="accent1"/>
+                        </a:fillRef>
+                        <a:effectRef idx="0">
+                          <a:schemeClr val="accent1"/>
+                        </a:effectRef>
+                        <a:fontRef idx="minor">
+                          <a:schemeClr val="tx1"/>
+                        </a:fontRef>
+                      </wps:style>
+                      <wps:bodyPr/>
+                    </wps:wsp>
+                  </a:graphicData>
+                </a:graphic>
+                <wp14:sizeRelH relativeFrom="margin">
+                  <wp14:pctWidth>0</wp14:pctWidth>
+                </wp14:sizeRelH>
+                <wp14:sizeRelV relativeFrom="margin">
+                  <wp14:pctHeight>0</wp14:pctHeight>
+                </wp14:sizeRelV>
+              </wp:anchor>
+            </w:drawing>
+          </mc:Choice>
+          <mc:Fallback>
+            <w:pict>
+              <v:line w14:anchorId="579CFD4F" id="Straight Connector 8" o:spid="_x0000_s1026" style="position:absolute;z-index:251695104;visibility:visible;mso-wrap-style:square;mso-width-percent:0;mso-height-percent:0;mso-wrap-distance-left:9pt;mso-wrap-distance-top:0;mso-wrap-distance-right:9pt;mso-wrap-distance-bottom:0;mso-position-horizontal:absolute;mso-position-horizontal-relative:text;mso-position-vertical:absolute;mso-position-vertical-relative:text;mso-width-percent:0;mso-height-percent:0;mso-width-relative:margin;mso-height-relative:margin" from="204.2pt,4.55pt" to="204.2pt,76.55pt" o:gfxdata="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" strokecolor="#e00" strokeweight=".5pt">
+                <v:stroke dashstyle="dash" joinstyle="miter"/>
+              </v:line>
+            </w:pict>
+          </mc:Fallback>
+        </mc:AlternateContent>
+      </w:r>
+      <w:r>
+        <w:rPr>
+          <w:noProof/>
+        </w:rPr>
+        <mc:AlternateContent>
+          <mc:Choice Requires="wps">
+            <w:drawing>
+              <wp:anchor distT="0" distB="0" distL="114300" distR="114300" simplePos="0" relativeHeight="251696128" behindDoc="0" locked="0" layoutInCell="1" allowOverlap="1" wp14:anchorId="32B14FCA" wp14:editId="7D9474AC">
+                <wp:simplePos x="0" y="0"/>
+                <wp:positionH relativeFrom="column">
+                  <wp:posOffset>2375535</wp:posOffset>
+                </wp:positionH>
+                <wp:positionV relativeFrom="paragraph">
+                  <wp:posOffset>95250</wp:posOffset>
+                </wp:positionV>
+                <wp:extent cx="255905" cy="130810"/>
+                <wp:effectExtent l="0" t="0" r="10795" b="2540"/>
+                <wp:wrapNone/>
+                <wp:docPr id="86183140" name="Text Box 9"/>
+                <wp:cNvGraphicFramePr/>
+                <a:graphic xmlns:a="http://schemas.openxmlformats.org/drawingml/2006/main">
+                  <a:graphicData uri="http://schemas.microsoft.com/office/word/2010/wordprocessingShape">
+                    <wps:wsp>
+                      <wps:cNvSpPr txBox="1"/>
+                      <wps:spPr>
+                        <a:xfrm>
+                          <a:off x="0" y="0"/>
+                          <a:ext cx="255905" cy="130810"/>
+                        </a:xfrm>
+                        <a:prstGeom prst="rect">
+                          <a:avLst/>
+                        </a:prstGeom>
+                        <a:noFill/>
+                        <a:ln w="6350">
+                          <a:noFill/>
+                        </a:ln>
+                      </wps:spPr>
+                      <wps:txbx>
+                        <w:txbxContent>
+                          <w:p>
+                            <w:pPr>
+                              <w:rPr>
+                                <w:color w:val="EE0000"/>
+                                <w:sz w:val="14"/>
+                                <w:szCs w:val="14"/>
+                              </w:rPr>
+                            </w:pPr>
+                            <w:r>
+                              <w:rPr>
+                                <w:color w:val="EE0000"/>
+                                <w:sz w:val="14"/>
+                                <w:szCs w:val="14"/>
+                              </w:rPr>
+                              <w:t>Entry</w:t>
+                            </w:r>
+                          </w:p>
+                        </w:txbxContent>
+                      </wps:txbx>
+                      <wps:bodyPr rot="0" spcFirstLastPara="0" vertOverflow="overflow" horzOverflow="overflow" vert="horz" wrap="square" lIns="0" tIns="0" rIns="0" bIns="0" numCol="1" spcCol="0" rtlCol="0" fromWordArt="0" anchor="t" anchorCtr="0" forceAA="0" compatLnSpc="1">
+                        <a:prstTxWarp prst="textNoShape">
+                          <a:avLst/>
+                        </a:prstTxWarp>
+                        <a:noAutofit/>
+                      </wps:bodyPr>
+                    </wps:wsp>
+                  </a:graphicData>
+                </a:graphic>
+                <wp14:sizeRelH relativeFrom="margin">
+                  <wp14:pctWidth>0</wp14:pctWidth>
+                </wp14:sizeRelH>
+                <wp14:sizeRelV relativeFrom="margin">
+                  <wp14:pctHeight>0</wp14:pctHeight>
+                </wp14:sizeRelV>
+              </wp:anchor>
+            </w:drawing>
+          </mc:Choice>
+          <mc:Fallback>
+            <w:pict>
+              <v:shape w14:anchorId="32B14FCA" id="Text Box 9" o:spid="_x0000_s1033" type="#_x0000_t202" style="position:absolute;left:0;text-align:left;margin-left:187.05pt;margin-top:7.5pt;width:20.15pt;height:10.3pt;z-index:251696128;visibility:visible;mso-wrap-style:square;mso-width-percent:0;mso-height-percent:0;mso-wrap-distance-left:9pt;mso-wrap-distance-top:0;mso-wrap-distance-right:9pt;mso-wrap-distance-bottom:0;mso-position-horizontal:absolute;mso-position-horizontal-relative:text;mso-position-vertical:absolute;mso-position-vertical-relative:text;mso-width-percent:0;mso-height-percent:0;mso-width-relative:margin;mso-height-relative:margin;v-text-anchor:top" o:gfxdata="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" filled="f" stroked="f" strokeweight=".5pt">
+                <v:textbox inset="0,0,0,0">
+                  <w:txbxContent>
+                    <w:p>
+                      <w:pPr>
+                        <w:rPr>
+                          <w:color w:val="EE0000"/>
+                          <w:sz w:val="14"/>
+                          <w:szCs w:val="14"/>
+                        </w:rPr>
+                      </w:pPr>
+                      <w:r>
+                        <w:rPr>
+                          <w:color w:val="EE0000"/>
+                          <w:sz w:val="14"/>
+                          <w:szCs w:val="14"/>
+                        </w:rPr>
+                        <w:t>Entry</w:t>
+                      </w:r>
+                    </w:p>
+                  </w:txbxContent>
+                </v:textbox>
+              </v:shape>
+            </w:pict>
+          </mc:Fallback>
+        </mc:AlternateContent>
+      </w:r>
+      <w:r>
+        <w:rPr>
+          <w:noProof/>
+        </w:rPr>
+        <mc:AlternateContent>
+          <mc:Choice Requires="wps">
+            <w:drawing>
+              <wp:anchor distT="0" distB="0" distL="114300" distR="114300" simplePos="0" relativeHeight="251703296" behindDoc="0" locked="0" layoutInCell="1" allowOverlap="1" wp14:anchorId="68FE2F37" wp14:editId="1DA928F1">
+                <wp:simplePos x="0" y="0"/>
+                <wp:positionH relativeFrom="column">
+                  <wp:posOffset>4138930</wp:posOffset>
+                </wp:positionH>
+                <wp:positionV relativeFrom="paragraph">
+                  <wp:posOffset>531495</wp:posOffset>
+                </wp:positionV>
+                <wp:extent cx="274320" cy="0"/>
+                <wp:effectExtent l="0" t="76200" r="11430" b="95250"/>
+                <wp:wrapNone/>
+                <wp:docPr id="320026128" name="Straight Arrow Connector 2"/>
+                <wp:cNvGraphicFramePr/>
+                <a:graphic xmlns:a="http://schemas.openxmlformats.org/drawingml/2006/main">
+                  <a:graphicData uri="http://schemas.microsoft.com/office/word/2010/wordprocessingShape">
+                    <wps:wsp>
+                      <wps:cNvCnPr/>
+                      <wps:spPr>
+                        <a:xfrm>
+                          <a:off x="0" y="0"/>
+                          <a:ext cx="274320" cy="0"/>
+                        </a:xfrm>
+                        <a:prstGeom prst="straightConnector1">
+                          <a:avLst/>
+                        </a:prstGeom>
+                        <a:ln>
+                          <a:solidFill>
+                            <a:schemeClr val="tx1"/>
+                          </a:solidFill>
+                          <a:tailEnd type="triangle"/>
+                        </a:ln>
+                      </wps:spPr>
+                      <wps:style>
+                        <a:lnRef idx="1">
+                          <a:schemeClr val="accent1"/>
+                        </a:lnRef>
+                        <a:fillRef idx="0">
+                          <a:schemeClr val="accent1"/>
+                        </a:fillRef>
+                        <a:effectRef idx="0">
+                          <a:schemeClr val="accent1"/>
+                        </a:effectRef>
+                        <a:fontRef idx="minor">
+                          <a:schemeClr val="tx1"/>
+                        </a:fontRef>
+                      </wps:style>
+                      <wps:bodyPr/>
+                    </wps:wsp>
+                  </a:graphicData>
+                </a:graphic>
+                <wp14:sizeRelH relativeFrom="margin">
+                  <wp14:pctWidth>0</wp14:pctWidth>
+                </wp14:sizeRelH>
+                <wp14:sizeRelV relativeFrom="margin">
+                  <wp14:pctHeight>0</wp14:pctHeight>
+                </wp14:sizeRelV>
+              </wp:anchor>
+            </w:drawing>
+          </mc:Choice>
+          <mc:Fallback>
+            <w:pict>
+              <v:shape w14:anchorId="3757E74A" id="Straight Arrow Connector 2" o:spid="_x0000_s1026" type="#_x0000_t32" style="position:absolute;margin-left:325.9pt;margin-top:41.85pt;width:21.6pt;height:0;z-index:251703296;visibility:visible;mso-wrap-style:square;mso-width-percent:0;mso-height-percent:0;mso-wrap-distance-left:9pt;mso-wrap-distance-top:0;mso-wrap-distance-right:9pt;mso-wrap-distance-bottom:0;mso-position-horizontal:absolute;mso-position-horizontal-relative:text;mso-position-vertical:absolute;mso-position-vertical-relative:text;mso-width-percent:0;mso-height-percent:0;mso-width-relative:margin;mso-height-relative:margin" o:gfxdata="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" strokecolor="black [3213]" strokeweight=".5pt">
+                <v:stroke endarrow="block" joinstyle="miter"/>
+              </v:shape>
+            </w:pict>
+          </mc:Fallback>
+        </mc:AlternateContent>
+      </w:r>
+      <w:r>
+        <w:rPr>
+          <w:noProof/>
+        </w:rPr>
+        <mc:AlternateContent>
+          <mc:Choice Requires="wps">
+            <w:drawing>
+              <wp:anchor distT="0" distB="0" distL="114300" distR="114300" simplePos="0" relativeHeight="251675648" behindDoc="0" locked="0" layoutInCell="1" allowOverlap="1" wp14:anchorId="5D44742A" wp14:editId="38292625">
+                <wp:simplePos x="0" y="0"/>
+                <wp:positionH relativeFrom="column">
+                  <wp:posOffset>4447540</wp:posOffset>
+                </wp:positionH>
+                <wp:positionV relativeFrom="paragraph">
+                  <wp:posOffset>256540</wp:posOffset>
+                </wp:positionV>
+                <wp:extent cx="1704340" cy="548640"/>
                 <wp:effectExtent l="0" t="0" r="10160" b="22860"/>
                 <wp:wrapNone/>
                 <wp:docPr id="148785574" name="Rectangle: Rounded Corners 1"/>
@@ -1453,7 +3138,7 @@
                       <wps:spPr>
                         <a:xfrm>
                           <a:off x="0" y="0"/>
-                          <a:ext cx="1704441" cy="548640"/>
+                          <a:ext cx="1704340" cy="548640"/>
                         </a:xfrm>
                         <a:prstGeom prst="roundRect">
                           <a:avLst/>
@@ -1660,7 +3345,7 @@
           </mc:Choice>
           <mc:Fallback>
             <w:pict>
-              <v:roundrect w14:anchorId="5D44742A" id="Rectangle: Rounded Corners 1" o:spid="_x0000_s1026" style="position:absolute;left:0;text-align:left;margin-left:358pt;margin-top:107.7pt;width:134.2pt;height:43.2pt;z-index:251675648;visibility:visible;mso-wrap-style:square;mso-width-percent:0;mso-height-percent:0;mso-wrap-distance-left:9pt;mso-wrap-distance-top:0;mso-wrap-distance-right:9pt;mso-wrap-distance-bottom:0;mso-position-horizontal:absolute;mso-position-horizontal-relative:text;mso-position-vertical:absolute;mso-position-vertical-relative:text;mso-width-percent:0;mso-height-percent:0;mso-width-relative:margin;mso-height-relative:margin;v-text-anchor:middle" arcsize="10923f" o:gfxdata="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" fillcolor="#c1f0c7 [662]" strokecolor="#0b1807 [489]" strokeweight="1pt">
+              <v:roundrect w14:anchorId="5D44742A" id="_x0000_s1034" style="position:absolute;left:0;text-align:left;margin-left:350.2pt;margin-top:20.2pt;width:134.2pt;height:43.2pt;z-index:251675648;visibility:visible;mso-wrap-style:square;mso-width-percent:0;mso-height-percent:0;mso-wrap-distance-left:9pt;mso-wrap-distance-top:0;mso-wrap-distance-right:9pt;mso-wrap-distance-bottom:0;mso-position-horizontal:absolute;mso-position-horizontal-relative:text;mso-position-vertical:absolute;mso-position-vertical-relative:text;mso-width-percent:0;mso-height-percent:0;mso-width-relative:margin;mso-height-relative:margin;v-text-anchor:middle" arcsize="10923f" o:gfxdata="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" fillcolor="#c1f0c7 [662]" strokecolor="#0b1807 [489]" strokeweight="1pt">
                 <v:stroke joinstyle="miter"/>
                 <v:textbox inset="0,0,0,0">
                   <w:txbxContent>
@@ -1833,137 +3518,152 @@
         <mc:AlternateContent>
           <mc:Choice Requires="wps">
             <w:drawing>
-              <wp:anchor distT="0" distB="0" distL="114300" distR="114300" simplePos="0" relativeHeight="251703296" behindDoc="0" locked="0" layoutInCell="1" allowOverlap="1" wp14:anchorId="68FE2F37" wp14:editId="2FCB7341">
+              <wp:anchor distT="0" distB="0" distL="114300" distR="114300" simplePos="0" relativeHeight="251704320" behindDoc="0" locked="0" layoutInCell="1" allowOverlap="1" wp14:anchorId="58686D95" wp14:editId="28C21194">
                 <wp:simplePos x="0" y="0"/>
                 <wp:positionH relativeFrom="column">
-                  <wp:posOffset>4237355</wp:posOffset>
+                  <wp:posOffset>457835</wp:posOffset>
                 </wp:positionH>
                 <wp:positionV relativeFrom="paragraph">
-                  <wp:posOffset>1642745</wp:posOffset>
+                  <wp:posOffset>527050</wp:posOffset>
                 </wp:positionV>
-                <wp:extent cx="274320" cy="0"/>
-                <wp:effectExtent l="0" t="76200" r="11430" b="95250"/>
+                <wp:extent cx="6017260" cy="829945"/>
+                <wp:effectExtent l="0" t="57150" r="21590" b="27305"/>
                 <wp:wrapNone/>
-                <wp:docPr id="320026128" name="Straight Arrow Connector 2"/>
+                <wp:docPr id="1080643459" name="Freeform: Shape 21"/>
                 <wp:cNvGraphicFramePr/>
                 <a:graphic xmlns:a="http://schemas.openxmlformats.org/drawingml/2006/main">
                   <a:graphicData uri="http://schemas.microsoft.com/office/word/2010/wordprocessingShape">
                     <wps:wsp>
-                      <wps:cNvCnPr/>
+                      <wps:cNvSpPr/>
                       <wps:spPr>
                         <a:xfrm>
                           <a:off x="0" y="0"/>
-                          <a:ext cx="274320" cy="0"/>
+                          <a:ext cx="6017260" cy="829945"/>
                         </a:xfrm>
-                        <a:prstGeom prst="straightConnector1">
+                        <a:custGeom>
                           <a:avLst/>
-                        </a:prstGeom>
-                        <a:ln>
-                          <a:solidFill>
-                            <a:schemeClr val="tx1"/>
-                          </a:solidFill>
-                          <a:tailEnd type="triangle"/>
+                          <a:gdLst>
+                            <a:gd name="csX0" fmla="*/ 5745705 w 6017749"/>
+                            <a:gd name="csY0" fmla="*/ 0 h 829967"/>
+                            <a:gd name="csX1" fmla="*/ 6016367 w 6017749"/>
+                            <a:gd name="csY1" fmla="*/ 468173 h 829967"/>
+                            <a:gd name="csX2" fmla="*/ 5643292 w 6017749"/>
+                            <a:gd name="csY2" fmla="*/ 768096 h 829967"/>
+                            <a:gd name="csX3" fmla="*/ 4948348 w 6017749"/>
+                            <a:gd name="csY3" fmla="*/ 826618 h 829967"/>
+                            <a:gd name="csX4" fmla="*/ 1773551 w 6017749"/>
+                            <a:gd name="csY4" fmla="*/ 819303 h 829967"/>
+                            <a:gd name="csX5" fmla="*/ 376348 w 6017749"/>
+                            <a:gd name="csY5" fmla="*/ 790042 h 829967"/>
+                            <a:gd name="csX6" fmla="*/ 83740 w 6017749"/>
+                            <a:gd name="csY6" fmla="*/ 607162 h 829967"/>
+                            <a:gd name="csX7" fmla="*/ 10588 w 6017749"/>
+                            <a:gd name="csY7" fmla="*/ 138989 h 829967"/>
+                            <a:gd name="csX8" fmla="*/ 273935 w 6017749"/>
+                            <a:gd name="csY8" fmla="*/ 7315 h 829967"/>
+                          </a:gdLst>
+                          <a:ahLst/>
+                          <a:cxnLst>
+                            <a:cxn ang="0">
+                              <a:pos x="csX0" y="csY0"/>
+                            </a:cxn>
+                            <a:cxn ang="0">
+                              <a:pos x="csX1" y="csY1"/>
+                            </a:cxn>
+                            <a:cxn ang="0">
+                              <a:pos x="csX2" y="csY2"/>
+                            </a:cxn>
+                            <a:cxn ang="0">
+                              <a:pos x="csX3" y="csY3"/>
+                            </a:cxn>
+                            <a:cxn ang="0">
+                              <a:pos x="csX4" y="csY4"/>
+                            </a:cxn>
+                            <a:cxn ang="0">
+                              <a:pos x="csX5" y="csY5"/>
+                            </a:cxn>
+                            <a:cxn ang="0">
+                              <a:pos x="csX6" y="csY6"/>
+                            </a:cxn>
+                            <a:cxn ang="0">
+                              <a:pos x="csX7" y="csY7"/>
+                            </a:cxn>
+                            <a:cxn ang="0">
+                              <a:pos x="csX8" y="csY8"/>
+                            </a:cxn>
+                          </a:cxnLst>
+                          <a:rect l="l" t="t" r="r" b="b"/>
+                          <a:pathLst>
+                            <a:path w="6017749" h="829967">
+                              <a:moveTo>
+                                <a:pt x="5745705" y="0"/>
+                              </a:moveTo>
+                              <a:cubicBezTo>
+                                <a:pt x="5889570" y="170078"/>
+                                <a:pt x="6033436" y="340157"/>
+                                <a:pt x="6016367" y="468173"/>
+                              </a:cubicBezTo>
+                              <a:cubicBezTo>
+                                <a:pt x="5999298" y="596189"/>
+                                <a:pt x="5821295" y="708355"/>
+                                <a:pt x="5643292" y="768096"/>
+                              </a:cubicBezTo>
+                              <a:cubicBezTo>
+                                <a:pt x="5465289" y="827837"/>
+                                <a:pt x="5593305" y="818084"/>
+                                <a:pt x="4948348" y="826618"/>
+                              </a:cubicBezTo>
+                              <a:cubicBezTo>
+                                <a:pt x="4303391" y="835153"/>
+                                <a:pt x="2535551" y="825399"/>
+                                <a:pt x="1773551" y="819303"/>
+                              </a:cubicBezTo>
+                              <a:cubicBezTo>
+                                <a:pt x="1011551" y="813207"/>
+                                <a:pt x="657983" y="825399"/>
+                                <a:pt x="376348" y="790042"/>
+                              </a:cubicBezTo>
+                              <a:cubicBezTo>
+                                <a:pt x="94713" y="754685"/>
+                                <a:pt x="144700" y="715671"/>
+                                <a:pt x="83740" y="607162"/>
+                              </a:cubicBezTo>
+                              <a:cubicBezTo>
+                                <a:pt x="22780" y="498653"/>
+                                <a:pt x="-21111" y="238963"/>
+                                <a:pt x="10588" y="138989"/>
+                              </a:cubicBezTo>
+                              <a:cubicBezTo>
+                                <a:pt x="42287" y="39015"/>
+                                <a:pt x="158111" y="23165"/>
+                                <a:pt x="273935" y="7315"/>
+                              </a:cubicBezTo>
+                            </a:path>
+                          </a:pathLst>
+                        </a:custGeom>
+                        <a:noFill/>
+                        <a:ln w="9525">
+                          <a:headEnd type="none" w="med" len="med"/>
+                          <a:tailEnd type="triangle" w="med" len="med"/>
                         </a:ln>
                       </wps:spPr>
                       <wps:style>
-                        <a:lnRef idx="1">
-                          <a:schemeClr val="accent1"/>
+                        <a:lnRef idx="2">
+                          <a:schemeClr val="accent1">
+                            <a:shade val="15000"/>
+                          </a:schemeClr>
                         </a:lnRef>
-                        <a:fillRef idx="0">
+                        <a:fillRef idx="1">
                           <a:schemeClr val="accent1"/>
                         </a:fillRef>
                         <a:effectRef idx="0">
                           <a:schemeClr val="accent1"/>
                         </a:effectRef>
                         <a:fontRef idx="minor">
-                          <a:schemeClr val="tx1"/>
+                          <a:schemeClr val="lt1"/>
                         </a:fontRef>
                       </wps:style>
-                      <wps:bodyPr/>
-                    </wps:wsp>
-                  </a:graphicData>
-                </a:graphic>
-                <wp14:sizeRelH relativeFrom="margin">
-                  <wp14:pctWidth>0</wp14:pctWidth>
-                </wp14:sizeRelH>
-                <wp14:sizeRelV relativeFrom="margin">
-                  <wp14:pctHeight>0</wp14:pctHeight>
-                </wp14:sizeRelV>
-              </wp:anchor>
-            </w:drawing>
-          </mc:Choice>
-          <mc:Fallback>
-            <w:pict>
-              <v:shapetype w14:anchorId="088CA4CB" id="_x0000_t32" coordsize="21600,21600" o:spt="32" o:oned="t" path="m,l21600,21600e" filled="f">
-                <v:path arrowok="t" fillok="f" o:connecttype="none"/>
-                <o:lock v:ext="edit" shapetype="t"/>
-              </v:shapetype>
-              <v:shape id="Straight Arrow Connector 2" o:spid="_x0000_s1026" type="#_x0000_t32" style="position:absolute;margin-left:333.65pt;margin-top:129.35pt;width:21.6pt;height:0;z-index:251703296;visibility:visible;mso-wrap-style:square;mso-width-percent:0;mso-height-percent:0;mso-wrap-distance-left:9pt;mso-wrap-distance-top:0;mso-wrap-distance-right:9pt;mso-wrap-distance-bottom:0;mso-position-horizontal:absolute;mso-position-horizontal-relative:text;mso-position-vertical:absolute;mso-position-vertical-relative:text;mso-width-percent:0;mso-height-percent:0;mso-width-relative:margin;mso-height-relative:margin" o:gfxdata="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" strokecolor="black [3213]" strokeweight=".5pt">
-                <v:stroke endarrow="block" joinstyle="miter"/>
-              </v:shape>
-            </w:pict>
-          </mc:Fallback>
-        </mc:AlternateContent>
-      </w:r>
-      <w:r>
-        <w:rPr>
-          <w:noProof/>
-        </w:rPr>
-        <mc:AlternateContent>
-          <mc:Choice Requires="wps">
-            <w:drawing>
-              <wp:anchor distT="0" distB="0" distL="114300" distR="114300" simplePos="0" relativeHeight="251696128" behindDoc="0" locked="0" layoutInCell="1" allowOverlap="1" wp14:anchorId="32B14FCA" wp14:editId="32E5ECAF">
-                <wp:simplePos x="0" y="0"/>
-                <wp:positionH relativeFrom="column">
-                  <wp:posOffset>2473960</wp:posOffset>
-                </wp:positionH>
-                <wp:positionV relativeFrom="paragraph">
-                  <wp:posOffset>1206500</wp:posOffset>
-                </wp:positionV>
-                <wp:extent cx="255905" cy="130810"/>
-                <wp:effectExtent l="0" t="0" r="10795" b="2540"/>
-                <wp:wrapNone/>
-                <wp:docPr id="86183140" name="Text Box 9"/>
-                <wp:cNvGraphicFramePr/>
-                <a:graphic xmlns:a="http://schemas.openxmlformats.org/drawingml/2006/main">
-                  <a:graphicData uri="http://schemas.microsoft.com/office/word/2010/wordprocessingShape">
-                    <wps:wsp>
-                      <wps:cNvSpPr txBox="1"/>
-                      <wps:spPr>
-                        <a:xfrm>
-                          <a:off x="0" y="0"/>
-                          <a:ext cx="255905" cy="130810"/>
-                        </a:xfrm>
-                        <a:prstGeom prst="rect">
-                          <a:avLst/>
-                        </a:prstGeom>
-                        <a:noFill/>
-                        <a:ln w="6350">
-                          <a:noFill/>
-                        </a:ln>
-                      </wps:spPr>
-                      <wps:txbx>
-                        <w:txbxContent>
-                          <w:p>
-                            <w:pPr>
-                              <w:rPr>
-                                <w:color w:val="EE0000"/>
-                                <w:sz w:val="14"/>
-                                <w:szCs w:val="14"/>
-                              </w:rPr>
-                            </w:pPr>
-                            <w:r>
-                              <w:rPr>
-                                <w:color w:val="EE0000"/>
-                                <w:sz w:val="14"/>
-                                <w:szCs w:val="14"/>
-                              </w:rPr>
-                              <w:t>Entry</w:t>
-                            </w:r>
-                          </w:p>
-                        </w:txbxContent>
-                      </wps:txbx>
-                      <wps:bodyPr rot="0" spcFirstLastPara="0" vertOverflow="overflow" horzOverflow="overflow" vert="horz" wrap="square" lIns="0" tIns="0" rIns="0" bIns="0" numCol="1" spcCol="0" rtlCol="0" fromWordArt="0" anchor="t" anchorCtr="0" forceAA="0" compatLnSpc="1">
+                      <wps:bodyPr rot="0" spcFirstLastPara="0" vertOverflow="overflow" horzOverflow="overflow" vert="horz" wrap="square" lIns="91440" tIns="45720" rIns="91440" bIns="45720" numCol="1" spcCol="0" rtlCol="0" fromWordArt="0" anchor="ctr" anchorCtr="0" forceAA="0" compatLnSpc="1">
                         <a:prstTxWarp prst="textNoShape">
                           <a:avLst/>
                         </a:prstTxWarp>
@@ -1972,1644 +3672,134 @@
                     </wps:wsp>
                   </a:graphicData>
                 </a:graphic>
-                <wp14:sizeRelH relativeFrom="margin">
-                  <wp14:pctWidth>0</wp14:pctWidth>
-                </wp14:sizeRelH>
-                <wp14:sizeRelV relativeFrom="margin">
-                  <wp14:pctHeight>0</wp14:pctHeight>
-                </wp14:sizeRelV>
               </wp:anchor>
             </w:drawing>
           </mc:Choice>
           <mc:Fallback>
             <w:pict>
-              <v:shapetype w14:anchorId="32B14FCA" id="_x0000_t202" coordsize="21600,21600" o:spt="202" path="m,l,21600r21600,l21600,xe">
-                <v:stroke joinstyle="miter"/>
-                <v:path gradientshapeok="t" o:connecttype="rect"/>
-              </v:shapetype>
-              <v:shape id="Text Box 9" o:spid="_x0000_s1027" type="#_x0000_t202" style="position:absolute;left:0;text-align:left;margin-left:194.8pt;margin-top:95pt;width:20.15pt;height:10.3pt;z-index:251696128;visibility:visible;mso-wrap-style:square;mso-width-percent:0;mso-height-percent:0;mso-wrap-distance-left:9pt;mso-wrap-distance-top:0;mso-wrap-distance-right:9pt;mso-wrap-distance-bottom:0;mso-position-horizontal:absolute;mso-position-horizontal-relative:text;mso-position-vertical:absolute;mso-position-vertical-relative:text;mso-width-percent:0;mso-height-percent:0;mso-width-relative:margin;mso-height-relative:margin;v-text-anchor:top" o:gfxdata="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" filled="f" stroked="f" strokeweight=".5pt">
-                <v:textbox inset="0,0,0,0">
-                  <w:txbxContent>
-                    <w:p>
-                      <w:pPr>
-                        <w:rPr>
-                          <w:color w:val="EE0000"/>
-                          <w:sz w:val="14"/>
-                          <w:szCs w:val="14"/>
-                        </w:rPr>
-                      </w:pPr>
-                      <w:r>
-                        <w:rPr>
-                          <w:color w:val="EE0000"/>
-                          <w:sz w:val="14"/>
-                          <w:szCs w:val="14"/>
-                        </w:rPr>
-                        <w:t>Entry</w:t>
-                      </w:r>
-                    </w:p>
-                  </w:txbxContent>
-                </v:textbox>
+              <v:shape w14:anchorId="79167387" id="Freeform: Shape 21" o:spid="_x0000_s1026" style="position:absolute;margin-left:36.05pt;margin-top:41.5pt;width:473.8pt;height:65.35pt;z-index:251704320;visibility:visible;mso-wrap-style:square;mso-wrap-distance-left:9pt;mso-wrap-distance-top:0;mso-wrap-distance-right:9pt;mso-wrap-distance-bottom:0;mso-position-horizontal:absolute;mso-position-horizontal-relative:text;mso-position-vertical:absolute;mso-position-vertical-relative:text;v-text-anchor:middle" coordsize="6017749,829967" o:gfxdata="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" path="m5745705,v143865,170078,287731,340157,270662,468173c5999298,596189,5821295,708355,5643292,768096v-178003,59741,-49987,49988,-694944,58522c4303391,835153,2535551,825399,1773551,819303,1011551,813207,657983,825399,376348,790042,94713,754685,144700,715671,83740,607162,22780,498653,-21111,238963,10588,138989,42287,39015,158111,23165,273935,7315e" filled="f" strokecolor="#030e13 [484]">
+                <v:stroke endarrow="block" joinstyle="miter"/>
+                <v:path arrowok="t" o:connecttype="custom" o:connectlocs="5745238,0;6015878,468161;5642833,768076;4947946,826596;1773407,819281;376317,790021;83733,607146;10587,138985;273913,7315" o:connectangles="0,0,0,0,0,0,0,0,0"/>
               </v:shape>
             </w:pict>
           </mc:Fallback>
         </mc:AlternateContent>
       </w:r>
-      <w:r>
-        <w:rPr>
-          <w:noProof/>
-        </w:rPr>
-        <mc:AlternateContent>
-          <mc:Choice Requires="wps">
-            <w:drawing>
-              <wp:anchor distT="0" distB="0" distL="114300" distR="114300" simplePos="0" relativeHeight="251695104" behindDoc="0" locked="0" layoutInCell="1" allowOverlap="1" wp14:anchorId="1658CC62" wp14:editId="41F0186D">
-                <wp:simplePos x="0" y="0"/>
-                <wp:positionH relativeFrom="column">
-                  <wp:posOffset>2691765</wp:posOffset>
-                </wp:positionH>
-                <wp:positionV relativeFrom="paragraph">
-                  <wp:posOffset>1169035</wp:posOffset>
-                </wp:positionV>
-                <wp:extent cx="0" cy="914400"/>
-                <wp:effectExtent l="0" t="0" r="38100" b="19050"/>
-                <wp:wrapNone/>
-                <wp:docPr id="384368207" name="Straight Connector 8"/>
-                <wp:cNvGraphicFramePr/>
-                <a:graphic xmlns:a="http://schemas.openxmlformats.org/drawingml/2006/main">
-                  <a:graphicData uri="http://schemas.microsoft.com/office/word/2010/wordprocessingShape">
-                    <wps:wsp>
-                      <wps:cNvCnPr/>
-                      <wps:spPr>
-                        <a:xfrm>
-                          <a:off x="0" y="0"/>
-                          <a:ext cx="0" cy="914400"/>
-                        </a:xfrm>
-                        <a:prstGeom prst="line">
-                          <a:avLst/>
-                        </a:prstGeom>
-                        <a:ln>
-                          <a:solidFill>
-                            <a:srgbClr val="EE0000"/>
-                          </a:solidFill>
-                          <a:prstDash val="dash"/>
-                        </a:ln>
-                      </wps:spPr>
-                      <wps:style>
-                        <a:lnRef idx="1">
-                          <a:schemeClr val="accent1"/>
-                        </a:lnRef>
-                        <a:fillRef idx="0">
-                          <a:schemeClr val="accent1"/>
-                        </a:fillRef>
-                        <a:effectRef idx="0">
-                          <a:schemeClr val="accent1"/>
-                        </a:effectRef>
-                        <a:fontRef idx="minor">
-                          <a:schemeClr val="tx1"/>
-                        </a:fontRef>
-                      </wps:style>
-                      <wps:bodyPr/>
-                    </wps:wsp>
-                  </a:graphicData>
-                </a:graphic>
-                <wp14:sizeRelH relativeFrom="margin">
-                  <wp14:pctWidth>0</wp14:pctWidth>
-                </wp14:sizeRelH>
-                <wp14:sizeRelV relativeFrom="margin">
-                  <wp14:pctHeight>0</wp14:pctHeight>
-                </wp14:sizeRelV>
-              </wp:anchor>
-            </w:drawing>
-          </mc:Choice>
-          <mc:Fallback>
-            <w:pict>
-              <v:line w14:anchorId="3617B264" id="Straight Connector 8" o:spid="_x0000_s1026" style="position:absolute;z-index:251695104;visibility:visible;mso-wrap-style:square;mso-width-percent:0;mso-height-percent:0;mso-wrap-distance-left:9pt;mso-wrap-distance-top:0;mso-wrap-distance-right:9pt;mso-wrap-distance-bottom:0;mso-position-horizontal:absolute;mso-position-horizontal-relative:text;mso-position-vertical:absolute;mso-position-vertical-relative:text;mso-width-percent:0;mso-height-percent:0;mso-width-relative:margin;mso-height-relative:margin" from="211.95pt,92.05pt" to="211.95pt,164.05pt" o:gfxdata="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" strokecolor="#e00" strokeweight=".5pt">
-                <v:stroke dashstyle="dash" joinstyle="miter"/>
-              </v:line>
-            </w:pict>
-          </mc:Fallback>
-        </mc:AlternateContent>
-      </w:r>
-      <w:r>
-        <w:rPr>
-          <w:noProof/>
-        </w:rPr>
-        <mc:AlternateContent>
-          <mc:Choice Requires="wps">
-            <w:drawing>
-              <wp:anchor distT="0" distB="0" distL="114300" distR="114300" simplePos="0" relativeHeight="251685888" behindDoc="0" locked="0" layoutInCell="1" allowOverlap="1" wp14:anchorId="46E3F4A9" wp14:editId="63ED2B4C">
-                <wp:simplePos x="0" y="0"/>
-                <wp:positionH relativeFrom="column">
-                  <wp:posOffset>2412365</wp:posOffset>
-                </wp:positionH>
-                <wp:positionV relativeFrom="paragraph">
-                  <wp:posOffset>1648460</wp:posOffset>
-                </wp:positionV>
-                <wp:extent cx="274320" cy="0"/>
-                <wp:effectExtent l="0" t="76200" r="11430" b="95250"/>
-                <wp:wrapNone/>
-                <wp:docPr id="312043052" name="Straight Arrow Connector 2"/>
-                <wp:cNvGraphicFramePr/>
-                <a:graphic xmlns:a="http://schemas.openxmlformats.org/drawingml/2006/main">
-                  <a:graphicData uri="http://schemas.microsoft.com/office/word/2010/wordprocessingShape">
-                    <wps:wsp>
-                      <wps:cNvCnPr/>
-                      <wps:spPr>
-                        <a:xfrm>
-                          <a:off x="0" y="0"/>
-                          <a:ext cx="274320" cy="0"/>
-                        </a:xfrm>
-                        <a:prstGeom prst="straightConnector1">
-                          <a:avLst/>
-                        </a:prstGeom>
-                        <a:ln>
-                          <a:solidFill>
-                            <a:schemeClr val="tx1"/>
-                          </a:solidFill>
-                          <a:tailEnd type="triangle"/>
-                        </a:ln>
-                      </wps:spPr>
-                      <wps:style>
-                        <a:lnRef idx="1">
-                          <a:schemeClr val="accent1"/>
-                        </a:lnRef>
-                        <a:fillRef idx="0">
-                          <a:schemeClr val="accent1"/>
-                        </a:fillRef>
-                        <a:effectRef idx="0">
-                          <a:schemeClr val="accent1"/>
-                        </a:effectRef>
-                        <a:fontRef idx="minor">
-                          <a:schemeClr val="tx1"/>
-                        </a:fontRef>
-                      </wps:style>
-                      <wps:bodyPr/>
-                    </wps:wsp>
-                  </a:graphicData>
-                </a:graphic>
-                <wp14:sizeRelH relativeFrom="margin">
-                  <wp14:pctWidth>0</wp14:pctWidth>
-                </wp14:sizeRelH>
-                <wp14:sizeRelV relativeFrom="margin">
-                  <wp14:pctHeight>0</wp14:pctHeight>
-                </wp14:sizeRelV>
-              </wp:anchor>
-            </w:drawing>
-          </mc:Choice>
-          <mc:Fallback>
-            <w:pict>
-              <v:shape w14:anchorId="7863A3FF" id="Straight Arrow Connector 2" o:spid="_x0000_s1026" type="#_x0000_t32" style="position:absolute;margin-left:189.95pt;margin-top:129.8pt;width:21.6pt;height:0;z-index:251685888;visibility:visible;mso-wrap-style:square;mso-width-percent:0;mso-height-percent:0;mso-wrap-distance-left:9pt;mso-wrap-distance-top:0;mso-wrap-distance-right:9pt;mso-wrap-distance-bottom:0;mso-position-horizontal:absolute;mso-position-horizontal-relative:text;mso-position-vertical:absolute;mso-position-vertical-relative:text;mso-width-percent:0;mso-height-percent:0;mso-width-relative:margin;mso-height-relative:margin" o:gfxdata="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" strokecolor="black [3213]" strokeweight=".5pt">
-                <v:stroke endarrow="block" joinstyle="miter"/>
-              </v:shape>
-            </w:pict>
-          </mc:Fallback>
-        </mc:AlternateContent>
-      </w:r>
-      <w:r>
-        <w:rPr>
-          <w:noProof/>
-        </w:rPr>
-        <mc:AlternateContent>
-          <mc:Choice Requires="wps">
-            <w:drawing>
-              <wp:anchor distT="0" distB="0" distL="114300" distR="114300" simplePos="0" relativeHeight="251667456" behindDoc="0" locked="0" layoutInCell="1" allowOverlap="1" wp14:anchorId="5BB26D04" wp14:editId="78541BE0">
-                <wp:simplePos x="0" y="0"/>
-                <wp:positionH relativeFrom="column">
-                  <wp:posOffset>1816100</wp:posOffset>
-                </wp:positionH>
-                <wp:positionV relativeFrom="paragraph">
-                  <wp:posOffset>1369060</wp:posOffset>
-                </wp:positionV>
-                <wp:extent cx="548640" cy="548640"/>
-                <wp:effectExtent l="0" t="0" r="22860" b="22860"/>
-                <wp:wrapNone/>
-                <wp:docPr id="1717604901" name="Rectangle: Rounded Corners 1"/>
-                <wp:cNvGraphicFramePr/>
-                <a:graphic xmlns:a="http://schemas.openxmlformats.org/drawingml/2006/main">
-                  <a:graphicData uri="http://schemas.microsoft.com/office/word/2010/wordprocessingShape">
-                    <wps:wsp>
-                      <wps:cNvSpPr/>
-                      <wps:spPr>
-                        <a:xfrm>
-                          <a:off x="0" y="0"/>
-                          <a:ext cx="548640" cy="548640"/>
-                        </a:xfrm>
-                        <a:prstGeom prst="roundRect">
-                          <a:avLst/>
-                        </a:prstGeom>
-                      </wps:spPr>
-                      <wps:style>
-                        <a:lnRef idx="2">
-                          <a:schemeClr val="accent6">
-                            <a:shade val="15000"/>
-                          </a:schemeClr>
-                        </a:lnRef>
-                        <a:fillRef idx="1">
-                          <a:schemeClr val="accent6"/>
-                        </a:fillRef>
-                        <a:effectRef idx="0">
-                          <a:schemeClr val="accent6"/>
-                        </a:effectRef>
-                        <a:fontRef idx="minor">
-                          <a:schemeClr val="lt1"/>
-                        </a:fontRef>
-                      </wps:style>
-                      <wps:txbx>
-                        <w:txbxContent>
-                          <w:p>
-                            <w:pPr>
-                              <w:spacing w:after="0" w:line="240" w:lineRule="auto"/>
-                              <w:jc w:val="center"/>
-                              <w:rPr>
-                                <w:b/>
-                                <w:bCs/>
-                                <w:color w:val="000000" w:themeColor="text1"/>
-                                <w14:textOutline w14:w="9525" w14:cap="rnd" w14:cmpd="sng" w14:algn="ctr">
-                                  <w14:noFill/>
-                                  <w14:prstDash w14:val="solid"/>
-                                  <w14:bevel/>
-                                </w14:textOutline>
-                              </w:rPr>
-                            </w:pPr>
-                            <w:r>
-                              <w:rPr>
-                                <w:b/>
-                                <w:bCs/>
-                                <w:color w:val="000000" w:themeColor="text1"/>
-                                <w14:textOutline w14:w="9525" w14:cap="rnd" w14:cmpd="sng" w14:algn="ctr">
-                                  <w14:noFill/>
-                                  <w14:prstDash w14:val="solid"/>
-                                  <w14:bevel/>
-                                </w14:textOutline>
-                              </w:rPr>
-                              <w:t>A</w:t>
-                            </w:r>
-                          </w:p>
-                          <w:p>
-                            <w:pPr>
-                              <w:spacing w:after="0" w:line="240" w:lineRule="auto"/>
-                              <w:jc w:val="center"/>
-                              <w:rPr>
-                                <w:color w:val="000000" w:themeColor="text1"/>
-                                <w:sz w:val="14"/>
-                                <w:szCs w:val="14"/>
-                                <w14:textOutline w14:w="9525" w14:cap="rnd" w14:cmpd="sng" w14:algn="ctr">
-                                  <w14:noFill/>
-                                  <w14:prstDash w14:val="solid"/>
-                                  <w14:bevel/>
-                                </w14:textOutline>
-                              </w:rPr>
-                            </w:pPr>
-                            <w:r>
-                              <w:rPr>
-                                <w:color w:val="000000" w:themeColor="text1"/>
-                                <w:sz w:val="14"/>
-                                <w:szCs w:val="14"/>
-                                <w14:textOutline w14:w="9525" w14:cap="rnd" w14:cmpd="sng" w14:algn="ctr">
-                                  <w14:noFill/>
-                                  <w14:prstDash w14:val="solid"/>
-                                  <w14:bevel/>
-                                </w14:textOutline>
-                              </w:rPr>
-                              <w:t xml:space="preserve">Send </w:t>
-                            </w:r>
-                            <w:r>
-                              <w:rPr>
-                                <w:color w:val="000000" w:themeColor="text1"/>
-                                <w:sz w:val="14"/>
-                                <w:szCs w:val="14"/>
-                                <w14:textOutline w14:w="9525" w14:cap="rnd" w14:cmpd="sng" w14:algn="ctr">
-                                  <w14:noFill/>
-                                  <w14:prstDash w14:val="solid"/>
-                                  <w14:bevel/>
-                                </w14:textOutline>
-                              </w:rPr>
-                              <w:t>Entry</w:t>
-                            </w:r>
-                            <w:r>
-                              <w:rPr>
-                                <w:color w:val="000000" w:themeColor="text1"/>
-                                <w:sz w:val="14"/>
-                                <w:szCs w:val="14"/>
-                                <w14:textOutline w14:w="9525" w14:cap="rnd" w14:cmpd="sng" w14:algn="ctr">
-                                  <w14:noFill/>
-                                  <w14:prstDash w14:val="solid"/>
-                                  <w14:bevel/>
-                                </w14:textOutline>
-                              </w:rPr>
-                              <w:t xml:space="preserve"> </w:t>
-                            </w:r>
-                            <w:r>
-                              <w:rPr>
-                                <w:color w:val="000000" w:themeColor="text1"/>
-                                <w:sz w:val="14"/>
-                                <w:szCs w:val="14"/>
-                                <w14:textOutline w14:w="9525" w14:cap="rnd" w14:cmpd="sng" w14:algn="ctr">
-                                  <w14:noFill/>
-                                  <w14:prstDash w14:val="solid"/>
-                                  <w14:bevel/>
-                                </w14:textOutline>
-                              </w:rPr>
-                              <w:t>O</w:t>
-                            </w:r>
-                            <w:r>
-                              <w:rPr>
-                                <w:color w:val="000000" w:themeColor="text1"/>
-                                <w:sz w:val="14"/>
-                                <w:szCs w:val="14"/>
-                                <w14:textOutline w14:w="9525" w14:cap="rnd" w14:cmpd="sng" w14:algn="ctr">
-                                  <w14:noFill/>
-                                  <w14:prstDash w14:val="solid"/>
-                                  <w14:bevel/>
-                                </w14:textOutline>
-                              </w:rPr>
-                              <w:t>rders</w:t>
-                            </w:r>
-                          </w:p>
-                        </w:txbxContent>
-                      </wps:txbx>
-                      <wps:bodyPr rot="0" spcFirstLastPara="0" vertOverflow="overflow" horzOverflow="overflow" vert="horz" wrap="square" lIns="0" tIns="0" rIns="0" bIns="0" numCol="1" spcCol="0" rtlCol="0" fromWordArt="0" anchor="ctr" anchorCtr="0" forceAA="0" compatLnSpc="1">
-                        <a:prstTxWarp prst="textNoShape">
-                          <a:avLst/>
-                        </a:prstTxWarp>
-                        <a:noAutofit/>
-                      </wps:bodyPr>
-                    </wps:wsp>
-                  </a:graphicData>
-                </a:graphic>
-                <wp14:sizeRelH relativeFrom="margin">
-                  <wp14:pctWidth>0</wp14:pctWidth>
-                </wp14:sizeRelH>
-                <wp14:sizeRelV relativeFrom="margin">
-                  <wp14:pctHeight>0</wp14:pctHeight>
-                </wp14:sizeRelV>
-              </wp:anchor>
-            </w:drawing>
-          </mc:Choice>
-          <mc:Fallback>
-            <w:pict>
-              <v:roundrect w14:anchorId="5BB26D04" id="_x0000_s1028" style="position:absolute;left:0;text-align:left;margin-left:143pt;margin-top:107.8pt;width:43.2pt;height:43.2pt;z-index:251667456;visibility:visible;mso-wrap-style:square;mso-width-percent:0;mso-height-percent:0;mso-wrap-distance-left:9pt;mso-wrap-distance-top:0;mso-wrap-distance-right:9pt;mso-wrap-distance-bottom:0;mso-position-horizontal:absolute;mso-position-horizontal-relative:text;mso-position-vertical:absolute;mso-position-vertical-relative:text;mso-width-percent:0;mso-height-percent:0;mso-width-relative:margin;mso-height-relative:margin;v-text-anchor:middle" arcsize="10923f" o:gfxdata="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" fillcolor="#4ea72e [3209]" strokecolor="#0b1807 [489]" strokeweight="1pt">
-                <v:stroke joinstyle="miter"/>
-                <v:textbox inset="0,0,0,0">
-                  <w:txbxContent>
-                    <w:p>
-                      <w:pPr>
-                        <w:spacing w:after="0" w:line="240" w:lineRule="auto"/>
-                        <w:jc w:val="center"/>
-                        <w:rPr>
-                          <w:b/>
-                          <w:bCs/>
-                          <w:color w:val="000000" w:themeColor="text1"/>
-                          <w14:textOutline w14:w="9525" w14:cap="rnd" w14:cmpd="sng" w14:algn="ctr">
-                            <w14:noFill/>
-                            <w14:prstDash w14:val="solid"/>
-                            <w14:bevel/>
-                          </w14:textOutline>
-                        </w:rPr>
-                      </w:pPr>
-                      <w:r>
-                        <w:rPr>
-                          <w:b/>
-                          <w:bCs/>
-                          <w:color w:val="000000" w:themeColor="text1"/>
-                          <w14:textOutline w14:w="9525" w14:cap="rnd" w14:cmpd="sng" w14:algn="ctr">
-                            <w14:noFill/>
-                            <w14:prstDash w14:val="solid"/>
-                            <w14:bevel/>
-                          </w14:textOutline>
-                        </w:rPr>
-                        <w:t>A</w:t>
-                      </w:r>
-                    </w:p>
-                    <w:p>
-                      <w:pPr>
-                        <w:spacing w:after="0" w:line="240" w:lineRule="auto"/>
-                        <w:jc w:val="center"/>
-                        <w:rPr>
-                          <w:color w:val="000000" w:themeColor="text1"/>
-                          <w:sz w:val="14"/>
-                          <w:szCs w:val="14"/>
-                          <w14:textOutline w14:w="9525" w14:cap="rnd" w14:cmpd="sng" w14:algn="ctr">
-                            <w14:noFill/>
-                            <w14:prstDash w14:val="solid"/>
-                            <w14:bevel/>
-                          </w14:textOutline>
-                        </w:rPr>
-                      </w:pPr>
-                      <w:r>
-                        <w:rPr>
-                          <w:color w:val="000000" w:themeColor="text1"/>
-                          <w:sz w:val="14"/>
-                          <w:szCs w:val="14"/>
-                          <w14:textOutline w14:w="9525" w14:cap="rnd" w14:cmpd="sng" w14:algn="ctr">
-                            <w14:noFill/>
-                            <w14:prstDash w14:val="solid"/>
-                            <w14:bevel/>
-                          </w14:textOutline>
-                        </w:rPr>
-                        <w:t xml:space="preserve">Send </w:t>
-                      </w:r>
-                      <w:r>
-                        <w:rPr>
-                          <w:color w:val="000000" w:themeColor="text1"/>
-                          <w:sz w:val="14"/>
-                          <w:szCs w:val="14"/>
-                          <w14:textOutline w14:w="9525" w14:cap="rnd" w14:cmpd="sng" w14:algn="ctr">
-                            <w14:noFill/>
-                            <w14:prstDash w14:val="solid"/>
-                            <w14:bevel/>
-                          </w14:textOutline>
-                        </w:rPr>
-                        <w:t>Entry</w:t>
-                      </w:r>
-                      <w:r>
-                        <w:rPr>
-                          <w:color w:val="000000" w:themeColor="text1"/>
-                          <w:sz w:val="14"/>
-                          <w:szCs w:val="14"/>
-                          <w14:textOutline w14:w="9525" w14:cap="rnd" w14:cmpd="sng" w14:algn="ctr">
-                            <w14:noFill/>
-                            <w14:prstDash w14:val="solid"/>
-                            <w14:bevel/>
-                          </w14:textOutline>
-                        </w:rPr>
-                        <w:t xml:space="preserve"> </w:t>
-                      </w:r>
-                      <w:r>
-                        <w:rPr>
-                          <w:color w:val="000000" w:themeColor="text1"/>
-                          <w:sz w:val="14"/>
-                          <w:szCs w:val="14"/>
-                          <w14:textOutline w14:w="9525" w14:cap="rnd" w14:cmpd="sng" w14:algn="ctr">
-                            <w14:noFill/>
-                            <w14:prstDash w14:val="solid"/>
-                            <w14:bevel/>
-                          </w14:textOutline>
-                        </w:rPr>
-                        <w:t>O</w:t>
-                      </w:r>
-                      <w:r>
-                        <w:rPr>
-                          <w:color w:val="000000" w:themeColor="text1"/>
-                          <w:sz w:val="14"/>
-                          <w:szCs w:val="14"/>
-                          <w14:textOutline w14:w="9525" w14:cap="rnd" w14:cmpd="sng" w14:algn="ctr">
-                            <w14:noFill/>
-                            <w14:prstDash w14:val="solid"/>
-                            <w14:bevel/>
-                          </w14:textOutline>
-                        </w:rPr>
-                        <w:t>rders</w:t>
-                      </w:r>
-                    </w:p>
-                  </w:txbxContent>
-                </v:textbox>
-              </v:roundrect>
-            </w:pict>
-          </mc:Fallback>
-        </mc:AlternateContent>
-      </w:r>
-      <w:r>
-        <w:rPr>
-          <w:noProof/>
-        </w:rPr>
-        <mc:AlternateContent>
-          <mc:Choice Requires="wps">
-            <w:drawing>
-              <wp:anchor distT="0" distB="0" distL="114300" distR="114300" simplePos="0" relativeHeight="251683840" behindDoc="0" locked="0" layoutInCell="1" allowOverlap="1" wp14:anchorId="1AFC1A49" wp14:editId="45E18911">
-                <wp:simplePos x="0" y="0"/>
-                <wp:positionH relativeFrom="column">
-                  <wp:posOffset>1485265</wp:posOffset>
-                </wp:positionH>
-                <wp:positionV relativeFrom="paragraph">
-                  <wp:posOffset>1645285</wp:posOffset>
-                </wp:positionV>
-                <wp:extent cx="274320" cy="0"/>
-                <wp:effectExtent l="0" t="76200" r="11430" b="95250"/>
-                <wp:wrapNone/>
-                <wp:docPr id="2099500788" name="Straight Arrow Connector 2"/>
-                <wp:cNvGraphicFramePr/>
-                <a:graphic xmlns:a="http://schemas.openxmlformats.org/drawingml/2006/main">
-                  <a:graphicData uri="http://schemas.microsoft.com/office/word/2010/wordprocessingShape">
-                    <wps:wsp>
-                      <wps:cNvCnPr/>
-                      <wps:spPr>
-                        <a:xfrm>
-                          <a:off x="0" y="0"/>
-                          <a:ext cx="274320" cy="0"/>
-                        </a:xfrm>
-                        <a:prstGeom prst="straightConnector1">
-                          <a:avLst/>
-                        </a:prstGeom>
-                        <a:ln>
-                          <a:solidFill>
-                            <a:schemeClr val="tx1"/>
-                          </a:solidFill>
-                          <a:tailEnd type="triangle"/>
-                        </a:ln>
-                      </wps:spPr>
-                      <wps:style>
-                        <a:lnRef idx="1">
-                          <a:schemeClr val="accent1"/>
-                        </a:lnRef>
-                        <a:fillRef idx="0">
-                          <a:schemeClr val="accent1"/>
-                        </a:fillRef>
-                        <a:effectRef idx="0">
-                          <a:schemeClr val="accent1"/>
-                        </a:effectRef>
-                        <a:fontRef idx="minor">
-                          <a:schemeClr val="tx1"/>
-                        </a:fontRef>
-                      </wps:style>
-                      <wps:bodyPr/>
-                    </wps:wsp>
-                  </a:graphicData>
-                </a:graphic>
-                <wp14:sizeRelH relativeFrom="margin">
-                  <wp14:pctWidth>0</wp14:pctWidth>
-                </wp14:sizeRelH>
-                <wp14:sizeRelV relativeFrom="margin">
-                  <wp14:pctHeight>0</wp14:pctHeight>
-                </wp14:sizeRelV>
-              </wp:anchor>
-            </w:drawing>
-          </mc:Choice>
-          <mc:Fallback>
-            <w:pict>
-              <v:shape w14:anchorId="3357D53D" id="Straight Arrow Connector 2" o:spid="_x0000_s1026" type="#_x0000_t32" style="position:absolute;margin-left:116.95pt;margin-top:129.55pt;width:21.6pt;height:0;z-index:251683840;visibility:visible;mso-wrap-style:square;mso-width-percent:0;mso-height-percent:0;mso-wrap-distance-left:9pt;mso-wrap-distance-top:0;mso-wrap-distance-right:9pt;mso-wrap-distance-bottom:0;mso-position-horizontal:absolute;mso-position-horizontal-relative:text;mso-position-vertical:absolute;mso-position-vertical-relative:text;mso-width-percent:0;mso-height-percent:0;mso-width-relative:margin;mso-height-relative:margin" o:gfxdata="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" strokecolor="black [3213]" strokeweight=".5pt">
-                <v:stroke endarrow="block" joinstyle="miter"/>
-              </v:shape>
-            </w:pict>
-          </mc:Fallback>
-        </mc:AlternateContent>
-      </w:r>
-      <w:r>
-        <w:rPr>
-          <w:noProof/>
-        </w:rPr>
-        <mc:AlternateContent>
-          <mc:Choice Requires="wps">
-            <w:drawing>
-              <wp:anchor distT="0" distB="0" distL="114300" distR="114300" simplePos="0" relativeHeight="251677696" behindDoc="0" locked="0" layoutInCell="1" allowOverlap="1" wp14:anchorId="57F13C5B" wp14:editId="228E3DB2">
-                <wp:simplePos x="0" y="0"/>
-                <wp:positionH relativeFrom="column">
-                  <wp:posOffset>898525</wp:posOffset>
-                </wp:positionH>
-                <wp:positionV relativeFrom="paragraph">
-                  <wp:posOffset>1371600</wp:posOffset>
-                </wp:positionV>
-                <wp:extent cx="548640" cy="548640"/>
-                <wp:effectExtent l="0" t="0" r="22860" b="22860"/>
-                <wp:wrapNone/>
-                <wp:docPr id="336500431" name="Rectangle: Rounded Corners 1"/>
-                <wp:cNvGraphicFramePr/>
-                <a:graphic xmlns:a="http://schemas.openxmlformats.org/drawingml/2006/main">
-                  <a:graphicData uri="http://schemas.microsoft.com/office/word/2010/wordprocessingShape">
-                    <wps:wsp>
-                      <wps:cNvSpPr/>
-                      <wps:spPr>
-                        <a:xfrm>
-                          <a:off x="0" y="0"/>
-                          <a:ext cx="548640" cy="548640"/>
-                        </a:xfrm>
-                        <a:prstGeom prst="roundRect">
-                          <a:avLst/>
-                        </a:prstGeom>
-                      </wps:spPr>
-                      <wps:style>
-                        <a:lnRef idx="2">
-                          <a:schemeClr val="accent6">
-                            <a:shade val="15000"/>
-                          </a:schemeClr>
-                        </a:lnRef>
-                        <a:fillRef idx="1">
-                          <a:schemeClr val="accent6"/>
-                        </a:fillRef>
-                        <a:effectRef idx="0">
-                          <a:schemeClr val="accent6"/>
-                        </a:effectRef>
-                        <a:fontRef idx="minor">
-                          <a:schemeClr val="lt1"/>
-                        </a:fontRef>
-                      </wps:style>
-                      <wps:txbx>
-                        <w:txbxContent>
-                          <w:p>
-                            <w:pPr>
-                              <w:spacing w:after="0"/>
-                              <w:jc w:val="center"/>
-                              <w:rPr>
-                                <w:b/>
-                                <w:bCs/>
-                                <w:color w:val="000000" w:themeColor="text1"/>
-                                <w14:textOutline w14:w="9525" w14:cap="rnd" w14:cmpd="sng" w14:algn="ctr">
-                                  <w14:noFill/>
-                                  <w14:prstDash w14:val="solid"/>
-                                  <w14:bevel/>
-                                </w14:textOutline>
-                              </w:rPr>
-                            </w:pPr>
-                            <w:r>
-                              <w:rPr>
-                                <w:b/>
-                                <w:bCs/>
-                                <w:color w:val="000000" w:themeColor="text1"/>
-                                <w14:textOutline w14:w="9525" w14:cap="rnd" w14:cmpd="sng" w14:algn="ctr">
-                                  <w14:noFill/>
-                                  <w14:prstDash w14:val="solid"/>
-                                  <w14:bevel/>
-                                </w14:textOutline>
-                              </w:rPr>
-                              <w:t>E</w:t>
-                            </w:r>
-                          </w:p>
-                          <w:p>
-                            <w:pPr>
-                              <w:spacing w:after="0"/>
-                              <w:jc w:val="center"/>
-                              <w:rPr>
-                                <w:color w:val="000000" w:themeColor="text1"/>
-                                <w:sz w:val="14"/>
-                                <w:szCs w:val="14"/>
-                                <w14:textOutline w14:w="9525" w14:cap="rnd" w14:cmpd="sng" w14:algn="ctr">
-                                  <w14:noFill/>
-                                  <w14:prstDash w14:val="solid"/>
-                                  <w14:bevel/>
-                                </w14:textOutline>
-                              </w:rPr>
-                            </w:pPr>
-                            <w:r>
-                              <w:rPr>
-                                <w:color w:val="000000" w:themeColor="text1"/>
-                                <w:sz w:val="14"/>
-                                <w:szCs w:val="14"/>
-                                <w14:textOutline w14:w="9525" w14:cap="rnd" w14:cmpd="sng" w14:algn="ctr">
-                                  <w14:noFill/>
-                                  <w14:prstDash w14:val="solid"/>
-                                  <w14:bevel/>
-                                </w14:textOutline>
-                              </w:rPr>
-                              <w:t>S</w:t>
-                            </w:r>
-                            <w:r>
-                              <w:rPr>
-                                <w:color w:val="000000" w:themeColor="text1"/>
-                                <w:sz w:val="14"/>
-                                <w:szCs w:val="14"/>
-                                <w14:textOutline w14:w="9525" w14:cap="rnd" w14:cmpd="sng" w14:algn="ctr">
-                                  <w14:noFill/>
-                                  <w14:prstDash w14:val="solid"/>
-                                  <w14:bevel/>
-                                </w14:textOutline>
-                              </w:rPr>
-                              <w:t>tage</w:t>
-                            </w:r>
-                            <w:r>
-                              <w:rPr>
-                                <w:color w:val="000000" w:themeColor="text1"/>
-                                <w:sz w:val="14"/>
-                                <w:szCs w:val="14"/>
-                                <w14:textOutline w14:w="9525" w14:cap="rnd" w14:cmpd="sng" w14:algn="ctr">
-                                  <w14:noFill/>
-                                  <w14:prstDash w14:val="solid"/>
-                                  <w14:bevel/>
-                                </w14:textOutline>
-                              </w:rPr>
-                              <w:t xml:space="preserve"> Next</w:t>
-                            </w:r>
-                          </w:p>
-                          <w:p>
-                            <w:pPr>
-                              <w:spacing w:after="0"/>
-                              <w:jc w:val="center"/>
-                              <w:rPr>
-                                <w:color w:val="000000" w:themeColor="text1"/>
-                                <w:sz w:val="14"/>
-                                <w:szCs w:val="14"/>
-                                <w14:textOutline w14:w="9525" w14:cap="rnd" w14:cmpd="sng" w14:algn="ctr">
-                                  <w14:noFill/>
-                                  <w14:prstDash w14:val="solid"/>
-                                  <w14:bevel/>
-                                </w14:textOutline>
-                              </w:rPr>
-                            </w:pPr>
-                            <w:r>
-                              <w:rPr>
-                                <w:color w:val="000000" w:themeColor="text1"/>
-                                <w:sz w:val="14"/>
-                                <w:szCs w:val="14"/>
-                                <w14:textOutline w14:w="9525" w14:cap="rnd" w14:cmpd="sng" w14:algn="ctr">
-                                  <w14:noFill/>
-                                  <w14:prstDash w14:val="solid"/>
-                                  <w14:bevel/>
-                                </w14:textOutline>
-                              </w:rPr>
-                              <w:t>trades</w:t>
-                            </w:r>
-                          </w:p>
-                        </w:txbxContent>
-                      </wps:txbx>
-                      <wps:bodyPr rot="0" spcFirstLastPara="0" vertOverflow="overflow" horzOverflow="overflow" vert="horz" wrap="square" lIns="0" tIns="0" rIns="0" bIns="0" numCol="1" spcCol="0" rtlCol="0" fromWordArt="0" anchor="ctr" anchorCtr="0" forceAA="0" compatLnSpc="1">
-                        <a:prstTxWarp prst="textNoShape">
-                          <a:avLst/>
-                        </a:prstTxWarp>
-                        <a:noAutofit/>
-                      </wps:bodyPr>
-                    </wps:wsp>
-                  </a:graphicData>
-                </a:graphic>
-                <wp14:sizeRelH relativeFrom="margin">
-                  <wp14:pctWidth>0</wp14:pctWidth>
-                </wp14:sizeRelH>
-                <wp14:sizeRelV relativeFrom="margin">
-                  <wp14:pctHeight>0</wp14:pctHeight>
-                </wp14:sizeRelV>
-              </wp:anchor>
-            </w:drawing>
-          </mc:Choice>
-          <mc:Fallback>
-            <w:pict>
-              <v:roundrect w14:anchorId="57F13C5B" id="_x0000_s1029" style="position:absolute;left:0;text-align:left;margin-left:70.75pt;margin-top:108pt;width:43.2pt;height:43.2pt;z-index:251677696;visibility:visible;mso-wrap-style:square;mso-width-percent:0;mso-height-percent:0;mso-wrap-distance-left:9pt;mso-wrap-distance-top:0;mso-wrap-distance-right:9pt;mso-wrap-distance-bottom:0;mso-position-horizontal:absolute;mso-position-horizontal-relative:text;mso-position-vertical:absolute;mso-position-vertical-relative:text;mso-width-percent:0;mso-height-percent:0;mso-width-relative:margin;mso-height-relative:margin;v-text-anchor:middle" arcsize="10923f" o:gfxdata="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" fillcolor="#4ea72e [3209]" strokecolor="#0b1807 [489]" strokeweight="1pt">
-                <v:stroke joinstyle="miter"/>
-                <v:textbox inset="0,0,0,0">
-                  <w:txbxContent>
-                    <w:p>
-                      <w:pPr>
-                        <w:spacing w:after="0"/>
-                        <w:jc w:val="center"/>
-                        <w:rPr>
-                          <w:b/>
-                          <w:bCs/>
-                          <w:color w:val="000000" w:themeColor="text1"/>
-                          <w14:textOutline w14:w="9525" w14:cap="rnd" w14:cmpd="sng" w14:algn="ctr">
-                            <w14:noFill/>
-                            <w14:prstDash w14:val="solid"/>
-                            <w14:bevel/>
-                          </w14:textOutline>
-                        </w:rPr>
-                      </w:pPr>
-                      <w:r>
-                        <w:rPr>
-                          <w:b/>
-                          <w:bCs/>
-                          <w:color w:val="000000" w:themeColor="text1"/>
-                          <w14:textOutline w14:w="9525" w14:cap="rnd" w14:cmpd="sng" w14:algn="ctr">
-                            <w14:noFill/>
-                            <w14:prstDash w14:val="solid"/>
-                            <w14:bevel/>
-                          </w14:textOutline>
-                        </w:rPr>
-                        <w:t>E</w:t>
-                      </w:r>
-                    </w:p>
-                    <w:p>
-                      <w:pPr>
-                        <w:spacing w:after="0"/>
-                        <w:jc w:val="center"/>
-                        <w:rPr>
-                          <w:color w:val="000000" w:themeColor="text1"/>
-                          <w:sz w:val="14"/>
-                          <w:szCs w:val="14"/>
-                          <w14:textOutline w14:w="9525" w14:cap="rnd" w14:cmpd="sng" w14:algn="ctr">
-                            <w14:noFill/>
-                            <w14:prstDash w14:val="solid"/>
-                            <w14:bevel/>
-                          </w14:textOutline>
-                        </w:rPr>
-                      </w:pPr>
-                      <w:r>
-                        <w:rPr>
-                          <w:color w:val="000000" w:themeColor="text1"/>
-                          <w:sz w:val="14"/>
-                          <w:szCs w:val="14"/>
-                          <w14:textOutline w14:w="9525" w14:cap="rnd" w14:cmpd="sng" w14:algn="ctr">
-                            <w14:noFill/>
-                            <w14:prstDash w14:val="solid"/>
-                            <w14:bevel/>
-                          </w14:textOutline>
-                        </w:rPr>
-                        <w:t>S</w:t>
-                      </w:r>
-                      <w:r>
-                        <w:rPr>
-                          <w:color w:val="000000" w:themeColor="text1"/>
-                          <w:sz w:val="14"/>
-                          <w:szCs w:val="14"/>
-                          <w14:textOutline w14:w="9525" w14:cap="rnd" w14:cmpd="sng" w14:algn="ctr">
-                            <w14:noFill/>
-                            <w14:prstDash w14:val="solid"/>
-                            <w14:bevel/>
-                          </w14:textOutline>
-                        </w:rPr>
-                        <w:t>tage</w:t>
-                      </w:r>
-                      <w:r>
-                        <w:rPr>
-                          <w:color w:val="000000" w:themeColor="text1"/>
-                          <w:sz w:val="14"/>
-                          <w:szCs w:val="14"/>
-                          <w14:textOutline w14:w="9525" w14:cap="rnd" w14:cmpd="sng" w14:algn="ctr">
-                            <w14:noFill/>
-                            <w14:prstDash w14:val="solid"/>
-                            <w14:bevel/>
-                          </w14:textOutline>
-                        </w:rPr>
-                        <w:t xml:space="preserve"> Next</w:t>
-                      </w:r>
-                    </w:p>
-                    <w:p>
-                      <w:pPr>
-                        <w:spacing w:after="0"/>
-                        <w:jc w:val="center"/>
-                        <w:rPr>
-                          <w:color w:val="000000" w:themeColor="text1"/>
-                          <w:sz w:val="14"/>
-                          <w:szCs w:val="14"/>
-                          <w14:textOutline w14:w="9525" w14:cap="rnd" w14:cmpd="sng" w14:algn="ctr">
-                            <w14:noFill/>
-                            <w14:prstDash w14:val="solid"/>
-                            <w14:bevel/>
-                          </w14:textOutline>
-                        </w:rPr>
-                      </w:pPr>
-                      <w:r>
-                        <w:rPr>
-                          <w:color w:val="000000" w:themeColor="text1"/>
-                          <w:sz w:val="14"/>
-                          <w:szCs w:val="14"/>
-                          <w14:textOutline w14:w="9525" w14:cap="rnd" w14:cmpd="sng" w14:algn="ctr">
-                            <w14:noFill/>
-                            <w14:prstDash w14:val="solid"/>
-                            <w14:bevel/>
-                          </w14:textOutline>
-                        </w:rPr>
-                        <w:t>trades</w:t>
-                      </w:r>
-                    </w:p>
-                  </w:txbxContent>
-                </v:textbox>
-              </v:roundrect>
-            </w:pict>
-          </mc:Fallback>
-        </mc:AlternateContent>
-      </w:r>
-      <w:r>
-        <w:rPr>
-          <w:noProof/>
-        </w:rPr>
-        <mc:AlternateContent>
-          <mc:Choice Requires="wps">
-            <w:drawing>
-              <wp:anchor distT="0" distB="0" distL="114300" distR="114300" simplePos="0" relativeHeight="251694080" behindDoc="0" locked="0" layoutInCell="1" allowOverlap="1" wp14:anchorId="41530CCC" wp14:editId="1C23836C">
-                <wp:simplePos x="0" y="0"/>
-                <wp:positionH relativeFrom="column">
-                  <wp:posOffset>2750820</wp:posOffset>
-                </wp:positionH>
-                <wp:positionV relativeFrom="paragraph">
-                  <wp:posOffset>1370965</wp:posOffset>
-                </wp:positionV>
-                <wp:extent cx="548640" cy="548640"/>
-                <wp:effectExtent l="0" t="0" r="22860" b="22860"/>
-                <wp:wrapNone/>
-                <wp:docPr id="281996261" name="Rectangle: Rounded Corners 1"/>
-                <wp:cNvGraphicFramePr/>
-                <a:graphic xmlns:a="http://schemas.openxmlformats.org/drawingml/2006/main">
-                  <a:graphicData uri="http://schemas.microsoft.com/office/word/2010/wordprocessingShape">
-                    <wps:wsp>
-                      <wps:cNvSpPr/>
-                      <wps:spPr>
-                        <a:xfrm>
-                          <a:off x="0" y="0"/>
-                          <a:ext cx="548640" cy="548640"/>
-                        </a:xfrm>
-                        <a:prstGeom prst="roundRect">
-                          <a:avLst/>
-                        </a:prstGeom>
-                      </wps:spPr>
-                      <wps:style>
-                        <a:lnRef idx="2">
-                          <a:schemeClr val="accent6">
-                            <a:shade val="15000"/>
-                          </a:schemeClr>
-                        </a:lnRef>
-                        <a:fillRef idx="1">
-                          <a:schemeClr val="accent6"/>
-                        </a:fillRef>
-                        <a:effectRef idx="0">
-                          <a:schemeClr val="accent6"/>
-                        </a:effectRef>
-                        <a:fontRef idx="minor">
-                          <a:schemeClr val="lt1"/>
-                        </a:fontRef>
-                      </wps:style>
-                      <wps:txbx>
-                        <w:txbxContent>
-                          <w:p>
-                            <w:pPr>
-                              <w:spacing w:after="0"/>
-                              <w:jc w:val="center"/>
-                              <w:rPr>
-                                <w:b/>
-                                <w:bCs/>
-                                <w:color w:val="000000" w:themeColor="text1"/>
-                                <w14:textOutline w14:w="9525" w14:cap="rnd" w14:cmpd="sng" w14:algn="ctr">
-                                  <w14:noFill/>
-                                  <w14:prstDash w14:val="solid"/>
-                                  <w14:bevel/>
-                                </w14:textOutline>
-                              </w:rPr>
-                            </w:pPr>
-                            <w:r>
-                              <w:rPr>
-                                <w:b/>
-                                <w:bCs/>
-                                <w:color w:val="000000" w:themeColor="text1"/>
-                                <w14:textOutline w14:w="9525" w14:cap="rnd" w14:cmpd="sng" w14:algn="ctr">
-                                  <w14:noFill/>
-                                  <w14:prstDash w14:val="solid"/>
-                                  <w14:bevel/>
-                                </w14:textOutline>
-                              </w:rPr>
-                              <w:t>B</w:t>
-                            </w:r>
-                          </w:p>
-                          <w:p>
-                            <w:pPr>
-                              <w:spacing w:after="0"/>
-                              <w:jc w:val="center"/>
-                              <w:rPr>
-                                <w:color w:val="000000" w:themeColor="text1"/>
-                                <w:sz w:val="14"/>
-                                <w:szCs w:val="14"/>
-                                <w14:textOutline w14:w="9525" w14:cap="rnd" w14:cmpd="sng" w14:algn="ctr">
-                                  <w14:noFill/>
-                                  <w14:prstDash w14:val="solid"/>
-                                  <w14:bevel/>
-                                </w14:textOutline>
-                              </w:rPr>
-                            </w:pPr>
-                            <w:r>
-                              <w:rPr>
-                                <w:color w:val="000000" w:themeColor="text1"/>
-                                <w:sz w:val="14"/>
-                                <w:szCs w:val="14"/>
-                                <w14:textOutline w14:w="9525" w14:cap="rnd" w14:cmpd="sng" w14:algn="ctr">
-                                  <w14:noFill/>
-                                  <w14:prstDash w14:val="solid"/>
-                                  <w14:bevel/>
-                                </w14:textOutline>
-                              </w:rPr>
-                              <w:t>Send</w:t>
-                            </w:r>
-                            <w:r>
-                              <w:rPr>
-                                <w:color w:val="000000" w:themeColor="text1"/>
-                                <w:sz w:val="14"/>
-                                <w:szCs w:val="14"/>
-                                <w14:textOutline w14:w="9525" w14:cap="rnd" w14:cmpd="sng" w14:algn="ctr">
-                                  <w14:noFill/>
-                                  <w14:prstDash w14:val="solid"/>
-                                  <w14:bevel/>
-                                </w14:textOutline>
-                              </w:rPr>
-                              <w:t xml:space="preserve"> Exit Orders</w:t>
-                            </w:r>
-                            <w:r>
-                              <w:rPr>
-                                <w:color w:val="000000" w:themeColor="text1"/>
-                                <w:sz w:val="14"/>
-                                <w:szCs w:val="14"/>
-                                <w14:textOutline w14:w="9525" w14:cap="rnd" w14:cmpd="sng" w14:algn="ctr">
-                                  <w14:noFill/>
-                                  <w14:prstDash w14:val="solid"/>
-                                  <w14:bevel/>
-                                </w14:textOutline>
-                              </w:rPr>
-                              <w:t xml:space="preserve"> (AM)</w:t>
-                            </w:r>
-                          </w:p>
-                        </w:txbxContent>
-                      </wps:txbx>
-                      <wps:bodyPr rot="0" spcFirstLastPara="0" vertOverflow="overflow" horzOverflow="overflow" vert="horz" wrap="square" lIns="0" tIns="0" rIns="0" bIns="0" numCol="1" spcCol="0" rtlCol="0" fromWordArt="0" anchor="ctr" anchorCtr="0" forceAA="0" compatLnSpc="1">
-                        <a:prstTxWarp prst="textNoShape">
-                          <a:avLst/>
-                        </a:prstTxWarp>
-                        <a:noAutofit/>
-                      </wps:bodyPr>
-                    </wps:wsp>
-                  </a:graphicData>
-                </a:graphic>
-                <wp14:sizeRelH relativeFrom="margin">
-                  <wp14:pctWidth>0</wp14:pctWidth>
-                </wp14:sizeRelH>
-                <wp14:sizeRelV relativeFrom="margin">
-                  <wp14:pctHeight>0</wp14:pctHeight>
-                </wp14:sizeRelV>
-              </wp:anchor>
-            </w:drawing>
-          </mc:Choice>
-          <mc:Fallback>
-            <w:pict>
-              <v:roundrect w14:anchorId="41530CCC" id="_x0000_s1030" style="position:absolute;left:0;text-align:left;margin-left:216.6pt;margin-top:107.95pt;width:43.2pt;height:43.2pt;z-index:251694080;visibility:visible;mso-wrap-style:square;mso-width-percent:0;mso-height-percent:0;mso-wrap-distance-left:9pt;mso-wrap-distance-top:0;mso-wrap-distance-right:9pt;mso-wrap-distance-bottom:0;mso-position-horizontal:absolute;mso-position-horizontal-relative:text;mso-position-vertical:absolute;mso-position-vertical-relative:text;mso-width-percent:0;mso-height-percent:0;mso-width-relative:margin;mso-height-relative:margin;v-text-anchor:middle" arcsize="10923f" o:gfxdata="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" fillcolor="#4ea72e [3209]" strokecolor="#0b1807 [489]" strokeweight="1pt">
-                <v:stroke joinstyle="miter"/>
-                <v:textbox inset="0,0,0,0">
-                  <w:txbxContent>
-                    <w:p>
-                      <w:pPr>
-                        <w:spacing w:after="0"/>
-                        <w:jc w:val="center"/>
-                        <w:rPr>
-                          <w:b/>
-                          <w:bCs/>
-                          <w:color w:val="000000" w:themeColor="text1"/>
-                          <w14:textOutline w14:w="9525" w14:cap="rnd" w14:cmpd="sng" w14:algn="ctr">
-                            <w14:noFill/>
-                            <w14:prstDash w14:val="solid"/>
-                            <w14:bevel/>
-                          </w14:textOutline>
-                        </w:rPr>
-                      </w:pPr>
-                      <w:r>
-                        <w:rPr>
-                          <w:b/>
-                          <w:bCs/>
-                          <w:color w:val="000000" w:themeColor="text1"/>
-                          <w14:textOutline w14:w="9525" w14:cap="rnd" w14:cmpd="sng" w14:algn="ctr">
-                            <w14:noFill/>
-                            <w14:prstDash w14:val="solid"/>
-                            <w14:bevel/>
-                          </w14:textOutline>
-                        </w:rPr>
-                        <w:t>B</w:t>
-                      </w:r>
-                    </w:p>
-                    <w:p>
-                      <w:pPr>
-                        <w:spacing w:after="0"/>
-                        <w:jc w:val="center"/>
-                        <w:rPr>
-                          <w:color w:val="000000" w:themeColor="text1"/>
-                          <w:sz w:val="14"/>
-                          <w:szCs w:val="14"/>
-                          <w14:textOutline w14:w="9525" w14:cap="rnd" w14:cmpd="sng" w14:algn="ctr">
-                            <w14:noFill/>
-                            <w14:prstDash w14:val="solid"/>
-                            <w14:bevel/>
-                          </w14:textOutline>
-                        </w:rPr>
-                      </w:pPr>
-                      <w:r>
-                        <w:rPr>
-                          <w:color w:val="000000" w:themeColor="text1"/>
-                          <w:sz w:val="14"/>
-                          <w:szCs w:val="14"/>
-                          <w14:textOutline w14:w="9525" w14:cap="rnd" w14:cmpd="sng" w14:algn="ctr">
-                            <w14:noFill/>
-                            <w14:prstDash w14:val="solid"/>
-                            <w14:bevel/>
-                          </w14:textOutline>
-                        </w:rPr>
-                        <w:t>Send</w:t>
-                      </w:r>
-                      <w:r>
-                        <w:rPr>
-                          <w:color w:val="000000" w:themeColor="text1"/>
-                          <w:sz w:val="14"/>
-                          <w:szCs w:val="14"/>
-                          <w14:textOutline w14:w="9525" w14:cap="rnd" w14:cmpd="sng" w14:algn="ctr">
-                            <w14:noFill/>
-                            <w14:prstDash w14:val="solid"/>
-                            <w14:bevel/>
-                          </w14:textOutline>
-                        </w:rPr>
-                        <w:t xml:space="preserve"> Exit Orders</w:t>
-                      </w:r>
-                      <w:r>
-                        <w:rPr>
-                          <w:color w:val="000000" w:themeColor="text1"/>
-                          <w:sz w:val="14"/>
-                          <w:szCs w:val="14"/>
-                          <w14:textOutline w14:w="9525" w14:cap="rnd" w14:cmpd="sng" w14:algn="ctr">
-                            <w14:noFill/>
-                            <w14:prstDash w14:val="solid"/>
-                            <w14:bevel/>
-                          </w14:textOutline>
-                        </w:rPr>
-                        <w:t xml:space="preserve"> (AM)</w:t>
-                      </w:r>
-                    </w:p>
-                  </w:txbxContent>
-                </v:textbox>
-              </v:roundrect>
-            </w:pict>
-          </mc:Fallback>
-        </mc:AlternateContent>
-      </w:r>
-      <w:r>
-        <w:rPr>
-          <w:noProof/>
-        </w:rPr>
-        <mc:AlternateContent>
-          <mc:Choice Requires="wpg">
-            <w:drawing>
-              <wp:anchor distT="0" distB="0" distL="114300" distR="114300" simplePos="0" relativeHeight="251701248" behindDoc="0" locked="0" layoutInCell="1" allowOverlap="1" wp14:anchorId="4A8FF138" wp14:editId="38114DCC">
-                <wp:simplePos x="0" y="0"/>
-                <wp:positionH relativeFrom="column">
-                  <wp:posOffset>3141345</wp:posOffset>
-                </wp:positionH>
-                <wp:positionV relativeFrom="paragraph">
-                  <wp:posOffset>1190625</wp:posOffset>
-                </wp:positionV>
-                <wp:extent cx="314325" cy="914400"/>
-                <wp:effectExtent l="0" t="0" r="9525" b="19050"/>
-                <wp:wrapNone/>
-                <wp:docPr id="1700941268" name="Group 21"/>
-                <wp:cNvGraphicFramePr/>
-                <a:graphic xmlns:a="http://schemas.openxmlformats.org/drawingml/2006/main">
-                  <a:graphicData uri="http://schemas.microsoft.com/office/word/2010/wordprocessingGroup">
-                    <wpg:wgp>
-                      <wpg:cNvGrpSpPr/>
-                      <wpg:grpSpPr>
-                        <a:xfrm>
-                          <a:off x="0" y="0"/>
-                          <a:ext cx="314325" cy="914400"/>
-                          <a:chOff x="0" y="0"/>
-                          <a:chExt cx="314325" cy="914400"/>
-                        </a:xfrm>
-                      </wpg:grpSpPr>
-                      <wps:wsp>
-                        <wps:cNvPr id="1913799266" name="Text Box 9"/>
-                        <wps:cNvSpPr txBox="1"/>
-                        <wps:spPr>
-                          <a:xfrm>
-                            <a:off x="0" y="14630"/>
-                            <a:ext cx="314325" cy="123825"/>
-                          </a:xfrm>
-                          <a:prstGeom prst="rect">
-                            <a:avLst/>
-                          </a:prstGeom>
-                          <a:noFill/>
-                          <a:ln w="6350">
-                            <a:noFill/>
-                          </a:ln>
-                        </wps:spPr>
-                        <wps:txbx>
-                          <w:txbxContent>
-                            <w:p>
-                              <w:pPr>
-                                <w:rPr>
-                                  <w:color w:val="215E99" w:themeColor="text2" w:themeTint="BF"/>
-                                  <w:sz w:val="14"/>
-                                  <w:szCs w:val="14"/>
-                                </w:rPr>
-                              </w:pPr>
-                              <w:r>
-                                <w:rPr>
-                                  <w:color w:val="215E99" w:themeColor="text2" w:themeTint="BF"/>
-                                  <w:sz w:val="14"/>
-                                  <w:szCs w:val="14"/>
-                                </w:rPr>
-                                <w:t>Exit</w:t>
-                              </w:r>
-                            </w:p>
-                          </w:txbxContent>
-                        </wps:txbx>
-                        <wps:bodyPr rot="0" spcFirstLastPara="0" vertOverflow="overflow" horzOverflow="overflow" vert="horz" wrap="square" lIns="0" tIns="0" rIns="0" bIns="0" numCol="1" spcCol="0" rtlCol="0" fromWordArt="0" anchor="t" anchorCtr="0" forceAA="0" compatLnSpc="1">
-                          <a:prstTxWarp prst="textNoShape">
-                            <a:avLst/>
-                          </a:prstTxWarp>
-                          <a:noAutofit/>
-                        </wps:bodyPr>
-                      </wps:wsp>
-                      <wps:wsp>
-                        <wps:cNvPr id="528175533" name="Straight Connector 8"/>
-                        <wps:cNvCnPr/>
-                        <wps:spPr>
-                          <a:xfrm>
-                            <a:off x="197510" y="0"/>
-                            <a:ext cx="0" cy="914400"/>
-                          </a:xfrm>
-                          <a:prstGeom prst="line">
-                            <a:avLst/>
-                          </a:prstGeom>
-                          <a:ln>
-                            <a:solidFill>
-                              <a:schemeClr val="tx2">
-                                <a:lumMod val="75000"/>
-                                <a:lumOff val="25000"/>
-                              </a:schemeClr>
-                            </a:solidFill>
-                            <a:prstDash val="dash"/>
-                          </a:ln>
-                        </wps:spPr>
-                        <wps:style>
-                          <a:lnRef idx="1">
-                            <a:schemeClr val="accent1"/>
-                          </a:lnRef>
-                          <a:fillRef idx="0">
-                            <a:schemeClr val="accent1"/>
-                          </a:fillRef>
-                          <a:effectRef idx="0">
-                            <a:schemeClr val="accent1"/>
-                          </a:effectRef>
-                          <a:fontRef idx="minor">
-                            <a:schemeClr val="tx1"/>
-                          </a:fontRef>
-                        </wps:style>
-                        <wps:bodyPr/>
-                      </wps:wsp>
-                    </wpg:wgp>
-                  </a:graphicData>
-                </a:graphic>
-              </wp:anchor>
-            </w:drawing>
-          </mc:Choice>
-          <mc:Fallback>
-            <w:pict>
-              <v:group w14:anchorId="4A8FF138" id="Group 21" o:spid="_x0000_s1031" style="position:absolute;left:0;text-align:left;margin-left:247.35pt;margin-top:93.75pt;width:24.75pt;height:1in;z-index:251701248" coordsize="3143,9144" o:gfxdata="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">
-                <v:shape id="_x0000_s1032" type="#_x0000_t202" style="position:absolute;top:146;width:3143;height:1238;visibility:visible;mso-wrap-style:square;v-text-anchor:top" o:gfxdata="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" filled="f" stroked="f" strokeweight=".5pt">
-                  <v:textbox inset="0,0,0,0">
-                    <w:txbxContent>
-                      <w:p>
-                        <w:pPr>
-                          <w:rPr>
-                            <w:color w:val="215E99" w:themeColor="text2" w:themeTint="BF"/>
-                            <w:sz w:val="14"/>
-                            <w:szCs w:val="14"/>
-                          </w:rPr>
-                        </w:pPr>
-                        <w:r>
-                          <w:rPr>
-                            <w:color w:val="215E99" w:themeColor="text2" w:themeTint="BF"/>
-                            <w:sz w:val="14"/>
-                            <w:szCs w:val="14"/>
-                          </w:rPr>
-                          <w:t>Exit</w:t>
-                        </w:r>
-                      </w:p>
-                    </w:txbxContent>
-                  </v:textbox>
-                </v:shape>
-                <v:line id="Straight Connector 8" o:spid="_x0000_s1033" style="position:absolute;visibility:visible;mso-wrap-style:square" from="1975,0" to="1975,9144" o:connectortype="straight" o:gfxdata="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" strokecolor="#215e99 [2431]" strokeweight=".5pt">
-                  <v:stroke dashstyle="dash" joinstyle="miter"/>
-                </v:line>
-              </v:group>
-            </w:pict>
-          </mc:Fallback>
-        </mc:AlternateContent>
-      </w:r>
-      <w:r>
-        <w:rPr>
-          <w:noProof/>
-        </w:rPr>
-        <mc:AlternateContent>
-          <mc:Choice Requires="wps">
-            <w:drawing>
-              <wp:anchor distT="0" distB="0" distL="114300" distR="114300" simplePos="0" relativeHeight="251687936" behindDoc="0" locked="0" layoutInCell="1" allowOverlap="1" wp14:anchorId="19243F2D" wp14:editId="090C4DCC">
-                <wp:simplePos x="0" y="0"/>
-                <wp:positionH relativeFrom="column">
-                  <wp:posOffset>3378200</wp:posOffset>
-                </wp:positionH>
-                <wp:positionV relativeFrom="paragraph">
-                  <wp:posOffset>1649095</wp:posOffset>
-                </wp:positionV>
-                <wp:extent cx="274320" cy="0"/>
-                <wp:effectExtent l="0" t="76200" r="11430" b="95250"/>
-                <wp:wrapNone/>
-                <wp:docPr id="846869872" name="Straight Arrow Connector 2"/>
-                <wp:cNvGraphicFramePr/>
-                <a:graphic xmlns:a="http://schemas.openxmlformats.org/drawingml/2006/main">
-                  <a:graphicData uri="http://schemas.microsoft.com/office/word/2010/wordprocessingShape">
-                    <wps:wsp>
-                      <wps:cNvCnPr/>
-                      <wps:spPr>
-                        <a:xfrm>
-                          <a:off x="0" y="0"/>
-                          <a:ext cx="274320" cy="0"/>
-                        </a:xfrm>
-                        <a:prstGeom prst="straightConnector1">
-                          <a:avLst/>
-                        </a:prstGeom>
-                        <a:ln>
-                          <a:solidFill>
-                            <a:schemeClr val="tx1"/>
-                          </a:solidFill>
-                          <a:tailEnd type="triangle"/>
-                        </a:ln>
-                      </wps:spPr>
-                      <wps:style>
-                        <a:lnRef idx="1">
-                          <a:schemeClr val="accent1"/>
-                        </a:lnRef>
-                        <a:fillRef idx="0">
-                          <a:schemeClr val="accent1"/>
-                        </a:fillRef>
-                        <a:effectRef idx="0">
-                          <a:schemeClr val="accent1"/>
-                        </a:effectRef>
-                        <a:fontRef idx="minor">
-                          <a:schemeClr val="tx1"/>
-                        </a:fontRef>
-                      </wps:style>
-                      <wps:bodyPr/>
-                    </wps:wsp>
-                  </a:graphicData>
-                </a:graphic>
-                <wp14:sizeRelH relativeFrom="margin">
-                  <wp14:pctWidth>0</wp14:pctWidth>
-                </wp14:sizeRelH>
-                <wp14:sizeRelV relativeFrom="margin">
-                  <wp14:pctHeight>0</wp14:pctHeight>
-                </wp14:sizeRelV>
-              </wp:anchor>
-            </w:drawing>
-          </mc:Choice>
-          <mc:Fallback>
-            <w:pict>
-              <v:shape w14:anchorId="105BFC68" id="Straight Arrow Connector 2" o:spid="_x0000_s1026" type="#_x0000_t32" style="position:absolute;margin-left:266pt;margin-top:129.85pt;width:21.6pt;height:0;z-index:251687936;visibility:visible;mso-wrap-style:square;mso-width-percent:0;mso-height-percent:0;mso-wrap-distance-left:9pt;mso-wrap-distance-top:0;mso-wrap-distance-right:9pt;mso-wrap-distance-bottom:0;mso-position-horizontal:absolute;mso-position-horizontal-relative:text;mso-position-vertical:absolute;mso-position-vertical-relative:text;mso-width-percent:0;mso-height-percent:0;mso-width-relative:margin;mso-height-relative:margin" o:gfxdata="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" strokecolor="black [3213]" strokeweight=".5pt">
-                <v:stroke endarrow="block" joinstyle="miter"/>
-              </v:shape>
-            </w:pict>
-          </mc:Fallback>
-        </mc:AlternateContent>
-      </w:r>
-      <w:r>
-        <w:rPr>
-          <w:noProof/>
-        </w:rPr>
-        <mc:AlternateContent>
-          <mc:Choice Requires="wps">
-            <w:drawing>
-              <wp:anchor distT="0" distB="0" distL="114300" distR="114300" simplePos="0" relativeHeight="251671552" behindDoc="0" locked="0" layoutInCell="1" allowOverlap="1" wp14:anchorId="39DC5772" wp14:editId="096B507C">
-                <wp:simplePos x="0" y="0"/>
-                <wp:positionH relativeFrom="column">
-                  <wp:posOffset>3670300</wp:posOffset>
-                </wp:positionH>
-                <wp:positionV relativeFrom="paragraph">
-                  <wp:posOffset>1370965</wp:posOffset>
-                </wp:positionV>
-                <wp:extent cx="548640" cy="548640"/>
-                <wp:effectExtent l="0" t="0" r="22860" b="22860"/>
-                <wp:wrapNone/>
-                <wp:docPr id="514764047" name="Rectangle: Rounded Corners 1"/>
-                <wp:cNvGraphicFramePr/>
-                <a:graphic xmlns:a="http://schemas.openxmlformats.org/drawingml/2006/main">
-                  <a:graphicData uri="http://schemas.microsoft.com/office/word/2010/wordprocessingShape">
-                    <wps:wsp>
-                      <wps:cNvSpPr/>
-                      <wps:spPr>
-                        <a:xfrm>
-                          <a:off x="0" y="0"/>
-                          <a:ext cx="548640" cy="548640"/>
-                        </a:xfrm>
-                        <a:prstGeom prst="roundRect">
-                          <a:avLst/>
-                        </a:prstGeom>
-                      </wps:spPr>
-                      <wps:style>
-                        <a:lnRef idx="2">
-                          <a:schemeClr val="accent6">
-                            <a:shade val="15000"/>
-                          </a:schemeClr>
-                        </a:lnRef>
-                        <a:fillRef idx="1">
-                          <a:schemeClr val="accent6"/>
-                        </a:fillRef>
-                        <a:effectRef idx="0">
-                          <a:schemeClr val="accent6"/>
-                        </a:effectRef>
-                        <a:fontRef idx="minor">
-                          <a:schemeClr val="lt1"/>
-                        </a:fontRef>
-                      </wps:style>
-                      <wps:txbx>
-                        <w:txbxContent>
-                          <w:p>
-                            <w:pPr>
-                              <w:spacing w:after="0"/>
-                              <w:jc w:val="center"/>
-                              <w:rPr>
-                                <w:b/>
-                                <w:bCs/>
-                                <w:color w:val="000000" w:themeColor="text1"/>
-                                <w14:textOutline w14:w="9525" w14:cap="rnd" w14:cmpd="sng" w14:algn="ctr">
-                                  <w14:noFill/>
-                                  <w14:prstDash w14:val="solid"/>
-                                  <w14:bevel/>
-                                </w14:textOutline>
-                              </w:rPr>
-                            </w:pPr>
-                            <w:r>
-                              <w:rPr>
-                                <w:b/>
-                                <w:bCs/>
-                                <w:color w:val="000000" w:themeColor="text1"/>
-                                <w14:textOutline w14:w="9525" w14:cap="rnd" w14:cmpd="sng" w14:algn="ctr">
-                                  <w14:noFill/>
-                                  <w14:prstDash w14:val="solid"/>
-                                  <w14:bevel/>
-                                </w14:textOutline>
-                              </w:rPr>
-                              <w:t>C</w:t>
-                            </w:r>
-                          </w:p>
-                          <w:p>
-                            <w:pPr>
-                              <w:spacing w:after="0"/>
-                              <w:jc w:val="center"/>
-                              <w:rPr>
-                                <w:color w:val="000000" w:themeColor="text1"/>
-                                <w:sz w:val="14"/>
-                                <w:szCs w:val="14"/>
-                                <w14:textOutline w14:w="9525" w14:cap="rnd" w14:cmpd="sng" w14:algn="ctr">
-                                  <w14:noFill/>
-                                  <w14:prstDash w14:val="solid"/>
-                                  <w14:bevel/>
-                                </w14:textOutline>
-                              </w:rPr>
-                            </w:pPr>
-                            <w:r>
-                              <w:rPr>
-                                <w:color w:val="000000" w:themeColor="text1"/>
-                                <w:sz w:val="14"/>
-                                <w:szCs w:val="14"/>
-                                <w14:textOutline w14:w="9525" w14:cap="rnd" w14:cmpd="sng" w14:algn="ctr">
-                                  <w14:noFill/>
-                                  <w14:prstDash w14:val="solid"/>
-                                  <w14:bevel/>
-                                </w14:textOutline>
-                              </w:rPr>
-                              <w:t xml:space="preserve">Actualize </w:t>
-                            </w:r>
-                            <w:r>
-                              <w:rPr>
-                                <w:color w:val="000000" w:themeColor="text1"/>
-                                <w:sz w:val="14"/>
-                                <w:szCs w:val="14"/>
-                                <w14:textOutline w14:w="9525" w14:cap="rnd" w14:cmpd="sng" w14:algn="ctr">
-                                  <w14:noFill/>
-                                  <w14:prstDash w14:val="solid"/>
-                                  <w14:bevel/>
-                                </w14:textOutline>
-                              </w:rPr>
-                              <w:t>Exit (</w:t>
-                            </w:r>
-                            <w:r>
-                              <w:rPr>
-                                <w:color w:val="000000" w:themeColor="text1"/>
-                                <w:sz w:val="14"/>
-                                <w:szCs w:val="14"/>
-                                <w14:textOutline w14:w="9525" w14:cap="rnd" w14:cmpd="sng" w14:algn="ctr">
-                                  <w14:noFill/>
-                                  <w14:prstDash w14:val="solid"/>
-                                  <w14:bevel/>
-                                </w14:textOutline>
-                              </w:rPr>
-                              <w:t>Open</w:t>
-                            </w:r>
-                            <w:r>
-                              <w:rPr>
-                                <w:color w:val="000000" w:themeColor="text1"/>
-                                <w:sz w:val="14"/>
-                                <w:szCs w:val="14"/>
-                                <w14:textOutline w14:w="9525" w14:cap="rnd" w14:cmpd="sng" w14:algn="ctr">
-                                  <w14:noFill/>
-                                  <w14:prstDash w14:val="solid"/>
-                                  <w14:bevel/>
-                                </w14:textOutline>
-                              </w:rPr>
-                              <w:t>)</w:t>
-                            </w:r>
-                          </w:p>
-                        </w:txbxContent>
-                      </wps:txbx>
-                      <wps:bodyPr rot="0" spcFirstLastPara="0" vertOverflow="overflow" horzOverflow="overflow" vert="horz" wrap="square" lIns="0" tIns="0" rIns="0" bIns="0" numCol="1" spcCol="0" rtlCol="0" fromWordArt="0" anchor="ctr" anchorCtr="0" forceAA="0" compatLnSpc="1">
-                        <a:prstTxWarp prst="textNoShape">
-                          <a:avLst/>
-                        </a:prstTxWarp>
-                        <a:noAutofit/>
-                      </wps:bodyPr>
-                    </wps:wsp>
-                  </a:graphicData>
-                </a:graphic>
-                <wp14:sizeRelH relativeFrom="margin">
-                  <wp14:pctWidth>0</wp14:pctWidth>
-                </wp14:sizeRelH>
-                <wp14:sizeRelV relativeFrom="margin">
-                  <wp14:pctHeight>0</wp14:pctHeight>
-                </wp14:sizeRelV>
-              </wp:anchor>
-            </w:drawing>
-          </mc:Choice>
-          <mc:Fallback>
-            <w:pict>
-              <v:roundrect w14:anchorId="39DC5772" id="_x0000_s1034" style="position:absolute;left:0;text-align:left;margin-left:289pt;margin-top:107.95pt;width:43.2pt;height:43.2pt;z-index:251671552;visibility:visible;mso-wrap-style:square;mso-width-percent:0;mso-height-percent:0;mso-wrap-distance-left:9pt;mso-wrap-distance-top:0;mso-wrap-distance-right:9pt;mso-wrap-distance-bottom:0;mso-position-horizontal:absolute;mso-position-horizontal-relative:text;mso-position-vertical:absolute;mso-position-vertical-relative:text;mso-width-percent:0;mso-height-percent:0;mso-width-relative:margin;mso-height-relative:margin;v-text-anchor:middle" arcsize="10923f" o:gfxdata="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" fillcolor="#4ea72e [3209]" strokecolor="#0b1807 [489]" strokeweight="1pt">
-                <v:stroke joinstyle="miter"/>
-                <v:textbox inset="0,0,0,0">
-                  <w:txbxContent>
-                    <w:p>
-                      <w:pPr>
-                        <w:spacing w:after="0"/>
-                        <w:jc w:val="center"/>
-                        <w:rPr>
-                          <w:b/>
-                          <w:bCs/>
-                          <w:color w:val="000000" w:themeColor="text1"/>
-                          <w14:textOutline w14:w="9525" w14:cap="rnd" w14:cmpd="sng" w14:algn="ctr">
-                            <w14:noFill/>
-                            <w14:prstDash w14:val="solid"/>
-                            <w14:bevel/>
-                          </w14:textOutline>
-                        </w:rPr>
-                      </w:pPr>
-                      <w:r>
-                        <w:rPr>
-                          <w:b/>
-                          <w:bCs/>
-                          <w:color w:val="000000" w:themeColor="text1"/>
-                          <w14:textOutline w14:w="9525" w14:cap="rnd" w14:cmpd="sng" w14:algn="ctr">
-                            <w14:noFill/>
-                            <w14:prstDash w14:val="solid"/>
-                            <w14:bevel/>
-                          </w14:textOutline>
-                        </w:rPr>
-                        <w:t>C</w:t>
-                      </w:r>
-                    </w:p>
-                    <w:p>
-                      <w:pPr>
-                        <w:spacing w:after="0"/>
-                        <w:jc w:val="center"/>
-                        <w:rPr>
-                          <w:color w:val="000000" w:themeColor="text1"/>
-                          <w:sz w:val="14"/>
-                          <w:szCs w:val="14"/>
-                          <w14:textOutline w14:w="9525" w14:cap="rnd" w14:cmpd="sng" w14:algn="ctr">
-                            <w14:noFill/>
-                            <w14:prstDash w14:val="solid"/>
-                            <w14:bevel/>
-                          </w14:textOutline>
-                        </w:rPr>
-                      </w:pPr>
-                      <w:r>
-                        <w:rPr>
-                          <w:color w:val="000000" w:themeColor="text1"/>
-                          <w:sz w:val="14"/>
-                          <w:szCs w:val="14"/>
-                          <w14:textOutline w14:w="9525" w14:cap="rnd" w14:cmpd="sng" w14:algn="ctr">
-                            <w14:noFill/>
-                            <w14:prstDash w14:val="solid"/>
-                            <w14:bevel/>
-                          </w14:textOutline>
-                        </w:rPr>
-                        <w:t xml:space="preserve">Actualize </w:t>
-                      </w:r>
-                      <w:r>
-                        <w:rPr>
-                          <w:color w:val="000000" w:themeColor="text1"/>
-                          <w:sz w:val="14"/>
-                          <w:szCs w:val="14"/>
-                          <w14:textOutline w14:w="9525" w14:cap="rnd" w14:cmpd="sng" w14:algn="ctr">
-                            <w14:noFill/>
-                            <w14:prstDash w14:val="solid"/>
-                            <w14:bevel/>
-                          </w14:textOutline>
-                        </w:rPr>
-                        <w:t>Exit (</w:t>
-                      </w:r>
-                      <w:r>
-                        <w:rPr>
-                          <w:color w:val="000000" w:themeColor="text1"/>
-                          <w:sz w:val="14"/>
-                          <w:szCs w:val="14"/>
-                          <w14:textOutline w14:w="9525" w14:cap="rnd" w14:cmpd="sng" w14:algn="ctr">
-                            <w14:noFill/>
-                            <w14:prstDash w14:val="solid"/>
-                            <w14:bevel/>
-                          </w14:textOutline>
-                        </w:rPr>
-                        <w:t>Open</w:t>
-                      </w:r>
-                      <w:r>
-                        <w:rPr>
-                          <w:color w:val="000000" w:themeColor="text1"/>
-                          <w:sz w:val="14"/>
-                          <w:szCs w:val="14"/>
-                          <w14:textOutline w14:w="9525" w14:cap="rnd" w14:cmpd="sng" w14:algn="ctr">
-                            <w14:noFill/>
-                            <w14:prstDash w14:val="solid"/>
-                            <w14:bevel/>
-                          </w14:textOutline>
-                        </w:rPr>
-                        <w:t>)</w:t>
-                      </w:r>
-                    </w:p>
-                  </w:txbxContent>
-                </v:textbox>
-              </v:roundrect>
-            </w:pict>
-          </mc:Fallback>
-        </mc:AlternateContent>
+    </w:p>
+    <w:p>
+      <w:pPr>
+        <w:pStyle w:val="ListParagraph"/>
+        <w:rPr>
+          <w:i/>
+          <w:iCs/>
+          <w:sz w:val="22"/>
+          <w:szCs w:val="22"/>
+        </w:rPr>
+      </w:pPr>
+    </w:p>
+    <w:p>
+      <w:pPr>
+        <w:pStyle w:val="ListParagraph"/>
+        <w:rPr>
+          <w:i/>
+          <w:iCs/>
+          <w:sz w:val="22"/>
+          <w:szCs w:val="22"/>
+        </w:rPr>
+      </w:pPr>
+    </w:p>
+    <w:p>
+      <w:pPr>
+        <w:pStyle w:val="ListParagraph"/>
+        <w:rPr>
+          <w:i/>
+          <w:iCs/>
+          <w:sz w:val="22"/>
+          <w:szCs w:val="22"/>
+        </w:rPr>
+      </w:pPr>
+    </w:p>
+    <w:p>
+      <w:pPr>
+        <w:pStyle w:val="ListParagraph"/>
+        <w:rPr>
+          <w:i/>
+          <w:iCs/>
+          <w:sz w:val="22"/>
+          <w:szCs w:val="22"/>
+        </w:rPr>
+      </w:pPr>
+    </w:p>
+    <w:p>
+      <w:pPr>
+        <w:pStyle w:val="ListParagraph"/>
+        <w:rPr>
+          <w:i/>
+          <w:iCs/>
+          <w:sz w:val="22"/>
+          <w:szCs w:val="22"/>
+        </w:rPr>
+      </w:pPr>
+    </w:p>
+    <w:p>
+      <w:pPr>
+        <w:pStyle w:val="ListParagraph"/>
+        <w:rPr>
+          <w:i/>
+          <w:iCs/>
+          <w:sz w:val="22"/>
+          <w:szCs w:val="22"/>
+        </w:rPr>
+      </w:pPr>
+    </w:p>
+    <w:p>
+      <w:pPr>
+        <w:pStyle w:val="ListParagraph"/>
+        <w:rPr>
+          <w:i/>
+          <w:iCs/>
+          <w:sz w:val="22"/>
+          <w:szCs w:val="22"/>
+        </w:rPr>
+      </w:pPr>
+    </w:p>
+    <w:p>
+      <w:pPr>
+        <w:pStyle w:val="ListParagraph"/>
+        <w:ind w:left="0"/>
+        <w:rPr>
+          <w:b/>
+          <w:bCs/>
+          <w:i/>
+          <w:iCs/>
+          <w:sz w:val="18"/>
+          <w:szCs w:val="18"/>
+          <w:u w:val="single"/>
+        </w:rPr>
+      </w:pPr>
+      <w:r>
+        <w:rPr>
+          <w:b/>
+          <w:bCs/>
+          <w:i/>
+          <w:iCs/>
+          <w:sz w:val="18"/>
+          <w:szCs w:val="18"/>
+          <w:u w:val="single"/>
+        </w:rPr>
+        <w:t>Notes:</w:t>
+      </w:r>
+      <w:r>
+        <w:rPr>
+          <w:b/>
+          <w:bCs/>
+          <w:i/>
+          <w:iCs/>
+          <w:sz w:val="18"/>
+          <w:szCs w:val="18"/>
+          <w:u w:val="single"/>
+        </w:rPr>
+        <w:t xml:space="preserve"> ___________________________________________________________________________________________________________________________</w:t>
       </w:r>
     </w:p>
     <w:sectPr>

</xml_diff>

<commit_message>
Removed some user prompts to further automate.
</commit_message>
<xml_diff>
--- a/Admin/Earnings Advantage Work Flow Doc.docx
+++ b/Admin/Earnings Advantage Work Flow Doc.docx
@@ -140,7 +140,30 @@
           <w:sz w:val="22"/>
           <w:szCs w:val="22"/>
         </w:rPr>
-        <w:t>Update earnings date each Friday AMC.</w:t>
+        <w:t xml:space="preserve">Update earnings </w:t>
+      </w:r>
+      <w:proofErr w:type="gramStart"/>
+      <w:r>
+        <w:rPr>
+          <w:sz w:val="22"/>
+          <w:szCs w:val="22"/>
+        </w:rPr>
+        <w:t>date</w:t>
+      </w:r>
+      <w:r>
+        <w:rPr>
+          <w:sz w:val="22"/>
+          <w:szCs w:val="22"/>
+        </w:rPr>
+        <w:t>s</w:t>
+      </w:r>
+      <w:proofErr w:type="gramEnd"/>
+      <w:r>
+        <w:rPr>
+          <w:sz w:val="22"/>
+          <w:szCs w:val="22"/>
+        </w:rPr>
+        <w:t xml:space="preserve"> each Friday AMC.</w:t>
       </w:r>
     </w:p>
     <w:p>
@@ -210,6 +233,37 @@
           <w:numId w:val="8"/>
         </w:numPr>
         <w:rPr>
+          <w:sz w:val="22"/>
+          <w:szCs w:val="22"/>
+        </w:rPr>
+      </w:pPr>
+      <w:r>
+        <w:rPr>
+          <w:sz w:val="22"/>
+          <w:szCs w:val="22"/>
+        </w:rPr>
+        <w:t xml:space="preserve">Run </w:t>
+      </w:r>
+      <w:proofErr w:type="spellStart"/>
+      <w:r>
+        <w:rPr>
+          <w:b/>
+          <w:bCs/>
+          <w:sz w:val="22"/>
+          <w:szCs w:val="22"/>
+        </w:rPr>
+        <w:t>Open_Trades_ToS</w:t>
+      </w:r>
+      <w:proofErr w:type="spellEnd"/>
+    </w:p>
+    <w:p>
+      <w:pPr>
+        <w:pStyle w:val="ListParagraph"/>
+        <w:numPr>
+          <w:ilvl w:val="0"/>
+          <w:numId w:val="8"/>
+        </w:numPr>
+        <w:rPr>
           <w:i/>
           <w:iCs/>
           <w:sz w:val="22"/>
@@ -276,30 +330,18 @@
           <w:sz w:val="22"/>
           <w:szCs w:val="22"/>
         </w:rPr>
-        <w:t>GW</w:t>
+        <w:t>G</w:t>
+      </w:r>
+      <w:r>
+        <w:rPr>
+          <w:b/>
+          <w:bCs/>
+          <w:sz w:val="22"/>
+          <w:szCs w:val="22"/>
+        </w:rPr>
+        <w:t>W</w:t>
       </w:r>
       <w:proofErr w:type="spellEnd"/>
-      <w:r>
-        <w:rPr>
-          <w:sz w:val="22"/>
-          <w:szCs w:val="22"/>
-        </w:rPr>
-        <w:t xml:space="preserve"> to send opening trades </w:t>
-      </w:r>
-      <w:r>
-        <w:rPr>
-          <w:sz w:val="22"/>
-          <w:szCs w:val="22"/>
-        </w:rPr>
-        <w:t>to IB</w:t>
-      </w:r>
-      <w:r>
-        <w:rPr>
-          <w:sz w:val="22"/>
-          <w:szCs w:val="22"/>
-        </w:rPr>
-        <w:t>.</w:t>
-      </w:r>
     </w:p>
     <w:p>
       <w:pPr>
@@ -449,14 +491,14 @@
           <w:sz w:val="22"/>
           <w:szCs w:val="22"/>
         </w:rPr>
-        <w:t>is populated for the live trades</w:t>
-      </w:r>
-      <w:r>
-        <w:rPr>
-          <w:sz w:val="22"/>
-          <w:szCs w:val="22"/>
-        </w:rPr>
-        <w:t xml:space="preserve"> (no range is used).</w:t>
+        <w:t>is populated</w:t>
+      </w:r>
+      <w:r>
+        <w:rPr>
+          <w:sz w:val="22"/>
+          <w:szCs w:val="22"/>
+        </w:rPr>
+        <w:t>.</w:t>
       </w:r>
     </w:p>
     <w:p>
@@ -473,65 +515,38 @@
       </w:pPr>
       <w:r>
         <w:rPr>
+          <w:sz w:val="22"/>
+          <w:szCs w:val="22"/>
+        </w:rPr>
+        <w:t>R</w:t>
+      </w:r>
+      <w:r>
+        <w:rPr>
+          <w:sz w:val="22"/>
+          <w:szCs w:val="22"/>
+        </w:rPr>
+        <w:t xml:space="preserve">un </w:t>
+      </w:r>
+      <w:proofErr w:type="spellStart"/>
+      <w:r>
+        <w:rPr>
           <w:b/>
           <w:bCs/>
           <w:sz w:val="22"/>
           <w:szCs w:val="22"/>
-          <w:u w:val="single"/>
-        </w:rPr>
-        <w:t>Prep:</w:t>
-      </w:r>
-      <w:r>
-        <w:rPr>
-          <w:sz w:val="22"/>
-          <w:szCs w:val="22"/>
-        </w:rPr>
-        <w:t xml:space="preserve"> Ensure</w:t>
-      </w:r>
-      <w:r>
-        <w:rPr>
-          <w:sz w:val="22"/>
-          <w:szCs w:val="22"/>
-        </w:rPr>
-        <w:t xml:space="preserve"> closing order types are correct</w:t>
-      </w:r>
-      <w:r>
-        <w:rPr>
-          <w:sz w:val="22"/>
-          <w:szCs w:val="22"/>
-        </w:rPr>
-        <w:t xml:space="preserve"> </w:t>
-      </w:r>
-      <w:r>
-        <w:rPr>
-          <w:sz w:val="22"/>
-          <w:szCs w:val="22"/>
-        </w:rPr>
-        <w:t>in the Latest Earnings File</w:t>
-      </w:r>
-      <w:r>
-        <w:rPr>
-          <w:sz w:val="22"/>
-          <w:szCs w:val="22"/>
-        </w:rPr>
-        <w:t xml:space="preserve"> (</w:t>
-      </w:r>
-      <w:proofErr w:type="spellStart"/>
-      <w:r>
-        <w:rPr>
+        </w:rPr>
+        <w:t>Exit_</w:t>
+      </w:r>
+      <w:r>
+        <w:rPr>
+          <w:b/>
+          <w:bCs/>
           <w:sz w:val="22"/>
           <w:szCs w:val="22"/>
         </w:rPr>
         <w:t>ToS</w:t>
       </w:r>
       <w:proofErr w:type="spellEnd"/>
-      <w:r>
-        <w:rPr>
-          <w:sz w:val="22"/>
-          <w:szCs w:val="22"/>
-        </w:rPr>
-        <w:t xml:space="preserve"> Only).</w:t>
-      </w:r>
     </w:p>
     <w:p>
       <w:pPr>
@@ -550,54 +565,6 @@
           <w:sz w:val="22"/>
           <w:szCs w:val="22"/>
         </w:rPr>
-        <w:t xml:space="preserve">If not done, </w:t>
-      </w:r>
-      <w:r>
-        <w:rPr>
-          <w:sz w:val="22"/>
-          <w:szCs w:val="22"/>
-        </w:rPr>
-        <w:t xml:space="preserve">Close the </w:t>
-      </w:r>
-      <w:r>
-        <w:rPr>
-          <w:sz w:val="22"/>
-          <w:szCs w:val="22"/>
-        </w:rPr>
-        <w:t xml:space="preserve">Latest Earnings </w:t>
-      </w:r>
-      <w:r>
-        <w:rPr>
-          <w:sz w:val="22"/>
-          <w:szCs w:val="22"/>
-        </w:rPr>
-        <w:t>Document</w:t>
-      </w:r>
-      <w:r>
-        <w:rPr>
-          <w:sz w:val="22"/>
-          <w:szCs w:val="22"/>
-        </w:rPr>
-        <w:t>.</w:t>
-      </w:r>
-    </w:p>
-    <w:p>
-      <w:pPr>
-        <w:pStyle w:val="ListParagraph"/>
-        <w:numPr>
-          <w:ilvl w:val="0"/>
-          <w:numId w:val="13"/>
-        </w:numPr>
-        <w:rPr>
-          <w:sz w:val="22"/>
-          <w:szCs w:val="22"/>
-        </w:rPr>
-      </w:pPr>
-      <w:r>
-        <w:rPr>
-          <w:sz w:val="22"/>
-          <w:szCs w:val="22"/>
-        </w:rPr>
         <w:t>R</w:t>
       </w:r>
       <w:r>
@@ -605,7 +572,7 @@
           <w:sz w:val="22"/>
           <w:szCs w:val="22"/>
         </w:rPr>
-        <w:t xml:space="preserve">un the </w:t>
+        <w:t xml:space="preserve">un </w:t>
       </w:r>
       <w:proofErr w:type="spellStart"/>
       <w:r>
@@ -645,20 +612,6 @@
         <w:t>via_GW</w:t>
       </w:r>
       <w:proofErr w:type="spellEnd"/>
-      <w:r>
-        <w:rPr>
-          <w:sz w:val="22"/>
-          <w:szCs w:val="22"/>
-        </w:rPr>
-        <w:t xml:space="preserve"> script</w:t>
-      </w:r>
-      <w:r>
-        <w:rPr>
-          <w:sz w:val="22"/>
-          <w:szCs w:val="22"/>
-        </w:rPr>
-        <w:t xml:space="preserve"> to send exit order to IB through their Gateway.</w:t>
-      </w:r>
     </w:p>
     <w:p>
       <w:pPr>
@@ -754,30 +707,28 @@
           <w:sz w:val="22"/>
           <w:szCs w:val="22"/>
         </w:rPr>
-        <w:t xml:space="preserve"> Flag </w:t>
-      </w:r>
-      <w:proofErr w:type="gramStart"/>
-      <w:r>
-        <w:rPr>
-          <w:sz w:val="22"/>
-          <w:szCs w:val="22"/>
-        </w:rPr>
-        <w:t>you</w:t>
-      </w:r>
-      <w:proofErr w:type="gramEnd"/>
-      <w:r>
-        <w:rPr>
-          <w:sz w:val="22"/>
-          <w:szCs w:val="22"/>
-        </w:rPr>
-        <w:t xml:space="preserve"> opening price range in the Latest </w:t>
-      </w:r>
-      <w:r>
-        <w:rPr>
-          <w:sz w:val="22"/>
-          <w:szCs w:val="22"/>
-        </w:rPr>
-        <w:t>Earnings Document.</w:t>
+        <w:t xml:space="preserve"> Flag you</w:t>
+      </w:r>
+      <w:r>
+        <w:rPr>
+          <w:sz w:val="22"/>
+          <w:szCs w:val="22"/>
+        </w:rPr>
+        <w:t>r</w:t>
+      </w:r>
+      <w:r>
+        <w:rPr>
+          <w:sz w:val="22"/>
+          <w:szCs w:val="22"/>
+        </w:rPr>
+        <w:t xml:space="preserve"> opening price range</w:t>
+      </w:r>
+      <w:r>
+        <w:rPr>
+          <w:sz w:val="22"/>
+          <w:szCs w:val="22"/>
+        </w:rPr>
+        <w:t>.</w:t>
       </w:r>
     </w:p>
     <w:p>
@@ -828,75 +779,6 @@
         <w:t>IB</w:t>
       </w:r>
       <w:proofErr w:type="spellEnd"/>
-      <w:r>
-        <w:rPr>
-          <w:b/>
-          <w:bCs/>
-          <w:sz w:val="22"/>
-          <w:szCs w:val="22"/>
-        </w:rPr>
-        <w:t xml:space="preserve"> </w:t>
-      </w:r>
-      <w:r>
-        <w:rPr>
-          <w:sz w:val="22"/>
-          <w:szCs w:val="22"/>
-        </w:rPr>
-        <w:t xml:space="preserve">to </w:t>
-      </w:r>
-      <w:r>
-        <w:rPr>
-          <w:sz w:val="22"/>
-          <w:szCs w:val="22"/>
-        </w:rPr>
-        <w:t>write</w:t>
-      </w:r>
-      <w:r>
-        <w:rPr>
-          <w:sz w:val="22"/>
-          <w:szCs w:val="22"/>
-        </w:rPr>
-        <w:t xml:space="preserve"> opening prices</w:t>
-      </w:r>
-      <w:r>
-        <w:rPr>
-          <w:sz w:val="22"/>
-          <w:szCs w:val="22"/>
-        </w:rPr>
-        <w:t xml:space="preserve"> in</w:t>
-      </w:r>
-      <w:r>
-        <w:rPr>
-          <w:sz w:val="22"/>
-          <w:szCs w:val="22"/>
-        </w:rPr>
-        <w:t>to</w:t>
-      </w:r>
-      <w:r>
-        <w:rPr>
-          <w:sz w:val="22"/>
-          <w:szCs w:val="22"/>
-        </w:rPr>
-        <w:t xml:space="preserve"> </w:t>
-      </w:r>
-      <w:r>
-        <w:rPr>
-          <w:b/>
-          <w:bCs/>
-          <w:i/>
-          <w:iCs/>
-          <w:sz w:val="22"/>
-          <w:szCs w:val="22"/>
-        </w:rPr>
-        <w:t>Col. T</w:t>
-      </w:r>
-      <w:r>
-        <w:rPr>
-          <w:sz w:val="22"/>
-          <w:szCs w:val="22"/>
-        </w:rPr>
-        <w:t>.</w:t>
-      </w:r>
     </w:p>
     <w:p>
       <w:pPr>
@@ -1085,13 +967,6 @@
         <w:t>IB</w:t>
       </w:r>
       <w:proofErr w:type="spellEnd"/>
-      <w:r>
-        <w:rPr>
-          <w:sz w:val="22"/>
-          <w:szCs w:val="22"/>
-        </w:rPr>
-        <w:t>, then update your closing ranges.</w:t>
-      </w:r>
     </w:p>
     <w:p>
       <w:pPr>
@@ -1164,13 +1039,15 @@
         <w:pStyle w:val="ListParagraph"/>
         <w:numPr>
           <w:ilvl w:val="0"/>
-          <w:numId w:val="15"/>
+          <w:numId w:val="17"/>
         </w:numPr>
-        <w:rPr>
-          <w:sz w:val="22"/>
-          <w:szCs w:val="22"/>
-        </w:rPr>
-      </w:pPr>
+        <w:ind w:left="540"/>
+        <w:rPr>
+          <w:sz w:val="22"/>
+          <w:szCs w:val="22"/>
+        </w:rPr>
+      </w:pPr>
+      <w:proofErr w:type="spellStart"/>
       <w:r>
         <w:rPr>
           <w:b/>
@@ -1179,14 +1056,59 @@
           <w:szCs w:val="22"/>
           <w:u w:val="single"/>
         </w:rPr>
-        <w:t>Prep:</w:t>
-      </w:r>
-      <w:r>
-        <w:rPr>
-          <w:sz w:val="22"/>
-          <w:szCs w:val="22"/>
-        </w:rPr>
-        <w:t xml:space="preserve">  Flag all trades to be taken with a “T”.</w:t>
+        <w:t>Prereq</w:t>
+      </w:r>
+      <w:proofErr w:type="spellEnd"/>
+      <w:proofErr w:type="gramStart"/>
+      <w:r>
+        <w:rPr>
+          <w:b/>
+          <w:bCs/>
+          <w:sz w:val="22"/>
+          <w:szCs w:val="22"/>
+          <w:u w:val="single"/>
+        </w:rPr>
+        <w:t>:</w:t>
+      </w:r>
+      <w:r>
+        <w:rPr>
+          <w:sz w:val="22"/>
+          <w:szCs w:val="22"/>
+        </w:rPr>
+        <w:t xml:space="preserve">  Exit</w:t>
+      </w:r>
+      <w:proofErr w:type="gramEnd"/>
+      <w:r>
+        <w:rPr>
+          <w:sz w:val="22"/>
+          <w:szCs w:val="22"/>
+        </w:rPr>
+        <w:t xml:space="preserve"> orders for open </w:t>
+      </w:r>
+      <w:proofErr w:type="gramStart"/>
+      <w:r>
+        <w:rPr>
+          <w:sz w:val="22"/>
+          <w:szCs w:val="22"/>
+        </w:rPr>
+        <w:t>p[</w:t>
+      </w:r>
+      <w:proofErr w:type="spellStart"/>
+      <w:proofErr w:type="gramEnd"/>
+      <w:r>
+        <w:rPr>
+          <w:sz w:val="22"/>
+          <w:szCs w:val="22"/>
+        </w:rPr>
+        <w:t>osition</w:t>
+      </w:r>
+      <w:proofErr w:type="spellEnd"/>
+      <w:r>
+        <w:rPr>
+          <w:sz w:val="22"/>
+          <w:szCs w:val="22"/>
+        </w:rPr>
+        <w:t xml:space="preserve"> must be sent first for the day.</w:t>
       </w:r>
     </w:p>
     <w:p>
@@ -1203,31 +1125,20 @@
       </w:pPr>
       <w:r>
         <w:rPr>
-          <w:sz w:val="22"/>
-          <w:szCs w:val="22"/>
-        </w:rPr>
-        <w:t>Select</w:t>
-      </w:r>
-      <w:r>
-        <w:rPr>
-          <w:sz w:val="22"/>
-          <w:szCs w:val="22"/>
-        </w:rPr>
-        <w:t xml:space="preserve"> the trend classificatio</w:t>
-      </w:r>
-      <w:r>
-        <w:rPr>
-          <w:sz w:val="22"/>
-          <w:szCs w:val="22"/>
-        </w:rPr>
-        <w:t>n</w:t>
-      </w:r>
-      <w:r>
-        <w:rPr>
-          <w:sz w:val="22"/>
-          <w:szCs w:val="22"/>
-        </w:rPr>
-        <w:t>.</w:t>
+          <w:b/>
+          <w:bCs/>
+          <w:sz w:val="22"/>
+          <w:szCs w:val="22"/>
+          <w:u w:val="single"/>
+        </w:rPr>
+        <w:t>Prep:</w:t>
+      </w:r>
+      <w:r>
+        <w:rPr>
+          <w:sz w:val="22"/>
+          <w:szCs w:val="22"/>
+        </w:rPr>
+        <w:t xml:space="preserve"> Flag all trades with a “T”.</w:t>
       </w:r>
     </w:p>
     <w:p>
@@ -1238,6 +1149,64 @@
           <w:numId w:val="15"/>
         </w:numPr>
         <w:rPr>
+          <w:sz w:val="22"/>
+          <w:szCs w:val="22"/>
+        </w:rPr>
+      </w:pPr>
+      <w:r>
+        <w:rPr>
+          <w:b/>
+          <w:bCs/>
+          <w:sz w:val="22"/>
+          <w:szCs w:val="22"/>
+          <w:u w:val="single"/>
+        </w:rPr>
+        <w:t>Prep:</w:t>
+      </w:r>
+      <w:r>
+        <w:rPr>
+          <w:sz w:val="22"/>
+          <w:szCs w:val="22"/>
+        </w:rPr>
+        <w:t xml:space="preserve"> </w:t>
+      </w:r>
+      <w:r>
+        <w:rPr>
+          <w:sz w:val="22"/>
+          <w:szCs w:val="22"/>
+        </w:rPr>
+        <w:t>Select</w:t>
+      </w:r>
+      <w:r>
+        <w:rPr>
+          <w:sz w:val="22"/>
+          <w:szCs w:val="22"/>
+        </w:rPr>
+        <w:t xml:space="preserve"> the trend classificatio</w:t>
+      </w:r>
+      <w:r>
+        <w:rPr>
+          <w:sz w:val="22"/>
+          <w:szCs w:val="22"/>
+        </w:rPr>
+        <w:t>n</w:t>
+      </w:r>
+      <w:r>
+        <w:rPr>
+          <w:sz w:val="22"/>
+          <w:szCs w:val="22"/>
+        </w:rPr>
+        <w:t>.</w:t>
+      </w:r>
+    </w:p>
+    <w:p>
+      <w:pPr>
+        <w:pStyle w:val="ListParagraph"/>
+        <w:numPr>
+          <w:ilvl w:val="0"/>
+          <w:numId w:val="15"/>
+        </w:numPr>
+        <w:rPr>
           <w:i/>
           <w:iCs/>
           <w:sz w:val="22"/>
@@ -1304,17 +1273,6 @@
         </w:rPr>
         <w:t>the next batch of trades.</w:t>
       </w:r>
-    </w:p>
-    <w:p>
-      <w:pPr>
-        <w:pStyle w:val="ListParagraph"/>
-        <w:rPr>
-          <w:i/>
-          <w:iCs/>
-          <w:sz w:val="22"/>
-          <w:szCs w:val="22"/>
-        </w:rPr>
-      </w:pPr>
     </w:p>
     <w:p>
       <w:pPr>
@@ -1333,13 +1291,13 @@
         <mc:AlternateContent>
           <mc:Choice Requires="wps">
             <w:drawing>
-              <wp:anchor distT="0" distB="0" distL="114300" distR="114300" simplePos="0" relativeHeight="251671552" behindDoc="0" locked="0" layoutInCell="1" allowOverlap="1" wp14:anchorId="39DC5772" wp14:editId="47A4E342">
+              <wp:anchor distT="0" distB="0" distL="114300" distR="114300" simplePos="0" relativeHeight="251671552" behindDoc="0" locked="0" layoutInCell="1" allowOverlap="1" wp14:anchorId="39DC5772" wp14:editId="67F0B8FB">
                 <wp:simplePos x="0" y="0"/>
                 <wp:positionH relativeFrom="column">
                   <wp:posOffset>3571875</wp:posOffset>
                 </wp:positionH>
                 <wp:positionV relativeFrom="paragraph">
-                  <wp:posOffset>259715</wp:posOffset>
+                  <wp:posOffset>396240</wp:posOffset>
                 </wp:positionV>
                 <wp:extent cx="548640" cy="548640"/>
                 <wp:effectExtent l="0" t="0" r="22860" b="22860"/>
@@ -1496,7 +1454,7 @@
           </mc:Choice>
           <mc:Fallback>
             <w:pict>
-              <v:roundrect w14:anchorId="39DC5772" id="Rectangle: Rounded Corners 1" o:spid="_x0000_s1026" style="position:absolute;left:0;text-align:left;margin-left:281.25pt;margin-top:20.45pt;width:43.2pt;height:43.2pt;z-index:251671552;visibility:visible;mso-wrap-style:square;mso-width-percent:0;mso-height-percent:0;mso-wrap-distance-left:9pt;mso-wrap-distance-top:0;mso-wrap-distance-right:9pt;mso-wrap-distance-bottom:0;mso-position-horizontal:absolute;mso-position-horizontal-relative:text;mso-position-vertical:absolute;mso-position-vertical-relative:text;mso-width-percent:0;mso-height-percent:0;mso-width-relative:margin;mso-height-relative:margin;v-text-anchor:middle" arcsize="10923f" o:gfxdata="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" fillcolor="#4ea72e [3209]" strokecolor="#0b1807 [489]" strokeweight="1pt">
+              <v:roundrect w14:anchorId="39DC5772" id="Rectangle: Rounded Corners 1" o:spid="_x0000_s1026" style="position:absolute;left:0;text-align:left;margin-left:281.25pt;margin-top:31.2pt;width:43.2pt;height:43.2pt;z-index:251671552;visibility:visible;mso-wrap-style:square;mso-width-percent:0;mso-height-percent:0;mso-wrap-distance-left:9pt;mso-wrap-distance-top:0;mso-wrap-distance-right:9pt;mso-wrap-distance-bottom:0;mso-position-horizontal:absolute;mso-position-horizontal-relative:text;mso-position-vertical:absolute;mso-position-vertical-relative:text;mso-width-percent:0;mso-height-percent:0;mso-width-relative:margin;mso-height-relative:margin;v-text-anchor:middle" arcsize="10923f" o:gfxdata="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" fillcolor="#4ea72e [3209]" strokecolor="#0b1807 [489]" strokeweight="1pt">
                 <v:stroke joinstyle="miter"/>
                 <v:textbox inset="0,0,0,0">
                   <w:txbxContent>
@@ -1611,13 +1569,13 @@
         <mc:AlternateContent>
           <mc:Choice Requires="wps">
             <w:drawing>
-              <wp:anchor distT="0" distB="0" distL="114300" distR="114300" simplePos="0" relativeHeight="251687936" behindDoc="0" locked="0" layoutInCell="1" allowOverlap="1" wp14:anchorId="19243F2D" wp14:editId="0621541F">
+              <wp:anchor distT="0" distB="0" distL="114300" distR="114300" simplePos="0" relativeHeight="251687936" behindDoc="0" locked="0" layoutInCell="1" allowOverlap="1" wp14:anchorId="19243F2D" wp14:editId="3431720A">
                 <wp:simplePos x="0" y="0"/>
                 <wp:positionH relativeFrom="column">
                   <wp:posOffset>3279775</wp:posOffset>
                 </wp:positionH>
                 <wp:positionV relativeFrom="paragraph">
-                  <wp:posOffset>537845</wp:posOffset>
+                  <wp:posOffset>674370</wp:posOffset>
                 </wp:positionV>
                 <wp:extent cx="274320" cy="0"/>
                 <wp:effectExtent l="0" t="76200" r="11430" b="95250"/>
@@ -1672,11 +1630,11 @@
           </mc:Choice>
           <mc:Fallback>
             <w:pict>
-              <v:shapetype w14:anchorId="651C060B" id="_x0000_t32" coordsize="21600,21600" o:spt="32" o:oned="t" path="m,l21600,21600e" filled="f">
+              <v:shapetype w14:anchorId="55BD2EE2" id="_x0000_t32" coordsize="21600,21600" o:spt="32" o:oned="t" path="m,l21600,21600e" filled="f">
                 <v:path arrowok="t" fillok="f" o:connecttype="none"/>
                 <o:lock v:ext="edit" shapetype="t"/>
               </v:shapetype>
-              <v:shape id="Straight Arrow Connector 2" o:spid="_x0000_s1026" type="#_x0000_t32" style="position:absolute;margin-left:258.25pt;margin-top:42.35pt;width:21.6pt;height:0;z-index:251687936;visibility:visible;mso-wrap-style:square;mso-width-percent:0;mso-height-percent:0;mso-wrap-distance-left:9pt;mso-wrap-distance-top:0;mso-wrap-distance-right:9pt;mso-wrap-distance-bottom:0;mso-position-horizontal:absolute;mso-position-horizontal-relative:text;mso-position-vertical:absolute;mso-position-vertical-relative:text;mso-width-percent:0;mso-height-percent:0;mso-width-relative:margin;mso-height-relative:margin" o:gfxdata="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" strokecolor="black [3213]" strokeweight=".5pt">
+              <v:shape id="Straight Arrow Connector 2" o:spid="_x0000_s1026" type="#_x0000_t32" style="position:absolute;margin-left:258.25pt;margin-top:53.1pt;width:21.6pt;height:0;z-index:251687936;visibility:visible;mso-wrap-style:square;mso-width-percent:0;mso-height-percent:0;mso-wrap-distance-left:9pt;mso-wrap-distance-top:0;mso-wrap-distance-right:9pt;mso-wrap-distance-bottom:0;mso-position-horizontal:absolute;mso-position-horizontal-relative:text;mso-position-vertical:absolute;mso-position-vertical-relative:text;mso-width-percent:0;mso-height-percent:0;mso-width-relative:margin;mso-height-relative:margin" o:gfxdata="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" strokecolor="black [3213]" strokeweight=".5pt">
                 <v:stroke endarrow="block" joinstyle="miter"/>
               </v:shape>
             </w:pict>
@@ -1690,13 +1648,13 @@
         <mc:AlternateContent>
           <mc:Choice Requires="wpg">
             <w:drawing>
-              <wp:anchor distT="0" distB="0" distL="114300" distR="114300" simplePos="0" relativeHeight="251701248" behindDoc="0" locked="0" layoutInCell="1" allowOverlap="1" wp14:anchorId="4A8FF138" wp14:editId="11ABC7EC">
+              <wp:anchor distT="0" distB="0" distL="114300" distR="114300" simplePos="0" relativeHeight="251701248" behindDoc="0" locked="0" layoutInCell="1" allowOverlap="1" wp14:anchorId="4A8FF138" wp14:editId="6CD4A100">
                 <wp:simplePos x="0" y="0"/>
                 <wp:positionH relativeFrom="column">
                   <wp:posOffset>3042920</wp:posOffset>
                 </wp:positionH>
                 <wp:positionV relativeFrom="paragraph">
-                  <wp:posOffset>79375</wp:posOffset>
+                  <wp:posOffset>215900</wp:posOffset>
                 </wp:positionV>
                 <wp:extent cx="314325" cy="914400"/>
                 <wp:effectExtent l="0" t="0" r="9525" b="19050"/>
@@ -1804,7 +1762,7 @@
           </mc:Choice>
           <mc:Fallback>
             <w:pict>
-              <v:group w14:anchorId="4A8FF138" id="Group 21" o:spid="_x0000_s1027" style="position:absolute;left:0;text-align:left;margin-left:239.6pt;margin-top:6.25pt;width:24.75pt;height:1in;z-index:251701248" coordsize="3143,9144" o:gfxdata="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">
+              <v:group w14:anchorId="4A8FF138" id="Group 21" o:spid="_x0000_s1027" style="position:absolute;left:0;text-align:left;margin-left:239.6pt;margin-top:17pt;width:24.75pt;height:1in;z-index:251701248" coordsize="3143,9144" o:gfxdata="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">
                 <v:shapetype id="_x0000_t202" coordsize="21600,21600" o:spt="202" path="m,l,21600r21600,l21600,xe">
                   <v:stroke joinstyle="miter"/>
                   <v:path gradientshapeok="t" o:connecttype="rect"/>
@@ -1847,13 +1805,13 @@
         <mc:AlternateContent>
           <mc:Choice Requires="wps">
             <w:drawing>
-              <wp:anchor distT="0" distB="0" distL="114300" distR="114300" simplePos="0" relativeHeight="251694080" behindDoc="0" locked="0" layoutInCell="1" allowOverlap="1" wp14:anchorId="41530CCC" wp14:editId="185F0E14">
+              <wp:anchor distT="0" distB="0" distL="114300" distR="114300" simplePos="0" relativeHeight="251694080" behindDoc="0" locked="0" layoutInCell="1" allowOverlap="1" wp14:anchorId="41530CCC" wp14:editId="667D37DA">
                 <wp:simplePos x="0" y="0"/>
                 <wp:positionH relativeFrom="column">
                   <wp:posOffset>2652395</wp:posOffset>
                 </wp:positionH>
                 <wp:positionV relativeFrom="paragraph">
-                  <wp:posOffset>259715</wp:posOffset>
+                  <wp:posOffset>396240</wp:posOffset>
                 </wp:positionV>
                 <wp:extent cx="548640" cy="548640"/>
                 <wp:effectExtent l="0" t="0" r="22860" b="22860"/>
@@ -1946,7 +1904,7 @@
                                   <w14:bevel/>
                                 </w14:textOutline>
                               </w:rPr>
-                              <w:t>Send</w:t>
+                              <w:t>Place</w:t>
                             </w:r>
                             <w:r>
                               <w:rPr>
@@ -1960,19 +1918,6 @@
                                 </w14:textOutline>
                               </w:rPr>
                               <w:t xml:space="preserve"> Exit Orders</w:t>
-                            </w:r>
-                            <w:r>
-                              <w:rPr>
-                                <w:color w:val="000000" w:themeColor="text1"/>
-                                <w:sz w:val="14"/>
-                                <w:szCs w:val="14"/>
-                                <w14:textOutline w14:w="9525" w14:cap="rnd" w14:cmpd="sng" w14:algn="ctr">
-                                  <w14:noFill/>
-                                  <w14:prstDash w14:val="solid"/>
-                                  <w14:bevel/>
-                                </w14:textOutline>
-                              </w:rPr>
-                              <w:t xml:space="preserve"> (AM)</w:t>
                             </w:r>
                           </w:p>
                         </w:txbxContent>
@@ -1997,7 +1942,7 @@
           </mc:Choice>
           <mc:Fallback>
             <w:pict>
-              <v:roundrect w14:anchorId="41530CCC" id="_x0000_s1030" style="position:absolute;left:0;text-align:left;margin-left:208.85pt;margin-top:20.45pt;width:43.2pt;height:43.2pt;z-index:251694080;visibility:visible;mso-wrap-style:square;mso-width-percent:0;mso-height-percent:0;mso-wrap-distance-left:9pt;mso-wrap-distance-top:0;mso-wrap-distance-right:9pt;mso-wrap-distance-bottom:0;mso-position-horizontal:absolute;mso-position-horizontal-relative:text;mso-position-vertical:absolute;mso-position-vertical-relative:text;mso-width-percent:0;mso-height-percent:0;mso-width-relative:margin;mso-height-relative:margin;v-text-anchor:middle" arcsize="10923f" o:gfxdata="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" fillcolor="#4ea72e [3209]" strokecolor="#0b1807 [489]" strokeweight="1pt">
+              <v:roundrect w14:anchorId="41530CCC" id="_x0000_s1030" style="position:absolute;left:0;text-align:left;margin-left:208.85pt;margin-top:31.2pt;width:43.2pt;height:43.2pt;z-index:251694080;visibility:visible;mso-wrap-style:square;mso-width-percent:0;mso-height-percent:0;mso-wrap-distance-left:9pt;mso-wrap-distance-top:0;mso-wrap-distance-right:9pt;mso-wrap-distance-bottom:0;mso-position-horizontal:absolute;mso-position-horizontal-relative:text;mso-position-vertical:absolute;mso-position-vertical-relative:text;mso-width-percent:0;mso-height-percent:0;mso-width-relative:margin;mso-height-relative:margin;v-text-anchor:middle" arcsize="10923f" o:gfxdata="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" fillcolor="#4ea72e [3209]" strokecolor="#0b1807 [489]" strokeweight="1pt">
                 <v:stroke joinstyle="miter"/>
                 <v:textbox inset="0,0,0,0">
                   <w:txbxContent>
@@ -2056,7 +2001,7 @@
                             <w14:bevel/>
                           </w14:textOutline>
                         </w:rPr>
-                        <w:t>Send</w:t>
+                        <w:t>Place</w:t>
                       </w:r>
                       <w:r>
                         <w:rPr>
@@ -2071,19 +2016,6 @@
                         </w:rPr>
                         <w:t xml:space="preserve"> Exit Orders</w:t>
                       </w:r>
-                      <w:r>
-                        <w:rPr>
-                          <w:color w:val="000000" w:themeColor="text1"/>
-                          <w:sz w:val="14"/>
-                          <w:szCs w:val="14"/>
-                          <w14:textOutline w14:w="9525" w14:cap="rnd" w14:cmpd="sng" w14:algn="ctr">
-                            <w14:noFill/>
-                            <w14:prstDash w14:val="solid"/>
-                            <w14:bevel/>
-                          </w14:textOutline>
-                        </w:rPr>
-                        <w:t xml:space="preserve"> (AM)</w:t>
-                      </w:r>
                     </w:p>
                   </w:txbxContent>
                 </v:textbox>
@@ -2099,13 +2031,13 @@
         <mc:AlternateContent>
           <mc:Choice Requires="wps">
             <w:drawing>
-              <wp:anchor distT="0" distB="0" distL="114300" distR="114300" simplePos="0" relativeHeight="251677696" behindDoc="0" locked="0" layoutInCell="1" allowOverlap="1" wp14:anchorId="57F13C5B" wp14:editId="398E04E8">
+              <wp:anchor distT="0" distB="0" distL="114300" distR="114300" simplePos="0" relativeHeight="251677696" behindDoc="0" locked="0" layoutInCell="1" allowOverlap="1" wp14:anchorId="57F13C5B" wp14:editId="3647405E">
                 <wp:simplePos x="0" y="0"/>
                 <wp:positionH relativeFrom="column">
                   <wp:posOffset>800100</wp:posOffset>
                 </wp:positionH>
                 <wp:positionV relativeFrom="paragraph">
-                  <wp:posOffset>260350</wp:posOffset>
+                  <wp:posOffset>396875</wp:posOffset>
                 </wp:positionV>
                 <wp:extent cx="548640" cy="548640"/>
                 <wp:effectExtent l="0" t="0" r="22860" b="22860"/>
@@ -2278,7 +2210,7 @@
           </mc:Choice>
           <mc:Fallback>
             <w:pict>
-              <v:roundrect w14:anchorId="57F13C5B" id="_x0000_s1031" style="position:absolute;left:0;text-align:left;margin-left:63pt;margin-top:20.5pt;width:43.2pt;height:43.2pt;z-index:251677696;visibility:visible;mso-wrap-style:square;mso-width-percent:0;mso-height-percent:0;mso-wrap-distance-left:9pt;mso-wrap-distance-top:0;mso-wrap-distance-right:9pt;mso-wrap-distance-bottom:0;mso-position-horizontal:absolute;mso-position-horizontal-relative:text;mso-position-vertical:absolute;mso-position-vertical-relative:text;mso-width-percent:0;mso-height-percent:0;mso-width-relative:margin;mso-height-relative:margin;v-text-anchor:middle" arcsize="10923f" o:gfxdata="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" fillcolor="#4ea72e [3209]" strokecolor="#0b1807 [489]" strokeweight="1pt">
+              <v:roundrect w14:anchorId="57F13C5B" id="_x0000_s1031" style="position:absolute;left:0;text-align:left;margin-left:63pt;margin-top:31.25pt;width:43.2pt;height:43.2pt;z-index:251677696;visibility:visible;mso-wrap-style:square;mso-width-percent:0;mso-height-percent:0;mso-wrap-distance-left:9pt;mso-wrap-distance-top:0;mso-wrap-distance-right:9pt;mso-wrap-distance-bottom:0;mso-position-horizontal:absolute;mso-position-horizontal-relative:text;mso-position-vertical:absolute;mso-position-vertical-relative:text;mso-width-percent:0;mso-height-percent:0;mso-width-relative:margin;mso-height-relative:margin;v-text-anchor:middle" arcsize="10923f" o:gfxdata="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" fillcolor="#4ea72e [3209]" strokecolor="#0b1807 [489]" strokeweight="1pt">
                 <v:stroke joinstyle="miter"/>
                 <v:textbox inset="0,0,0,0">
                   <w:txbxContent>
@@ -2409,13 +2341,13 @@
         <mc:AlternateContent>
           <mc:Choice Requires="wps">
             <w:drawing>
-              <wp:anchor distT="0" distB="0" distL="114300" distR="114300" simplePos="0" relativeHeight="251683840" behindDoc="0" locked="0" layoutInCell="1" allowOverlap="1" wp14:anchorId="1AFC1A49" wp14:editId="1EBFA79D">
+              <wp:anchor distT="0" distB="0" distL="114300" distR="114300" simplePos="0" relativeHeight="251683840" behindDoc="0" locked="0" layoutInCell="1" allowOverlap="1" wp14:anchorId="1AFC1A49" wp14:editId="401D11F8">
                 <wp:simplePos x="0" y="0"/>
                 <wp:positionH relativeFrom="column">
                   <wp:posOffset>1386840</wp:posOffset>
                 </wp:positionH>
                 <wp:positionV relativeFrom="paragraph">
-                  <wp:posOffset>534035</wp:posOffset>
+                  <wp:posOffset>670560</wp:posOffset>
                 </wp:positionV>
                 <wp:extent cx="274320" cy="0"/>
                 <wp:effectExtent l="0" t="76200" r="11430" b="95250"/>
@@ -2470,7 +2402,7 @@
           </mc:Choice>
           <mc:Fallback>
             <w:pict>
-              <v:shape w14:anchorId="53FD0892" id="Straight Arrow Connector 2" o:spid="_x0000_s1026" type="#_x0000_t32" style="position:absolute;margin-left:109.2pt;margin-top:42.05pt;width:21.6pt;height:0;z-index:251683840;visibility:visible;mso-wrap-style:square;mso-width-percent:0;mso-height-percent:0;mso-wrap-distance-left:9pt;mso-wrap-distance-top:0;mso-wrap-distance-right:9pt;mso-wrap-distance-bottom:0;mso-position-horizontal:absolute;mso-position-horizontal-relative:text;mso-position-vertical:absolute;mso-position-vertical-relative:text;mso-width-percent:0;mso-height-percent:0;mso-width-relative:margin;mso-height-relative:margin" o:gfxdata="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" strokecolor="black [3213]" strokeweight=".5pt">
+              <v:shape w14:anchorId="0FF162E6" id="Straight Arrow Connector 2" o:spid="_x0000_s1026" type="#_x0000_t32" style="position:absolute;margin-left:109.2pt;margin-top:52.8pt;width:21.6pt;height:0;z-index:251683840;visibility:visible;mso-wrap-style:square;mso-width-percent:0;mso-height-percent:0;mso-wrap-distance-left:9pt;mso-wrap-distance-top:0;mso-wrap-distance-right:9pt;mso-wrap-distance-bottom:0;mso-position-horizontal:absolute;mso-position-horizontal-relative:text;mso-position-vertical:absolute;mso-position-vertical-relative:text;mso-width-percent:0;mso-height-percent:0;mso-width-relative:margin;mso-height-relative:margin" o:gfxdata="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" strokecolor="black [3213]" strokeweight=".5pt">
                 <v:stroke endarrow="block" joinstyle="miter"/>
               </v:shape>
             </w:pict>
@@ -2484,13 +2416,13 @@
         <mc:AlternateContent>
           <mc:Choice Requires="wps">
             <w:drawing>
-              <wp:anchor distT="0" distB="0" distL="114300" distR="114300" simplePos="0" relativeHeight="251667456" behindDoc="0" locked="0" layoutInCell="1" allowOverlap="1" wp14:anchorId="5BB26D04" wp14:editId="2567EB6E">
+              <wp:anchor distT="0" distB="0" distL="114300" distR="114300" simplePos="0" relativeHeight="251667456" behindDoc="0" locked="0" layoutInCell="1" allowOverlap="1" wp14:anchorId="5BB26D04" wp14:editId="4596AAA3">
                 <wp:simplePos x="0" y="0"/>
                 <wp:positionH relativeFrom="column">
                   <wp:posOffset>1717675</wp:posOffset>
                 </wp:positionH>
                 <wp:positionV relativeFrom="paragraph">
-                  <wp:posOffset>257810</wp:posOffset>
+                  <wp:posOffset>394335</wp:posOffset>
                 </wp:positionV>
                 <wp:extent cx="548640" cy="548640"/>
                 <wp:effectExtent l="0" t="0" r="22860" b="22860"/>
@@ -2583,7 +2515,20 @@
                                   <w14:bevel/>
                                 </w14:textOutline>
                               </w:rPr>
-                              <w:t xml:space="preserve">Send </w:t>
+                              <w:t>Place</w:t>
+                            </w:r>
+                            <w:r>
+                              <w:rPr>
+                                <w:color w:val="000000" w:themeColor="text1"/>
+                                <w:sz w:val="14"/>
+                                <w:szCs w:val="14"/>
+                                <w14:textOutline w14:w="9525" w14:cap="rnd" w14:cmpd="sng" w14:algn="ctr">
+                                  <w14:noFill/>
+                                  <w14:prstDash w14:val="solid"/>
+                                  <w14:bevel/>
+                                </w14:textOutline>
+                              </w:rPr>
+                              <w:t xml:space="preserve"> </w:t>
                             </w:r>
                             <w:r>
                               <w:rPr>
@@ -2660,7 +2605,7 @@
           </mc:Choice>
           <mc:Fallback>
             <w:pict>
-              <v:roundrect w14:anchorId="5BB26D04" id="_x0000_s1032" style="position:absolute;left:0;text-align:left;margin-left:135.25pt;margin-top:20.3pt;width:43.2pt;height:43.2pt;z-index:251667456;visibility:visible;mso-wrap-style:square;mso-width-percent:0;mso-height-percent:0;mso-wrap-distance-left:9pt;mso-wrap-distance-top:0;mso-wrap-distance-right:9pt;mso-wrap-distance-bottom:0;mso-position-horizontal:absolute;mso-position-horizontal-relative:text;mso-position-vertical:absolute;mso-position-vertical-relative:text;mso-width-percent:0;mso-height-percent:0;mso-width-relative:margin;mso-height-relative:margin;v-text-anchor:middle" arcsize="10923f" o:gfxdata="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" fillcolor="#4ea72e [3209]" strokecolor="#0b1807 [489]" strokeweight="1pt">
+              <v:roundrect w14:anchorId="5BB26D04" id="_x0000_s1032" style="position:absolute;left:0;text-align:left;margin-left:135.25pt;margin-top:31.05pt;width:43.2pt;height:43.2pt;z-index:251667456;visibility:visible;mso-wrap-style:square;mso-width-percent:0;mso-height-percent:0;mso-wrap-distance-left:9pt;mso-wrap-distance-top:0;mso-wrap-distance-right:9pt;mso-wrap-distance-bottom:0;mso-position-horizontal:absolute;mso-position-horizontal-relative:text;mso-position-vertical:absolute;mso-position-vertical-relative:text;mso-width-percent:0;mso-height-percent:0;mso-width-relative:margin;mso-height-relative:margin;v-text-anchor:middle" arcsize="10923f" o:gfxdata="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" fillcolor="#4ea72e [3209]" strokecolor="#0b1807 [489]" strokeweight="1pt">
                 <v:stroke joinstyle="miter"/>
                 <v:textbox inset="0,0,0,0">
                   <w:txbxContent>
@@ -2719,7 +2664,20 @@
                             <w14:bevel/>
                           </w14:textOutline>
                         </w:rPr>
-                        <w:t xml:space="preserve">Send </w:t>
+                        <w:t>Place</w:t>
+                      </w:r>
+                      <w:r>
+                        <w:rPr>
+                          <w:color w:val="000000" w:themeColor="text1"/>
+                          <w:sz w:val="14"/>
+                          <w:szCs w:val="14"/>
+                          <w14:textOutline w14:w="9525" w14:cap="rnd" w14:cmpd="sng" w14:algn="ctr">
+                            <w14:noFill/>
+                            <w14:prstDash w14:val="solid"/>
+                            <w14:bevel/>
+                          </w14:textOutline>
+                        </w:rPr>
+                        <w:t xml:space="preserve"> </w:t>
                       </w:r>
                       <w:r>
                         <w:rPr>
@@ -2788,13 +2746,13 @@
         <mc:AlternateContent>
           <mc:Choice Requires="wps">
             <w:drawing>
-              <wp:anchor distT="0" distB="0" distL="114300" distR="114300" simplePos="0" relativeHeight="251685888" behindDoc="0" locked="0" layoutInCell="1" allowOverlap="1" wp14:anchorId="46E3F4A9" wp14:editId="77C04019">
+              <wp:anchor distT="0" distB="0" distL="114300" distR="114300" simplePos="0" relativeHeight="251685888" behindDoc="0" locked="0" layoutInCell="1" allowOverlap="1" wp14:anchorId="46E3F4A9" wp14:editId="39607C8B">
                 <wp:simplePos x="0" y="0"/>
                 <wp:positionH relativeFrom="column">
                   <wp:posOffset>2313940</wp:posOffset>
                 </wp:positionH>
                 <wp:positionV relativeFrom="paragraph">
-                  <wp:posOffset>537210</wp:posOffset>
+                  <wp:posOffset>673735</wp:posOffset>
                 </wp:positionV>
                 <wp:extent cx="274320" cy="0"/>
                 <wp:effectExtent l="0" t="76200" r="11430" b="95250"/>
@@ -2849,7 +2807,7 @@
           </mc:Choice>
           <mc:Fallback>
             <w:pict>
-              <v:shape w14:anchorId="21C75469" id="Straight Arrow Connector 2" o:spid="_x0000_s1026" type="#_x0000_t32" style="position:absolute;margin-left:182.2pt;margin-top:42.3pt;width:21.6pt;height:0;z-index:251685888;visibility:visible;mso-wrap-style:square;mso-width-percent:0;mso-height-percent:0;mso-wrap-distance-left:9pt;mso-wrap-distance-top:0;mso-wrap-distance-right:9pt;mso-wrap-distance-bottom:0;mso-position-horizontal:absolute;mso-position-horizontal-relative:text;mso-position-vertical:absolute;mso-position-vertical-relative:text;mso-width-percent:0;mso-height-percent:0;mso-width-relative:margin;mso-height-relative:margin" o:gfxdata="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" strokecolor="black [3213]" strokeweight=".5pt">
+              <v:shape w14:anchorId="4F53C799" id="Straight Arrow Connector 2" o:spid="_x0000_s1026" type="#_x0000_t32" style="position:absolute;margin-left:182.2pt;margin-top:53.05pt;width:21.6pt;height:0;z-index:251685888;visibility:visible;mso-wrap-style:square;mso-width-percent:0;mso-height-percent:0;mso-wrap-distance-left:9pt;mso-wrap-distance-top:0;mso-wrap-distance-right:9pt;mso-wrap-distance-bottom:0;mso-position-horizontal:absolute;mso-position-horizontal-relative:text;mso-position-vertical:absolute;mso-position-vertical-relative:text;mso-width-percent:0;mso-height-percent:0;mso-width-relative:margin;mso-height-relative:margin" o:gfxdata="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" strokecolor="black [3213]" strokeweight=".5pt">
                 <v:stroke endarrow="block" joinstyle="miter"/>
               </v:shape>
             </w:pict>
@@ -2863,13 +2821,13 @@
         <mc:AlternateContent>
           <mc:Choice Requires="wps">
             <w:drawing>
-              <wp:anchor distT="0" distB="0" distL="114300" distR="114300" simplePos="0" relativeHeight="251695104" behindDoc="0" locked="0" layoutInCell="1" allowOverlap="1" wp14:anchorId="1658CC62" wp14:editId="434CE37E">
+              <wp:anchor distT="0" distB="0" distL="114300" distR="114300" simplePos="0" relativeHeight="251695104" behindDoc="0" locked="0" layoutInCell="1" allowOverlap="1" wp14:anchorId="1658CC62" wp14:editId="32170D28">
                 <wp:simplePos x="0" y="0"/>
                 <wp:positionH relativeFrom="column">
                   <wp:posOffset>2593340</wp:posOffset>
                 </wp:positionH>
                 <wp:positionV relativeFrom="paragraph">
-                  <wp:posOffset>57785</wp:posOffset>
+                  <wp:posOffset>194310</wp:posOffset>
                 </wp:positionV>
                 <wp:extent cx="0" cy="914400"/>
                 <wp:effectExtent l="0" t="0" r="38100" b="19050"/>
@@ -2924,7 +2882,7 @@
           </mc:Choice>
           <mc:Fallback>
             <w:pict>
-              <v:line w14:anchorId="579CFD4F" id="Straight Connector 8" o:spid="_x0000_s1026" style="position:absolute;z-index:251695104;visibility:visible;mso-wrap-style:square;mso-width-percent:0;mso-height-percent:0;mso-wrap-distance-left:9pt;mso-wrap-distance-top:0;mso-wrap-distance-right:9pt;mso-wrap-distance-bottom:0;mso-position-horizontal:absolute;mso-position-horizontal-relative:text;mso-position-vertical:absolute;mso-position-vertical-relative:text;mso-width-percent:0;mso-height-percent:0;mso-width-relative:margin;mso-height-relative:margin" from="204.2pt,4.55pt" to="204.2pt,76.55pt" o:gfxdata="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" strokecolor="#e00" strokeweight=".5pt">
+              <v:line w14:anchorId="6389A130" id="Straight Connector 8" o:spid="_x0000_s1026" style="position:absolute;z-index:251695104;visibility:visible;mso-wrap-style:square;mso-width-percent:0;mso-height-percent:0;mso-wrap-distance-left:9pt;mso-wrap-distance-top:0;mso-wrap-distance-right:9pt;mso-wrap-distance-bottom:0;mso-position-horizontal:absolute;mso-position-horizontal-relative:text;mso-position-vertical:absolute;mso-position-vertical-relative:text;mso-width-percent:0;mso-height-percent:0;mso-width-relative:margin;mso-height-relative:margin" from="204.2pt,15.3pt" to="204.2pt,87.3pt" o:gfxdata="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" strokecolor="#e00" strokeweight=".5pt">
                 <v:stroke dashstyle="dash" joinstyle="miter"/>
               </v:line>
             </w:pict>
@@ -2938,13 +2896,13 @@
         <mc:AlternateContent>
           <mc:Choice Requires="wps">
             <w:drawing>
-              <wp:anchor distT="0" distB="0" distL="114300" distR="114300" simplePos="0" relativeHeight="251696128" behindDoc="0" locked="0" layoutInCell="1" allowOverlap="1" wp14:anchorId="32B14FCA" wp14:editId="7D9474AC">
+              <wp:anchor distT="0" distB="0" distL="114300" distR="114300" simplePos="0" relativeHeight="251696128" behindDoc="0" locked="0" layoutInCell="1" allowOverlap="1" wp14:anchorId="32B14FCA" wp14:editId="0190FBC3">
                 <wp:simplePos x="0" y="0"/>
                 <wp:positionH relativeFrom="column">
                   <wp:posOffset>2375535</wp:posOffset>
                 </wp:positionH>
                 <wp:positionV relativeFrom="paragraph">
-                  <wp:posOffset>95250</wp:posOffset>
+                  <wp:posOffset>231775</wp:posOffset>
                 </wp:positionV>
                 <wp:extent cx="255905" cy="130810"/>
                 <wp:effectExtent l="0" t="0" r="10795" b="2540"/>
@@ -3009,7 +2967,7 @@
           </mc:Choice>
           <mc:Fallback>
             <w:pict>
-              <v:shape w14:anchorId="32B14FCA" id="Text Box 9" o:spid="_x0000_s1033" type="#_x0000_t202" style="position:absolute;left:0;text-align:left;margin-left:187.05pt;margin-top:7.5pt;width:20.15pt;height:10.3pt;z-index:251696128;visibility:visible;mso-wrap-style:square;mso-width-percent:0;mso-height-percent:0;mso-wrap-distance-left:9pt;mso-wrap-distance-top:0;mso-wrap-distance-right:9pt;mso-wrap-distance-bottom:0;mso-position-horizontal:absolute;mso-position-horizontal-relative:text;mso-position-vertical:absolute;mso-position-vertical-relative:text;mso-width-percent:0;mso-height-percent:0;mso-width-relative:margin;mso-height-relative:margin;v-text-anchor:top" o:gfxdata="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" filled="f" stroked="f" strokeweight=".5pt">
+              <v:shape w14:anchorId="32B14FCA" id="Text Box 9" o:spid="_x0000_s1033" type="#_x0000_t202" style="position:absolute;left:0;text-align:left;margin-left:187.05pt;margin-top:18.25pt;width:20.15pt;height:10.3pt;z-index:251696128;visibility:visible;mso-wrap-style:square;mso-width-percent:0;mso-height-percent:0;mso-wrap-distance-left:9pt;mso-wrap-distance-top:0;mso-wrap-distance-right:9pt;mso-wrap-distance-bottom:0;mso-position-horizontal:absolute;mso-position-horizontal-relative:text;mso-position-vertical:absolute;mso-position-vertical-relative:text;mso-width-percent:0;mso-height-percent:0;mso-width-relative:margin;mso-height-relative:margin;v-text-anchor:top" o:gfxdata="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" filled="f" stroked="f" strokeweight=".5pt">
                 <v:textbox inset="0,0,0,0">
                   <w:txbxContent>
                     <w:p>
@@ -3043,13 +3001,13 @@
         <mc:AlternateContent>
           <mc:Choice Requires="wps">
             <w:drawing>
-              <wp:anchor distT="0" distB="0" distL="114300" distR="114300" simplePos="0" relativeHeight="251703296" behindDoc="0" locked="0" layoutInCell="1" allowOverlap="1" wp14:anchorId="68FE2F37" wp14:editId="1DA928F1">
+              <wp:anchor distT="0" distB="0" distL="114300" distR="114300" simplePos="0" relativeHeight="251703296" behindDoc="0" locked="0" layoutInCell="1" allowOverlap="1" wp14:anchorId="68FE2F37" wp14:editId="312C0A39">
                 <wp:simplePos x="0" y="0"/>
                 <wp:positionH relativeFrom="column">
                   <wp:posOffset>4138930</wp:posOffset>
                 </wp:positionH>
                 <wp:positionV relativeFrom="paragraph">
-                  <wp:posOffset>531495</wp:posOffset>
+                  <wp:posOffset>668020</wp:posOffset>
                 </wp:positionV>
                 <wp:extent cx="274320" cy="0"/>
                 <wp:effectExtent l="0" t="76200" r="11430" b="95250"/>
@@ -3104,13 +3062,24 @@
           </mc:Choice>
           <mc:Fallback>
             <w:pict>
-              <v:shape w14:anchorId="3757E74A" id="Straight Arrow Connector 2" o:spid="_x0000_s1026" type="#_x0000_t32" style="position:absolute;margin-left:325.9pt;margin-top:41.85pt;width:21.6pt;height:0;z-index:251703296;visibility:visible;mso-wrap-style:square;mso-width-percent:0;mso-height-percent:0;mso-wrap-distance-left:9pt;mso-wrap-distance-top:0;mso-wrap-distance-right:9pt;mso-wrap-distance-bottom:0;mso-position-horizontal:absolute;mso-position-horizontal-relative:text;mso-position-vertical:absolute;mso-position-vertical-relative:text;mso-width-percent:0;mso-height-percent:0;mso-width-relative:margin;mso-height-relative:margin" o:gfxdata="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" strokecolor="black [3213]" strokeweight=".5pt">
+              <v:shape w14:anchorId="67291A95" id="Straight Arrow Connector 2" o:spid="_x0000_s1026" type="#_x0000_t32" style="position:absolute;margin-left:325.9pt;margin-top:52.6pt;width:21.6pt;height:0;z-index:251703296;visibility:visible;mso-wrap-style:square;mso-width-percent:0;mso-height-percent:0;mso-wrap-distance-left:9pt;mso-wrap-distance-top:0;mso-wrap-distance-right:9pt;mso-wrap-distance-bottom:0;mso-position-horizontal:absolute;mso-position-horizontal-relative:text;mso-position-vertical:absolute;mso-position-vertical-relative:text;mso-width-percent:0;mso-height-percent:0;mso-width-relative:margin;mso-height-relative:margin" o:gfxdata="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" strokecolor="black [3213]" strokeweight=".5pt">
                 <v:stroke endarrow="block" joinstyle="miter"/>
               </v:shape>
             </w:pict>
           </mc:Fallback>
         </mc:AlternateContent>
       </w:r>
+    </w:p>
+    <w:p>
+      <w:pPr>
+        <w:pStyle w:val="ListParagraph"/>
+        <w:rPr>
+          <w:i/>
+          <w:iCs/>
+          <w:sz w:val="22"/>
+          <w:szCs w:val="22"/>
+        </w:rPr>
+      </w:pPr>
       <w:r>
         <w:rPr>
           <w:noProof/>
@@ -3118,13 +3087,13 @@
         <mc:AlternateContent>
           <mc:Choice Requires="wps">
             <w:drawing>
-              <wp:anchor distT="0" distB="0" distL="114300" distR="114300" simplePos="0" relativeHeight="251675648" behindDoc="0" locked="0" layoutInCell="1" allowOverlap="1" wp14:anchorId="5D44742A" wp14:editId="38292625">
+              <wp:anchor distT="0" distB="0" distL="114300" distR="114300" simplePos="0" relativeHeight="251675648" behindDoc="0" locked="0" layoutInCell="1" allowOverlap="1" wp14:anchorId="5D44742A" wp14:editId="72DA062E">
                 <wp:simplePos x="0" y="0"/>
                 <wp:positionH relativeFrom="column">
                   <wp:posOffset>4447540</wp:posOffset>
                 </wp:positionH>
                 <wp:positionV relativeFrom="paragraph">
-                  <wp:posOffset>256540</wp:posOffset>
+                  <wp:posOffset>195885</wp:posOffset>
                 </wp:positionV>
                 <wp:extent cx="1704340" cy="548640"/>
                 <wp:effectExtent l="0" t="0" r="10160" b="22860"/>
@@ -3345,7 +3314,7 @@
           </mc:Choice>
           <mc:Fallback>
             <w:pict>
-              <v:roundrect w14:anchorId="5D44742A" id="_x0000_s1034" style="position:absolute;left:0;text-align:left;margin-left:350.2pt;margin-top:20.2pt;width:134.2pt;height:43.2pt;z-index:251675648;visibility:visible;mso-wrap-style:square;mso-width-percent:0;mso-height-percent:0;mso-wrap-distance-left:9pt;mso-wrap-distance-top:0;mso-wrap-distance-right:9pt;mso-wrap-distance-bottom:0;mso-position-horizontal:absolute;mso-position-horizontal-relative:text;mso-position-vertical:absolute;mso-position-vertical-relative:text;mso-width-percent:0;mso-height-percent:0;mso-width-relative:margin;mso-height-relative:margin;v-text-anchor:middle" arcsize="10923f" o:gfxdata="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" fillcolor="#c1f0c7 [662]" strokecolor="#0b1807 [489]" strokeweight="1pt">
+              <v:roundrect w14:anchorId="5D44742A" id="_x0000_s1034" style="position:absolute;left:0;text-align:left;margin-left:350.2pt;margin-top:15.4pt;width:134.2pt;height:43.2pt;z-index:251675648;visibility:visible;mso-wrap-style:square;mso-width-percent:0;mso-height-percent:0;mso-wrap-distance-left:9pt;mso-wrap-distance-top:0;mso-wrap-distance-right:9pt;mso-wrap-distance-bottom:0;mso-position-horizontal:absolute;mso-position-horizontal-relative:text;mso-position-vertical:absolute;mso-position-vertical-relative:text;mso-width-percent:0;mso-height-percent:0;mso-width-relative:margin;mso-height-relative:margin;v-text-anchor:middle" arcsize="10923f" o:gfxdata="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" fillcolor="#c1f0c7 [662]" strokecolor="#0b1807 [489]" strokeweight="1pt">
                 <v:stroke joinstyle="miter"/>
                 <v:textbox inset="0,0,0,0">
                   <w:txbxContent>
@@ -3511,213 +3480,6 @@
           </mc:Fallback>
         </mc:AlternateContent>
       </w:r>
-      <w:r>
-        <w:rPr>
-          <w:noProof/>
-        </w:rPr>
-        <mc:AlternateContent>
-          <mc:Choice Requires="wps">
-            <w:drawing>
-              <wp:anchor distT="0" distB="0" distL="114300" distR="114300" simplePos="0" relativeHeight="251704320" behindDoc="0" locked="0" layoutInCell="1" allowOverlap="1" wp14:anchorId="58686D95" wp14:editId="28C21194">
-                <wp:simplePos x="0" y="0"/>
-                <wp:positionH relativeFrom="column">
-                  <wp:posOffset>457835</wp:posOffset>
-                </wp:positionH>
-                <wp:positionV relativeFrom="paragraph">
-                  <wp:posOffset>527050</wp:posOffset>
-                </wp:positionV>
-                <wp:extent cx="6017260" cy="829945"/>
-                <wp:effectExtent l="0" t="57150" r="21590" b="27305"/>
-                <wp:wrapNone/>
-                <wp:docPr id="1080643459" name="Freeform: Shape 21"/>
-                <wp:cNvGraphicFramePr/>
-                <a:graphic xmlns:a="http://schemas.openxmlformats.org/drawingml/2006/main">
-                  <a:graphicData uri="http://schemas.microsoft.com/office/word/2010/wordprocessingShape">
-                    <wps:wsp>
-                      <wps:cNvSpPr/>
-                      <wps:spPr>
-                        <a:xfrm>
-                          <a:off x="0" y="0"/>
-                          <a:ext cx="6017260" cy="829945"/>
-                        </a:xfrm>
-                        <a:custGeom>
-                          <a:avLst/>
-                          <a:gdLst>
-                            <a:gd name="csX0" fmla="*/ 5745705 w 6017749"/>
-                            <a:gd name="csY0" fmla="*/ 0 h 829967"/>
-                            <a:gd name="csX1" fmla="*/ 6016367 w 6017749"/>
-                            <a:gd name="csY1" fmla="*/ 468173 h 829967"/>
-                            <a:gd name="csX2" fmla="*/ 5643292 w 6017749"/>
-                            <a:gd name="csY2" fmla="*/ 768096 h 829967"/>
-                            <a:gd name="csX3" fmla="*/ 4948348 w 6017749"/>
-                            <a:gd name="csY3" fmla="*/ 826618 h 829967"/>
-                            <a:gd name="csX4" fmla="*/ 1773551 w 6017749"/>
-                            <a:gd name="csY4" fmla="*/ 819303 h 829967"/>
-                            <a:gd name="csX5" fmla="*/ 376348 w 6017749"/>
-                            <a:gd name="csY5" fmla="*/ 790042 h 829967"/>
-                            <a:gd name="csX6" fmla="*/ 83740 w 6017749"/>
-                            <a:gd name="csY6" fmla="*/ 607162 h 829967"/>
-                            <a:gd name="csX7" fmla="*/ 10588 w 6017749"/>
-                            <a:gd name="csY7" fmla="*/ 138989 h 829967"/>
-                            <a:gd name="csX8" fmla="*/ 273935 w 6017749"/>
-                            <a:gd name="csY8" fmla="*/ 7315 h 829967"/>
-                          </a:gdLst>
-                          <a:ahLst/>
-                          <a:cxnLst>
-                            <a:cxn ang="0">
-                              <a:pos x="csX0" y="csY0"/>
-                            </a:cxn>
-                            <a:cxn ang="0">
-                              <a:pos x="csX1" y="csY1"/>
-                            </a:cxn>
-                            <a:cxn ang="0">
-                              <a:pos x="csX2" y="csY2"/>
-                            </a:cxn>
-                            <a:cxn ang="0">
-                              <a:pos x="csX3" y="csY3"/>
-                            </a:cxn>
-                            <a:cxn ang="0">
-                              <a:pos x="csX4" y="csY4"/>
-                            </a:cxn>
-                            <a:cxn ang="0">
-                              <a:pos x="csX5" y="csY5"/>
-                            </a:cxn>
-                            <a:cxn ang="0">
-                              <a:pos x="csX6" y="csY6"/>
-                            </a:cxn>
-                            <a:cxn ang="0">
-                              <a:pos x="csX7" y="csY7"/>
-                            </a:cxn>
-                            <a:cxn ang="0">
-                              <a:pos x="csX8" y="csY8"/>
-                            </a:cxn>
-                          </a:cxnLst>
-                          <a:rect l="l" t="t" r="r" b="b"/>
-                          <a:pathLst>
-                            <a:path w="6017749" h="829967">
-                              <a:moveTo>
-                                <a:pt x="5745705" y="0"/>
-                              </a:moveTo>
-                              <a:cubicBezTo>
-                                <a:pt x="5889570" y="170078"/>
-                                <a:pt x="6033436" y="340157"/>
-                                <a:pt x="6016367" y="468173"/>
-                              </a:cubicBezTo>
-                              <a:cubicBezTo>
-                                <a:pt x="5999298" y="596189"/>
-                                <a:pt x="5821295" y="708355"/>
-                                <a:pt x="5643292" y="768096"/>
-                              </a:cubicBezTo>
-                              <a:cubicBezTo>
-                                <a:pt x="5465289" y="827837"/>
-                                <a:pt x="5593305" y="818084"/>
-                                <a:pt x="4948348" y="826618"/>
-                              </a:cubicBezTo>
-                              <a:cubicBezTo>
-                                <a:pt x="4303391" y="835153"/>
-                                <a:pt x="2535551" y="825399"/>
-                                <a:pt x="1773551" y="819303"/>
-                              </a:cubicBezTo>
-                              <a:cubicBezTo>
-                                <a:pt x="1011551" y="813207"/>
-                                <a:pt x="657983" y="825399"/>
-                                <a:pt x="376348" y="790042"/>
-                              </a:cubicBezTo>
-                              <a:cubicBezTo>
-                                <a:pt x="94713" y="754685"/>
-                                <a:pt x="144700" y="715671"/>
-                                <a:pt x="83740" y="607162"/>
-                              </a:cubicBezTo>
-                              <a:cubicBezTo>
-                                <a:pt x="22780" y="498653"/>
-                                <a:pt x="-21111" y="238963"/>
-                                <a:pt x="10588" y="138989"/>
-                              </a:cubicBezTo>
-                              <a:cubicBezTo>
-                                <a:pt x="42287" y="39015"/>
-                                <a:pt x="158111" y="23165"/>
-                                <a:pt x="273935" y="7315"/>
-                              </a:cubicBezTo>
-                            </a:path>
-                          </a:pathLst>
-                        </a:custGeom>
-                        <a:noFill/>
-                        <a:ln w="9525">
-                          <a:headEnd type="none" w="med" len="med"/>
-                          <a:tailEnd type="triangle" w="med" len="med"/>
-                        </a:ln>
-                      </wps:spPr>
-                      <wps:style>
-                        <a:lnRef idx="2">
-                          <a:schemeClr val="accent1">
-                            <a:shade val="15000"/>
-                          </a:schemeClr>
-                        </a:lnRef>
-                        <a:fillRef idx="1">
-                          <a:schemeClr val="accent1"/>
-                        </a:fillRef>
-                        <a:effectRef idx="0">
-                          <a:schemeClr val="accent1"/>
-                        </a:effectRef>
-                        <a:fontRef idx="minor">
-                          <a:schemeClr val="lt1"/>
-                        </a:fontRef>
-                      </wps:style>
-                      <wps:bodyPr rot="0" spcFirstLastPara="0" vertOverflow="overflow" horzOverflow="overflow" vert="horz" wrap="square" lIns="91440" tIns="45720" rIns="91440" bIns="45720" numCol="1" spcCol="0" rtlCol="0" fromWordArt="0" anchor="ctr" anchorCtr="0" forceAA="0" compatLnSpc="1">
-                        <a:prstTxWarp prst="textNoShape">
-                          <a:avLst/>
-                        </a:prstTxWarp>
-                        <a:noAutofit/>
-                      </wps:bodyPr>
-                    </wps:wsp>
-                  </a:graphicData>
-                </a:graphic>
-              </wp:anchor>
-            </w:drawing>
-          </mc:Choice>
-          <mc:Fallback>
-            <w:pict>
-              <v:shape w14:anchorId="79167387" id="Freeform: Shape 21" o:spid="_x0000_s1026" style="position:absolute;margin-left:36.05pt;margin-top:41.5pt;width:473.8pt;height:65.35pt;z-index:251704320;visibility:visible;mso-wrap-style:square;mso-wrap-distance-left:9pt;mso-wrap-distance-top:0;mso-wrap-distance-right:9pt;mso-wrap-distance-bottom:0;mso-position-horizontal:absolute;mso-position-horizontal-relative:text;mso-position-vertical:absolute;mso-position-vertical-relative:text;v-text-anchor:middle" coordsize="6017749,829967" o:gfxdata="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" path="m5745705,v143865,170078,287731,340157,270662,468173c5999298,596189,5821295,708355,5643292,768096v-178003,59741,-49987,49988,-694944,58522c4303391,835153,2535551,825399,1773551,819303,1011551,813207,657983,825399,376348,790042,94713,754685,144700,715671,83740,607162,22780,498653,-21111,238963,10588,138989,42287,39015,158111,23165,273935,7315e" filled="f" strokecolor="#030e13 [484]">
-                <v:stroke endarrow="block" joinstyle="miter"/>
-                <v:path arrowok="t" o:connecttype="custom" o:connectlocs="5745238,0;6015878,468161;5642833,768076;4947946,826596;1773407,819281;376317,790021;83733,607146;10587,138985;273913,7315" o:connectangles="0,0,0,0,0,0,0,0,0"/>
-              </v:shape>
-            </w:pict>
-          </mc:Fallback>
-        </mc:AlternateContent>
-      </w:r>
-    </w:p>
-    <w:p>
-      <w:pPr>
-        <w:pStyle w:val="ListParagraph"/>
-        <w:rPr>
-          <w:i/>
-          <w:iCs/>
-          <w:sz w:val="22"/>
-          <w:szCs w:val="22"/>
-        </w:rPr>
-      </w:pPr>
-    </w:p>
-    <w:p>
-      <w:pPr>
-        <w:pStyle w:val="ListParagraph"/>
-        <w:rPr>
-          <w:i/>
-          <w:iCs/>
-          <w:sz w:val="22"/>
-          <w:szCs w:val="22"/>
-        </w:rPr>
-      </w:pPr>
-    </w:p>
-    <w:p>
-      <w:pPr>
-        <w:pStyle w:val="ListParagraph"/>
-        <w:rPr>
-          <w:i/>
-          <w:iCs/>
-          <w:sz w:val="22"/>
-          <w:szCs w:val="22"/>
-        </w:rPr>
-      </w:pPr>
     </w:p>
     <w:p>
       <w:pPr>
@@ -3787,7 +3549,19 @@
           <w:szCs w:val="18"/>
           <w:u w:val="single"/>
         </w:rPr>
-        <w:t>Notes:</w:t>
+        <w:t>To-Do</w:t>
+      </w:r>
+      <w:r>
+        <w:rPr>
+          <w:b/>
+          <w:bCs/>
+          <w:i/>
+          <w:iCs/>
+          <w:sz w:val="18"/>
+          <w:szCs w:val="18"/>
+          <w:u w:val="single"/>
+        </w:rPr>
+        <w:t>:</w:t>
       </w:r>
       <w:r>
         <w:rPr>
@@ -3947,7 +3721,7 @@
       <w:lvlText w:val="%1."/>
       <w:lvlJc w:val="left"/>
       <w:pPr>
-        <w:ind w:left="720" w:hanging="360"/>
+        <w:ind w:left="900" w:hanging="360"/>
       </w:pPr>
       <w:rPr>
         <w:b w:val="0"/>
@@ -3960,7 +3734,7 @@
       <w:lvlText w:val=""/>
       <w:lvlJc w:val="left"/>
       <w:pPr>
-        <w:ind w:left="1440" w:hanging="360"/>
+        <w:ind w:left="1620" w:hanging="360"/>
       </w:pPr>
       <w:rPr>
         <w:rFonts w:ascii="Wingdings" w:hAnsi="Wingdings" w:hint="default"/>
@@ -3972,7 +3746,7 @@
       <w:lvlText w:val="%3."/>
       <w:lvlJc w:val="right"/>
       <w:pPr>
-        <w:ind w:left="2160" w:hanging="180"/>
+        <w:ind w:left="2340" w:hanging="180"/>
       </w:pPr>
     </w:lvl>
     <w:lvl w:ilvl="3" w:tplc="FFFFFFFF" w:tentative="1">
@@ -3981,7 +3755,7 @@
       <w:lvlText w:val="%4."/>
       <w:lvlJc w:val="left"/>
       <w:pPr>
-        <w:ind w:left="2880" w:hanging="360"/>
+        <w:ind w:left="3060" w:hanging="360"/>
       </w:pPr>
     </w:lvl>
     <w:lvl w:ilvl="4" w:tplc="FFFFFFFF" w:tentative="1">
@@ -3990,7 +3764,7 @@
       <w:lvlText w:val="%5."/>
       <w:lvlJc w:val="left"/>
       <w:pPr>
-        <w:ind w:left="3600" w:hanging="360"/>
+        <w:ind w:left="3780" w:hanging="360"/>
       </w:pPr>
     </w:lvl>
     <w:lvl w:ilvl="5" w:tplc="FFFFFFFF" w:tentative="1">
@@ -3999,7 +3773,7 @@
       <w:lvlText w:val="%6."/>
       <w:lvlJc w:val="right"/>
       <w:pPr>
-        <w:ind w:left="4320" w:hanging="180"/>
+        <w:ind w:left="4500" w:hanging="180"/>
       </w:pPr>
     </w:lvl>
     <w:lvl w:ilvl="6" w:tplc="FFFFFFFF" w:tentative="1">
@@ -4008,7 +3782,7 @@
       <w:lvlText w:val="%7."/>
       <w:lvlJc w:val="left"/>
       <w:pPr>
-        <w:ind w:left="5040" w:hanging="360"/>
+        <w:ind w:left="5220" w:hanging="360"/>
       </w:pPr>
     </w:lvl>
     <w:lvl w:ilvl="7" w:tplc="FFFFFFFF" w:tentative="1">
@@ -4017,7 +3791,7 @@
       <w:lvlText w:val="%8."/>
       <w:lvlJc w:val="left"/>
       <w:pPr>
-        <w:ind w:left="5760" w:hanging="360"/>
+        <w:ind w:left="5940" w:hanging="360"/>
       </w:pPr>
     </w:lvl>
     <w:lvl w:ilvl="8" w:tplc="FFFFFFFF" w:tentative="1">
@@ -4026,7 +3800,7 @@
       <w:lvlText w:val="%9."/>
       <w:lvlJc w:val="right"/>
       <w:pPr>
-        <w:ind w:left="6480" w:hanging="180"/>
+        <w:ind w:left="6660" w:hanging="180"/>
       </w:pPr>
     </w:lvl>
   </w:abstractNum>
@@ -4153,7 +3927,7 @@
       <w:lvlText w:val="%1."/>
       <w:lvlJc w:val="left"/>
       <w:pPr>
-        <w:ind w:left="720" w:hanging="360"/>
+        <w:ind w:left="900" w:hanging="360"/>
       </w:pPr>
       <w:rPr>
         <w:b w:val="0"/>
@@ -4166,7 +3940,7 @@
       <w:lvlText w:val=""/>
       <w:lvlJc w:val="left"/>
       <w:pPr>
-        <w:ind w:left="1440" w:hanging="360"/>
+        <w:ind w:left="1620" w:hanging="360"/>
       </w:pPr>
       <w:rPr>
         <w:rFonts w:ascii="Wingdings" w:hAnsi="Wingdings" w:hint="default"/>
@@ -4178,7 +3952,7 @@
       <w:lvlText w:val="%3."/>
       <w:lvlJc w:val="right"/>
       <w:pPr>
-        <w:ind w:left="2160" w:hanging="180"/>
+        <w:ind w:left="2340" w:hanging="180"/>
       </w:pPr>
     </w:lvl>
     <w:lvl w:ilvl="3" w:tplc="FFFFFFFF" w:tentative="1">
@@ -4187,7 +3961,7 @@
       <w:lvlText w:val="%4."/>
       <w:lvlJc w:val="left"/>
       <w:pPr>
-        <w:ind w:left="2880" w:hanging="360"/>
+        <w:ind w:left="3060" w:hanging="360"/>
       </w:pPr>
     </w:lvl>
     <w:lvl w:ilvl="4" w:tplc="FFFFFFFF" w:tentative="1">
@@ -4196,7 +3970,7 @@
       <w:lvlText w:val="%5."/>
       <w:lvlJc w:val="left"/>
       <w:pPr>
-        <w:ind w:left="3600" w:hanging="360"/>
+        <w:ind w:left="3780" w:hanging="360"/>
       </w:pPr>
     </w:lvl>
     <w:lvl w:ilvl="5" w:tplc="FFFFFFFF" w:tentative="1">
@@ -4205,7 +3979,7 @@
       <w:lvlText w:val="%6."/>
       <w:lvlJc w:val="right"/>
       <w:pPr>
-        <w:ind w:left="4320" w:hanging="180"/>
+        <w:ind w:left="4500" w:hanging="180"/>
       </w:pPr>
     </w:lvl>
     <w:lvl w:ilvl="6" w:tplc="FFFFFFFF" w:tentative="1">
@@ -4214,7 +3988,7 @@
       <w:lvlText w:val="%7."/>
       <w:lvlJc w:val="left"/>
       <w:pPr>
-        <w:ind w:left="5040" w:hanging="360"/>
+        <w:ind w:left="5220" w:hanging="360"/>
       </w:pPr>
     </w:lvl>
     <w:lvl w:ilvl="7" w:tplc="FFFFFFFF" w:tentative="1">
@@ -4223,7 +3997,7 @@
       <w:lvlText w:val="%8."/>
       <w:lvlJc w:val="left"/>
       <w:pPr>
-        <w:ind w:left="5760" w:hanging="360"/>
+        <w:ind w:left="5940" w:hanging="360"/>
       </w:pPr>
     </w:lvl>
     <w:lvl w:ilvl="8" w:tplc="FFFFFFFF" w:tentative="1">
@@ -4232,7 +4006,7 @@
       <w:lvlText w:val="%9."/>
       <w:lvlJc w:val="right"/>
       <w:pPr>
-        <w:ind w:left="6480" w:hanging="180"/>
+        <w:ind w:left="6660" w:hanging="180"/>
       </w:pPr>
     </w:lvl>
   </w:abstractNum>
@@ -4336,7 +4110,7 @@
       <w:lvlText w:val="%1."/>
       <w:lvlJc w:val="left"/>
       <w:pPr>
-        <w:ind w:left="720" w:hanging="360"/>
+        <w:ind w:left="900" w:hanging="360"/>
       </w:pPr>
       <w:rPr>
         <w:b w:val="0"/>
@@ -4349,7 +4123,7 @@
       <w:lvlText w:val=""/>
       <w:lvlJc w:val="left"/>
       <w:pPr>
-        <w:ind w:left="1440" w:hanging="360"/>
+        <w:ind w:left="1620" w:hanging="360"/>
       </w:pPr>
       <w:rPr>
         <w:rFonts w:ascii="Wingdings" w:hAnsi="Wingdings" w:hint="default"/>
@@ -4361,7 +4135,7 @@
       <w:lvlText w:val="%3."/>
       <w:lvlJc w:val="right"/>
       <w:pPr>
-        <w:ind w:left="2160" w:hanging="180"/>
+        <w:ind w:left="2340" w:hanging="180"/>
       </w:pPr>
     </w:lvl>
     <w:lvl w:ilvl="3" w:tplc="FFFFFFFF" w:tentative="1">
@@ -4370,7 +4144,7 @@
       <w:lvlText w:val="%4."/>
       <w:lvlJc w:val="left"/>
       <w:pPr>
-        <w:ind w:left="2880" w:hanging="360"/>
+        <w:ind w:left="3060" w:hanging="360"/>
       </w:pPr>
     </w:lvl>
     <w:lvl w:ilvl="4" w:tplc="FFFFFFFF" w:tentative="1">
@@ -4379,7 +4153,7 @@
       <w:lvlText w:val="%5."/>
       <w:lvlJc w:val="left"/>
       <w:pPr>
-        <w:ind w:left="3600" w:hanging="360"/>
+        <w:ind w:left="3780" w:hanging="360"/>
       </w:pPr>
     </w:lvl>
     <w:lvl w:ilvl="5" w:tplc="FFFFFFFF" w:tentative="1">
@@ -4388,7 +4162,7 @@
       <w:lvlText w:val="%6."/>
       <w:lvlJc w:val="right"/>
       <w:pPr>
-        <w:ind w:left="4320" w:hanging="180"/>
+        <w:ind w:left="4500" w:hanging="180"/>
       </w:pPr>
     </w:lvl>
     <w:lvl w:ilvl="6" w:tplc="FFFFFFFF" w:tentative="1">
@@ -4397,7 +4171,7 @@
       <w:lvlText w:val="%7."/>
       <w:lvlJc w:val="left"/>
       <w:pPr>
-        <w:ind w:left="5040" w:hanging="360"/>
+        <w:ind w:left="5220" w:hanging="360"/>
       </w:pPr>
     </w:lvl>
     <w:lvl w:ilvl="7" w:tplc="FFFFFFFF" w:tentative="1">
@@ -4406,7 +4180,7 @@
       <w:lvlText w:val="%8."/>
       <w:lvlJc w:val="left"/>
       <w:pPr>
-        <w:ind w:left="5760" w:hanging="360"/>
+        <w:ind w:left="5940" w:hanging="360"/>
       </w:pPr>
     </w:lvl>
     <w:lvl w:ilvl="8" w:tplc="FFFFFFFF" w:tentative="1">
@@ -4415,7 +4189,7 @@
       <w:lvlText w:val="%9."/>
       <w:lvlJc w:val="right"/>
       <w:pPr>
-        <w:ind w:left="6480" w:hanging="180"/>
+        <w:ind w:left="6660" w:hanging="180"/>
       </w:pPr>
     </w:lvl>
   </w:abstractNum>
@@ -4429,7 +4203,7 @@
       <w:lvlText w:val="%1."/>
       <w:lvlJc w:val="left"/>
       <w:pPr>
-        <w:ind w:left="720" w:hanging="360"/>
+        <w:ind w:left="900" w:hanging="360"/>
       </w:pPr>
       <w:rPr>
         <w:b w:val="0"/>
@@ -4442,7 +4216,7 @@
       <w:lvlText w:val=""/>
       <w:lvlJc w:val="left"/>
       <w:pPr>
-        <w:ind w:left="1440" w:hanging="360"/>
+        <w:ind w:left="1620" w:hanging="360"/>
       </w:pPr>
       <w:rPr>
         <w:rFonts w:ascii="Wingdings" w:hAnsi="Wingdings" w:hint="default"/>
@@ -4454,7 +4228,7 @@
       <w:lvlText w:val="%3."/>
       <w:lvlJc w:val="right"/>
       <w:pPr>
-        <w:ind w:left="2160" w:hanging="180"/>
+        <w:ind w:left="2340" w:hanging="180"/>
       </w:pPr>
     </w:lvl>
     <w:lvl w:ilvl="3" w:tplc="FFFFFFFF" w:tentative="1">
@@ -4463,7 +4237,7 @@
       <w:lvlText w:val="%4."/>
       <w:lvlJc w:val="left"/>
       <w:pPr>
-        <w:ind w:left="2880" w:hanging="360"/>
+        <w:ind w:left="3060" w:hanging="360"/>
       </w:pPr>
     </w:lvl>
     <w:lvl w:ilvl="4" w:tplc="FFFFFFFF" w:tentative="1">
@@ -4472,7 +4246,7 @@
       <w:lvlText w:val="%5."/>
       <w:lvlJc w:val="left"/>
       <w:pPr>
-        <w:ind w:left="3600" w:hanging="360"/>
+        <w:ind w:left="3780" w:hanging="360"/>
       </w:pPr>
     </w:lvl>
     <w:lvl w:ilvl="5" w:tplc="FFFFFFFF" w:tentative="1">
@@ -4481,7 +4255,7 @@
       <w:lvlText w:val="%6."/>
       <w:lvlJc w:val="right"/>
       <w:pPr>
-        <w:ind w:left="4320" w:hanging="180"/>
+        <w:ind w:left="4500" w:hanging="180"/>
       </w:pPr>
     </w:lvl>
     <w:lvl w:ilvl="6" w:tplc="FFFFFFFF" w:tentative="1">
@@ -4490,7 +4264,7 @@
       <w:lvlText w:val="%7."/>
       <w:lvlJc w:val="left"/>
       <w:pPr>
-        <w:ind w:left="5040" w:hanging="360"/>
+        <w:ind w:left="5220" w:hanging="360"/>
       </w:pPr>
     </w:lvl>
     <w:lvl w:ilvl="7" w:tplc="FFFFFFFF" w:tentative="1">
@@ -4499,7 +4273,7 @@
       <w:lvlText w:val="%8."/>
       <w:lvlJc w:val="left"/>
       <w:pPr>
-        <w:ind w:left="5760" w:hanging="360"/>
+        <w:ind w:left="5940" w:hanging="360"/>
       </w:pPr>
     </w:lvl>
     <w:lvl w:ilvl="8" w:tplc="FFFFFFFF" w:tentative="1">
@@ -4508,7 +4282,7 @@
       <w:lvlText w:val="%9."/>
       <w:lvlJc w:val="right"/>
       <w:pPr>
-        <w:ind w:left="6480" w:hanging="180"/>
+        <w:ind w:left="6660" w:hanging="180"/>
       </w:pPr>
     </w:lvl>
   </w:abstractNum>
@@ -4606,6 +4380,119 @@
     </w:lvl>
   </w:abstractNum>
   <w:abstractNum w:abstractNumId="8" w15:restartNumberingAfterBreak="0">
+    <w:nsid w:val="26816192"/>
+    <w:multiLevelType w:val="hybridMultilevel"/>
+    <w:tmpl w:val="BA90CD82"/>
+    <w:lvl w:ilvl="0" w:tplc="0409000B">
+      <w:start w:val="1"/>
+      <w:numFmt w:val="bullet"/>
+      <w:lvlText w:val=""/>
+      <w:lvlJc w:val="left"/>
+      <w:pPr>
+        <w:ind w:left="1260" w:hanging="360"/>
+      </w:pPr>
+      <w:rPr>
+        <w:rFonts w:ascii="Wingdings" w:hAnsi="Wingdings" w:hint="default"/>
+      </w:rPr>
+    </w:lvl>
+    <w:lvl w:ilvl="1" w:tplc="04090003" w:tentative="1">
+      <w:start w:val="1"/>
+      <w:numFmt w:val="bullet"/>
+      <w:lvlText w:val="o"/>
+      <w:lvlJc w:val="left"/>
+      <w:pPr>
+        <w:ind w:left="1980" w:hanging="360"/>
+      </w:pPr>
+      <w:rPr>
+        <w:rFonts w:ascii="Courier New" w:hAnsi="Courier New" w:cs="Courier New" w:hint="default"/>
+      </w:rPr>
+    </w:lvl>
+    <w:lvl w:ilvl="2" w:tplc="04090005" w:tentative="1">
+      <w:start w:val="1"/>
+      <w:numFmt w:val="bullet"/>
+      <w:lvlText w:val=""/>
+      <w:lvlJc w:val="left"/>
+      <w:pPr>
+        <w:ind w:left="2700" w:hanging="360"/>
+      </w:pPr>
+      <w:rPr>
+        <w:rFonts w:ascii="Wingdings" w:hAnsi="Wingdings" w:hint="default"/>
+      </w:rPr>
+    </w:lvl>
+    <w:lvl w:ilvl="3" w:tplc="04090001" w:tentative="1">
+      <w:start w:val="1"/>
+      <w:numFmt w:val="bullet"/>
+      <w:lvlText w:val=""/>
+      <w:lvlJc w:val="left"/>
+      <w:pPr>
+        <w:ind w:left="3420" w:hanging="360"/>
+      </w:pPr>
+      <w:rPr>
+        <w:rFonts w:ascii="Symbol" w:hAnsi="Symbol" w:hint="default"/>
+      </w:rPr>
+    </w:lvl>
+    <w:lvl w:ilvl="4" w:tplc="04090003" w:tentative="1">
+      <w:start w:val="1"/>
+      <w:numFmt w:val="bullet"/>
+      <w:lvlText w:val="o"/>
+      <w:lvlJc w:val="left"/>
+      <w:pPr>
+        <w:ind w:left="4140" w:hanging="360"/>
+      </w:pPr>
+      <w:rPr>
+        <w:rFonts w:ascii="Courier New" w:hAnsi="Courier New" w:cs="Courier New" w:hint="default"/>
+      </w:rPr>
+    </w:lvl>
+    <w:lvl w:ilvl="5" w:tplc="04090005" w:tentative="1">
+      <w:start w:val="1"/>
+      <w:numFmt w:val="bullet"/>
+      <w:lvlText w:val=""/>
+      <w:lvlJc w:val="left"/>
+      <w:pPr>
+        <w:ind w:left="4860" w:hanging="360"/>
+      </w:pPr>
+      <w:rPr>
+        <w:rFonts w:ascii="Wingdings" w:hAnsi="Wingdings" w:hint="default"/>
+      </w:rPr>
+    </w:lvl>
+    <w:lvl w:ilvl="6" w:tplc="04090001" w:tentative="1">
+      <w:start w:val="1"/>
+      <w:numFmt w:val="bullet"/>
+      <w:lvlText w:val=""/>
+      <w:lvlJc w:val="left"/>
+      <w:pPr>
+        <w:ind w:left="5580" w:hanging="360"/>
+      </w:pPr>
+      <w:rPr>
+        <w:rFonts w:ascii="Symbol" w:hAnsi="Symbol" w:hint="default"/>
+      </w:rPr>
+    </w:lvl>
+    <w:lvl w:ilvl="7" w:tplc="04090003" w:tentative="1">
+      <w:start w:val="1"/>
+      <w:numFmt w:val="bullet"/>
+      <w:lvlText w:val="o"/>
+      <w:lvlJc w:val="left"/>
+      <w:pPr>
+        <w:ind w:left="6300" w:hanging="360"/>
+      </w:pPr>
+      <w:rPr>
+        <w:rFonts w:ascii="Courier New" w:hAnsi="Courier New" w:cs="Courier New" w:hint="default"/>
+      </w:rPr>
+    </w:lvl>
+    <w:lvl w:ilvl="8" w:tplc="04090005" w:tentative="1">
+      <w:start w:val="1"/>
+      <w:numFmt w:val="bullet"/>
+      <w:lvlText w:val=""/>
+      <w:lvlJc w:val="left"/>
+      <w:pPr>
+        <w:ind w:left="7020" w:hanging="360"/>
+      </w:pPr>
+      <w:rPr>
+        <w:rFonts w:ascii="Wingdings" w:hAnsi="Wingdings" w:hint="default"/>
+      </w:rPr>
+    </w:lvl>
+  </w:abstractNum>
+  <w:abstractNum w:abstractNumId="9" w15:restartNumberingAfterBreak="0">
     <w:nsid w:val="2EC87C2D"/>
     <w:multiLevelType w:val="hybridMultilevel"/>
     <w:tmpl w:val="08AC22B8"/>
@@ -4698,7 +4585,7 @@
       </w:pPr>
     </w:lvl>
   </w:abstractNum>
-  <w:abstractNum w:abstractNumId="9" w15:restartNumberingAfterBreak="0">
+  <w:abstractNum w:abstractNumId="10" w15:restartNumberingAfterBreak="0">
     <w:nsid w:val="32CA3443"/>
     <w:multiLevelType w:val="hybridMultilevel"/>
     <w:tmpl w:val="362C9ACA"/>
@@ -4784,7 +4671,7 @@
       </w:pPr>
     </w:lvl>
   </w:abstractNum>
-  <w:abstractNum w:abstractNumId="10" w15:restartNumberingAfterBreak="0">
+  <w:abstractNum w:abstractNumId="11" w15:restartNumberingAfterBreak="0">
     <w:nsid w:val="3CF844A6"/>
     <w:multiLevelType w:val="hybridMultilevel"/>
     <w:tmpl w:val="08AC22B8"/>
@@ -4877,7 +4764,7 @@
       </w:pPr>
     </w:lvl>
   </w:abstractNum>
-  <w:abstractNum w:abstractNumId="11" w15:restartNumberingAfterBreak="0">
+  <w:abstractNum w:abstractNumId="12" w15:restartNumberingAfterBreak="0">
     <w:nsid w:val="56206108"/>
     <w:multiLevelType w:val="hybridMultilevel"/>
     <w:tmpl w:val="D7EE4DDA"/>
@@ -4887,7 +4774,7 @@
       <w:lvlText w:val="%1."/>
       <w:lvlJc w:val="left"/>
       <w:pPr>
-        <w:ind w:left="720" w:hanging="360"/>
+        <w:ind w:left="900" w:hanging="360"/>
       </w:pPr>
       <w:rPr>
         <w:b w:val="0"/>
@@ -4900,7 +4787,7 @@
       <w:lvlText w:val=""/>
       <w:lvlJc w:val="left"/>
       <w:pPr>
-        <w:ind w:left="1440" w:hanging="360"/>
+        <w:ind w:left="1620" w:hanging="360"/>
       </w:pPr>
       <w:rPr>
         <w:rFonts w:ascii="Wingdings" w:hAnsi="Wingdings" w:hint="default"/>
@@ -4912,7 +4799,7 @@
       <w:lvlText w:val="%3."/>
       <w:lvlJc w:val="right"/>
       <w:pPr>
-        <w:ind w:left="2160" w:hanging="180"/>
+        <w:ind w:left="2340" w:hanging="180"/>
       </w:pPr>
     </w:lvl>
     <w:lvl w:ilvl="3" w:tplc="FFFFFFFF" w:tentative="1">
@@ -4921,7 +4808,7 @@
       <w:lvlText w:val="%4."/>
       <w:lvlJc w:val="left"/>
       <w:pPr>
-        <w:ind w:left="2880" w:hanging="360"/>
+        <w:ind w:left="3060" w:hanging="360"/>
       </w:pPr>
     </w:lvl>
     <w:lvl w:ilvl="4" w:tplc="FFFFFFFF" w:tentative="1">
@@ -4930,7 +4817,7 @@
       <w:lvlText w:val="%5."/>
       <w:lvlJc w:val="left"/>
       <w:pPr>
-        <w:ind w:left="3600" w:hanging="360"/>
+        <w:ind w:left="3780" w:hanging="360"/>
       </w:pPr>
     </w:lvl>
     <w:lvl w:ilvl="5" w:tplc="FFFFFFFF" w:tentative="1">
@@ -4939,7 +4826,7 @@
       <w:lvlText w:val="%6."/>
       <w:lvlJc w:val="right"/>
       <w:pPr>
-        <w:ind w:left="4320" w:hanging="180"/>
+        <w:ind w:left="4500" w:hanging="180"/>
       </w:pPr>
     </w:lvl>
     <w:lvl w:ilvl="6" w:tplc="FFFFFFFF" w:tentative="1">
@@ -4948,7 +4835,7 @@
       <w:lvlText w:val="%7."/>
       <w:lvlJc w:val="left"/>
       <w:pPr>
-        <w:ind w:left="5040" w:hanging="360"/>
+        <w:ind w:left="5220" w:hanging="360"/>
       </w:pPr>
     </w:lvl>
     <w:lvl w:ilvl="7" w:tplc="FFFFFFFF" w:tentative="1">
@@ -4957,7 +4844,7 @@
       <w:lvlText w:val="%8."/>
       <w:lvlJc w:val="left"/>
       <w:pPr>
-        <w:ind w:left="5760" w:hanging="360"/>
+        <w:ind w:left="5940" w:hanging="360"/>
       </w:pPr>
     </w:lvl>
     <w:lvl w:ilvl="8" w:tplc="FFFFFFFF" w:tentative="1">
@@ -4966,11 +4853,11 @@
       <w:lvlText w:val="%9."/>
       <w:lvlJc w:val="right"/>
       <w:pPr>
-        <w:ind w:left="6480" w:hanging="180"/>
+        <w:ind w:left="6660" w:hanging="180"/>
       </w:pPr>
     </w:lvl>
   </w:abstractNum>
-  <w:abstractNum w:abstractNumId="12" w15:restartNumberingAfterBreak="0">
+  <w:abstractNum w:abstractNumId="13" w15:restartNumberingAfterBreak="0">
     <w:nsid w:val="584F0941"/>
     <w:multiLevelType w:val="hybridMultilevel"/>
     <w:tmpl w:val="08AC22B8"/>
@@ -5063,7 +4950,7 @@
       </w:pPr>
     </w:lvl>
   </w:abstractNum>
-  <w:abstractNum w:abstractNumId="13" w15:restartNumberingAfterBreak="0">
+  <w:abstractNum w:abstractNumId="14" w15:restartNumberingAfterBreak="0">
     <w:nsid w:val="65D73831"/>
     <w:multiLevelType w:val="hybridMultilevel"/>
     <w:tmpl w:val="E4ECC72C"/>
@@ -5156,7 +5043,7 @@
       </w:pPr>
     </w:lvl>
   </w:abstractNum>
-  <w:abstractNum w:abstractNumId="14" w15:restartNumberingAfterBreak="0">
+  <w:abstractNum w:abstractNumId="15" w15:restartNumberingAfterBreak="0">
     <w:nsid w:val="7D3E0A88"/>
     <w:multiLevelType w:val="hybridMultilevel"/>
     <w:tmpl w:val="65B66822"/>
@@ -5269,7 +5156,7 @@
       </w:rPr>
     </w:lvl>
   </w:abstractNum>
-  <w:abstractNum w:abstractNumId="15" w15:restartNumberingAfterBreak="0">
+  <w:abstractNum w:abstractNumId="16" w15:restartNumberingAfterBreak="0">
     <w:nsid w:val="7F9D070E"/>
     <w:multiLevelType w:val="hybridMultilevel"/>
     <w:tmpl w:val="8F88FCDC"/>
@@ -5386,16 +5273,16 @@
     <w:abstractNumId w:val="7"/>
   </w:num>
   <w:num w:numId="2" w16cid:durableId="1497963572">
-    <w:abstractNumId w:val="9"/>
+    <w:abstractNumId w:val="10"/>
   </w:num>
   <w:num w:numId="3" w16cid:durableId="1623340168">
-    <w:abstractNumId w:val="10"/>
+    <w:abstractNumId w:val="11"/>
   </w:num>
   <w:num w:numId="4" w16cid:durableId="94057243">
     <w:abstractNumId w:val="3"/>
   </w:num>
   <w:num w:numId="5" w16cid:durableId="638342496">
-    <w:abstractNumId w:val="12"/>
+    <w:abstractNumId w:val="13"/>
   </w:num>
   <w:num w:numId="6" w16cid:durableId="1074162348">
     <w:abstractNumId w:val="2"/>
@@ -5407,16 +5294,16 @@
     <w:abstractNumId w:val="1"/>
   </w:num>
   <w:num w:numId="9" w16cid:durableId="1135215662">
-    <w:abstractNumId w:val="15"/>
+    <w:abstractNumId w:val="16"/>
   </w:num>
   <w:num w:numId="10" w16cid:durableId="774789966">
-    <w:abstractNumId w:val="8"/>
+    <w:abstractNumId w:val="9"/>
   </w:num>
   <w:num w:numId="11" w16cid:durableId="700396110">
     <w:abstractNumId w:val="4"/>
   </w:num>
   <w:num w:numId="12" w16cid:durableId="16583779">
-    <w:abstractNumId w:val="13"/>
+    <w:abstractNumId w:val="14"/>
   </w:num>
   <w:num w:numId="13" w16cid:durableId="1894541156">
     <w:abstractNumId w:val="5"/>
@@ -5425,10 +5312,13 @@
     <w:abstractNumId w:val="6"/>
   </w:num>
   <w:num w:numId="15" w16cid:durableId="1238828395">
-    <w:abstractNumId w:val="11"/>
+    <w:abstractNumId w:val="12"/>
   </w:num>
   <w:num w:numId="16" w16cid:durableId="2127573985">
-    <w:abstractNumId w:val="14"/>
+    <w:abstractNumId w:val="15"/>
+  </w:num>
+  <w:num w:numId="17" w16cid:durableId="386031212">
+    <w:abstractNumId w:val="8"/>
   </w:num>
 </w:numbering>
 </file>

</xml_diff>

<commit_message>
Updated column references for new format
</commit_message>
<xml_diff>
--- a/Admin/Earnings Advantage Work Flow Doc.docx
+++ b/Admin/Earnings Advantage Work Flow Doc.docx
@@ -95,31 +95,7 @@
           <w:szCs w:val="32"/>
           <w:u w:val="single"/>
         </w:rPr>
-        <w:t xml:space="preserve">Earnings Advantage </w:t>
-      </w:r>
-      <w:proofErr w:type="gramStart"/>
-      <w:r>
-        <w:rPr>
-          <w:b/>
-          <w:bCs/>
-          <w:color w:val="4EA72E" w:themeColor="accent6"/>
-          <w:sz w:val="32"/>
-          <w:szCs w:val="32"/>
-          <w:u w:val="single"/>
-        </w:rPr>
-        <w:t>Work Flow</w:t>
-      </w:r>
-      <w:proofErr w:type="gramEnd"/>
-      <w:r>
-        <w:rPr>
-          <w:b/>
-          <w:bCs/>
-          <w:color w:val="4EA72E" w:themeColor="accent6"/>
-          <w:sz w:val="32"/>
-          <w:szCs w:val="32"/>
-          <w:u w:val="single"/>
-        </w:rPr>
-        <w:t>:</w:t>
+        <w:t>Earnings Advantage Work Flow:</w:t>
       </w:r>
     </w:p>
     <w:p>
@@ -140,15 +116,7 @@
           <w:sz w:val="22"/>
           <w:szCs w:val="22"/>
         </w:rPr>
-        <w:t xml:space="preserve">Update earnings </w:t>
-      </w:r>
-      <w:proofErr w:type="gramStart"/>
-      <w:r>
-        <w:rPr>
-          <w:sz w:val="22"/>
-          <w:szCs w:val="22"/>
-        </w:rPr>
-        <w:t>date</w:t>
+        <w:t>Update earnings date</w:t>
       </w:r>
       <w:r>
         <w:rPr>
@@ -157,13 +125,47 @@
         </w:rPr>
         <w:t>s</w:t>
       </w:r>
-      <w:proofErr w:type="gramEnd"/>
-      <w:r>
-        <w:rPr>
-          <w:sz w:val="22"/>
-          <w:szCs w:val="22"/>
-        </w:rPr>
-        <w:t xml:space="preserve"> each Friday AMC.</w:t>
+      <w:r>
+        <w:rPr>
+          <w:sz w:val="22"/>
+          <w:szCs w:val="22"/>
+        </w:rPr>
+        <w:t xml:space="preserve"> each </w:t>
+      </w:r>
+      <w:r>
+        <w:rPr>
+          <w:sz w:val="22"/>
+          <w:szCs w:val="22"/>
+        </w:rPr>
+        <w:t>week</w:t>
+      </w:r>
+      <w:r>
+        <w:rPr>
+          <w:sz w:val="22"/>
+          <w:szCs w:val="22"/>
+        </w:rPr>
+        <w:t>.</w:t>
+      </w:r>
+    </w:p>
+    <w:p>
+      <w:pPr>
+        <w:pStyle w:val="ListParagraph"/>
+        <w:numPr>
+          <w:ilvl w:val="0"/>
+          <w:numId w:val="16"/>
+        </w:numPr>
+        <w:ind w:left="630"/>
+        <w:rPr>
+          <w:sz w:val="22"/>
+          <w:szCs w:val="22"/>
+        </w:rPr>
+      </w:pPr>
+      <w:r>
+        <w:rPr>
+          <w:sz w:val="22"/>
+          <w:szCs w:val="22"/>
+        </w:rPr>
+        <w:t>Schwab_Auth runs Sunday at 5PM.</w:t>
       </w:r>
     </w:p>
     <w:p>
@@ -244,7 +246,6 @@
         </w:rPr>
         <w:t xml:space="preserve">Run </w:t>
       </w:r>
-      <w:proofErr w:type="spellStart"/>
       <w:r>
         <w:rPr>
           <w:b/>
@@ -254,7 +255,6 @@
         </w:rPr>
         <w:t>Open_Trades_ToS</w:t>
       </w:r>
-      <w:proofErr w:type="spellEnd"/>
     </w:p>
     <w:p>
       <w:pPr>
@@ -277,7 +277,6 @@
         </w:rPr>
         <w:t xml:space="preserve">Run </w:t>
       </w:r>
-      <w:proofErr w:type="spellStart"/>
       <w:r>
         <w:rPr>
           <w:b/>
@@ -341,7 +340,6 @@
         </w:rPr>
         <w:t>W</w:t>
       </w:r>
-      <w:proofErr w:type="spellEnd"/>
     </w:p>
     <w:p>
       <w:pPr>
@@ -437,68 +435,35 @@
       </w:pPr>
       <w:r>
         <w:rPr>
-          <w:b/>
-          <w:bCs/>
-          <w:sz w:val="22"/>
-          <w:szCs w:val="22"/>
-          <w:u w:val="single"/>
-        </w:rPr>
-        <w:t>Prep:</w:t>
-      </w:r>
-      <w:r>
-        <w:rPr>
-          <w:sz w:val="22"/>
-          <w:szCs w:val="22"/>
-        </w:rPr>
-        <w:t xml:space="preserve"> </w:t>
-      </w:r>
-      <w:r>
-        <w:rPr>
-          <w:sz w:val="22"/>
-          <w:szCs w:val="22"/>
-        </w:rPr>
-        <w:t>Ensure</w:t>
-      </w:r>
-      <w:r>
-        <w:rPr>
-          <w:sz w:val="22"/>
-          <w:szCs w:val="22"/>
-        </w:rPr>
-        <w:t xml:space="preserve"> </w:t>
-      </w:r>
-      <w:proofErr w:type="spellStart"/>
-      <w:r>
-        <w:rPr>
-          <w:i/>
-          <w:iCs/>
-          <w:color w:val="0F9ED5" w:themeColor="accent4"/>
-          <w:sz w:val="22"/>
-          <w:szCs w:val="22"/>
-        </w:rPr>
-        <w:t>Live_Trade_Info</w:t>
-      </w:r>
-      <w:proofErr w:type="spellEnd"/>
-      <w:r>
-        <w:rPr>
-          <w:color w:val="0F9ED5" w:themeColor="accent4"/>
-          <w:sz w:val="22"/>
-          <w:szCs w:val="22"/>
-        </w:rPr>
-        <w:t xml:space="preserve"> </w:t>
-      </w:r>
-      <w:r>
-        <w:rPr>
-          <w:sz w:val="22"/>
-          <w:szCs w:val="22"/>
-        </w:rPr>
-        <w:t>is populated</w:t>
-      </w:r>
-      <w:r>
-        <w:rPr>
-          <w:sz w:val="22"/>
-          <w:szCs w:val="22"/>
-        </w:rPr>
-        <w:t>.</w:t>
+          <w:sz w:val="22"/>
+          <w:szCs w:val="22"/>
+        </w:rPr>
+        <w:t>R</w:t>
+      </w:r>
+      <w:r>
+        <w:rPr>
+          <w:sz w:val="22"/>
+          <w:szCs w:val="22"/>
+        </w:rPr>
+        <w:t xml:space="preserve">un </w:t>
+      </w:r>
+      <w:r>
+        <w:rPr>
+          <w:b/>
+          <w:bCs/>
+          <w:sz w:val="22"/>
+          <w:szCs w:val="22"/>
+        </w:rPr>
+        <w:t>Exit_</w:t>
+      </w:r>
+      <w:r>
+        <w:rPr>
+          <w:b/>
+          <w:bCs/>
+          <w:sz w:val="22"/>
+          <w:szCs w:val="22"/>
+        </w:rPr>
+        <w:t>ToS</w:t>
       </w:r>
     </w:p>
     <w:p>
@@ -527,7 +492,6 @@
         </w:rPr>
         <w:t xml:space="preserve">un </w:t>
       </w:r>
-      <w:proofErr w:type="spellStart"/>
       <w:r>
         <w:rPr>
           <w:b/>
@@ -544,53 +508,6 @@
           <w:sz w:val="22"/>
           <w:szCs w:val="22"/>
         </w:rPr>
-        <w:t>ToS</w:t>
-      </w:r>
-      <w:proofErr w:type="spellEnd"/>
-    </w:p>
-    <w:p>
-      <w:pPr>
-        <w:pStyle w:val="ListParagraph"/>
-        <w:numPr>
-          <w:ilvl w:val="0"/>
-          <w:numId w:val="13"/>
-        </w:numPr>
-        <w:rPr>
-          <w:sz w:val="22"/>
-          <w:szCs w:val="22"/>
-        </w:rPr>
-      </w:pPr>
-      <w:r>
-        <w:rPr>
-          <w:sz w:val="22"/>
-          <w:szCs w:val="22"/>
-        </w:rPr>
-        <w:t>R</w:t>
-      </w:r>
-      <w:r>
-        <w:rPr>
-          <w:sz w:val="22"/>
-          <w:szCs w:val="22"/>
-        </w:rPr>
-        <w:t xml:space="preserve">un </w:t>
-      </w:r>
-      <w:proofErr w:type="spellStart"/>
-      <w:r>
-        <w:rPr>
-          <w:b/>
-          <w:bCs/>
-          <w:sz w:val="22"/>
-          <w:szCs w:val="22"/>
-        </w:rPr>
-        <w:t>Exit_</w:t>
-      </w:r>
-      <w:r>
-        <w:rPr>
-          <w:b/>
-          <w:bCs/>
-          <w:sz w:val="22"/>
-          <w:szCs w:val="22"/>
-        </w:rPr>
         <w:t>IB</w:t>
       </w:r>
       <w:r>
@@ -611,7 +528,6 @@
         </w:rPr>
         <w:t>via_GW</w:t>
       </w:r>
-      <w:proofErr w:type="spellEnd"/>
     </w:p>
     <w:p>
       <w:pPr>
@@ -694,63 +610,11 @@
       </w:pPr>
       <w:r>
         <w:rPr>
-          <w:b/>
-          <w:bCs/>
-          <w:sz w:val="22"/>
-          <w:szCs w:val="22"/>
-          <w:u w:val="single"/>
-        </w:rPr>
-        <w:t>Prep:</w:t>
-      </w:r>
-      <w:r>
-        <w:rPr>
-          <w:sz w:val="22"/>
-          <w:szCs w:val="22"/>
-        </w:rPr>
-        <w:t xml:space="preserve"> Flag you</w:t>
-      </w:r>
-      <w:r>
-        <w:rPr>
-          <w:sz w:val="22"/>
-          <w:szCs w:val="22"/>
-        </w:rPr>
-        <w:t>r</w:t>
-      </w:r>
-      <w:r>
-        <w:rPr>
-          <w:sz w:val="22"/>
-          <w:szCs w:val="22"/>
-        </w:rPr>
-        <w:t xml:space="preserve"> opening price range</w:t>
-      </w:r>
-      <w:r>
-        <w:rPr>
-          <w:sz w:val="22"/>
-          <w:szCs w:val="22"/>
-        </w:rPr>
-        <w:t>.</w:t>
-      </w:r>
-    </w:p>
-    <w:p>
-      <w:pPr>
-        <w:pStyle w:val="ListParagraph"/>
-        <w:numPr>
-          <w:ilvl w:val="0"/>
-          <w:numId w:val="4"/>
-        </w:numPr>
-        <w:rPr>
-          <w:sz w:val="22"/>
-          <w:szCs w:val="22"/>
-        </w:rPr>
-      </w:pPr>
-      <w:r>
-        <w:rPr>
           <w:sz w:val="22"/>
           <w:szCs w:val="22"/>
         </w:rPr>
         <w:t xml:space="preserve">Run </w:t>
       </w:r>
-      <w:proofErr w:type="spellStart"/>
       <w:r>
         <w:rPr>
           <w:b/>
@@ -778,7 +642,6 @@
         </w:rPr>
         <w:t>IB</w:t>
       </w:r>
-      <w:proofErr w:type="spellEnd"/>
     </w:p>
     <w:p>
       <w:pPr>
@@ -887,36 +750,6 @@
       </w:pPr>
       <w:r>
         <w:rPr>
-          <w:b/>
-          <w:bCs/>
-          <w:sz w:val="22"/>
-          <w:szCs w:val="22"/>
-          <w:u w:val="single"/>
-        </w:rPr>
-        <w:t>Prep:</w:t>
-      </w:r>
-      <w:r>
-        <w:rPr>
-          <w:sz w:val="22"/>
-          <w:szCs w:val="22"/>
-        </w:rPr>
-        <w:t xml:space="preserve"> Flag you MOC2, MOC, and Close ranges.</w:t>
-      </w:r>
-    </w:p>
-    <w:p>
-      <w:pPr>
-        <w:pStyle w:val="ListParagraph"/>
-        <w:numPr>
-          <w:ilvl w:val="0"/>
-          <w:numId w:val="14"/>
-        </w:numPr>
-        <w:rPr>
-          <w:sz w:val="22"/>
-          <w:szCs w:val="22"/>
-        </w:rPr>
-      </w:pPr>
-      <w:r>
-        <w:rPr>
           <w:sz w:val="22"/>
           <w:szCs w:val="22"/>
         </w:rPr>
@@ -929,7 +762,6 @@
         </w:rPr>
         <w:t xml:space="preserve"> </w:t>
       </w:r>
-      <w:proofErr w:type="spellStart"/>
       <w:r>
         <w:rPr>
           <w:b/>
@@ -966,7 +798,6 @@
         </w:rPr>
         <w:t>IB</w:t>
       </w:r>
-      <w:proofErr w:type="spellEnd"/>
     </w:p>
     <w:p>
       <w:pPr>
@@ -1047,7 +878,6 @@
           <w:szCs w:val="22"/>
         </w:rPr>
       </w:pPr>
-      <w:proofErr w:type="spellStart"/>
       <w:r>
         <w:rPr>
           <w:b/>
@@ -1056,59 +886,14 @@
           <w:szCs w:val="22"/>
           <w:u w:val="single"/>
         </w:rPr>
-        <w:t>Prereq</w:t>
-      </w:r>
-      <w:proofErr w:type="spellEnd"/>
-      <w:proofErr w:type="gramStart"/>
-      <w:r>
-        <w:rPr>
-          <w:b/>
-          <w:bCs/>
-          <w:sz w:val="22"/>
-          <w:szCs w:val="22"/>
-          <w:u w:val="single"/>
-        </w:rPr>
-        <w:t>:</w:t>
-      </w:r>
-      <w:r>
-        <w:rPr>
-          <w:sz w:val="22"/>
-          <w:szCs w:val="22"/>
-        </w:rPr>
-        <w:t xml:space="preserve">  Exit</w:t>
-      </w:r>
-      <w:proofErr w:type="gramEnd"/>
-      <w:r>
-        <w:rPr>
-          <w:sz w:val="22"/>
-          <w:szCs w:val="22"/>
-        </w:rPr>
-        <w:t xml:space="preserve"> orders for open </w:t>
-      </w:r>
-      <w:proofErr w:type="gramStart"/>
-      <w:r>
-        <w:rPr>
-          <w:sz w:val="22"/>
-          <w:szCs w:val="22"/>
-        </w:rPr>
-        <w:t>p[</w:t>
-      </w:r>
-      <w:proofErr w:type="spellStart"/>
-      <w:proofErr w:type="gramEnd"/>
-      <w:r>
-        <w:rPr>
-          <w:sz w:val="22"/>
-          <w:szCs w:val="22"/>
-        </w:rPr>
-        <w:t>osition</w:t>
-      </w:r>
-      <w:proofErr w:type="spellEnd"/>
-      <w:r>
-        <w:rPr>
-          <w:sz w:val="22"/>
-          <w:szCs w:val="22"/>
-        </w:rPr>
-        <w:t xml:space="preserve"> must be sent first for the day.</w:t>
+        <w:t>Prereq:</w:t>
+      </w:r>
+      <w:r>
+        <w:rPr>
+          <w:sz w:val="22"/>
+          <w:szCs w:val="22"/>
+        </w:rPr>
+        <w:t xml:space="preserve">  Exit orders for open position must be sent first for the day.</w:t>
       </w:r>
     </w:p>
     <w:p>
@@ -1138,7 +923,14 @@
           <w:sz w:val="22"/>
           <w:szCs w:val="22"/>
         </w:rPr>
-        <w:t xml:space="preserve"> Flag all trades with a “T”.</w:t>
+        <w:t xml:space="preserve"> Flag all trades with a “T”</w:t>
+      </w:r>
+      <w:r>
+        <w:rPr>
+          <w:sz w:val="22"/>
+          <w:szCs w:val="22"/>
+        </w:rPr>
+        <w:t xml:space="preserve"> and change opening and closing price range.</w:t>
       </w:r>
     </w:p>
     <w:p>
@@ -1227,7 +1019,6 @@
         </w:rPr>
         <w:t xml:space="preserve"> </w:t>
       </w:r>
-      <w:proofErr w:type="spellStart"/>
       <w:r>
         <w:rPr>
           <w:b/>
@@ -1237,7 +1028,6 @@
         </w:rPr>
         <w:t>Stage_Trades_Auto</w:t>
       </w:r>
-      <w:proofErr w:type="spellEnd"/>
       <w:r>
         <w:rPr>
           <w:sz w:val="22"/>
@@ -1646,166 +1436,9 @@
           <w:noProof/>
         </w:rPr>
         <mc:AlternateContent>
-          <mc:Choice Requires="wpg">
-            <w:drawing>
-              <wp:anchor distT="0" distB="0" distL="114300" distR="114300" simplePos="0" relativeHeight="251701248" behindDoc="0" locked="0" layoutInCell="1" allowOverlap="1" wp14:anchorId="4A8FF138" wp14:editId="6CD4A100">
-                <wp:simplePos x="0" y="0"/>
-                <wp:positionH relativeFrom="column">
-                  <wp:posOffset>3042920</wp:posOffset>
-                </wp:positionH>
-                <wp:positionV relativeFrom="paragraph">
-                  <wp:posOffset>215900</wp:posOffset>
-                </wp:positionV>
-                <wp:extent cx="314325" cy="914400"/>
-                <wp:effectExtent l="0" t="0" r="9525" b="19050"/>
-                <wp:wrapNone/>
-                <wp:docPr id="1700941268" name="Group 21"/>
-                <wp:cNvGraphicFramePr/>
-                <a:graphic xmlns:a="http://schemas.openxmlformats.org/drawingml/2006/main">
-                  <a:graphicData uri="http://schemas.microsoft.com/office/word/2010/wordprocessingGroup">
-                    <wpg:wgp>
-                      <wpg:cNvGrpSpPr/>
-                      <wpg:grpSpPr>
-                        <a:xfrm>
-                          <a:off x="0" y="0"/>
-                          <a:ext cx="314325" cy="914400"/>
-                          <a:chOff x="0" y="0"/>
-                          <a:chExt cx="314325" cy="914400"/>
-                        </a:xfrm>
-                      </wpg:grpSpPr>
-                      <wps:wsp>
-                        <wps:cNvPr id="1913799266" name="Text Box 9"/>
-                        <wps:cNvSpPr txBox="1"/>
-                        <wps:spPr>
-                          <a:xfrm>
-                            <a:off x="0" y="14630"/>
-                            <a:ext cx="314325" cy="123825"/>
-                          </a:xfrm>
-                          <a:prstGeom prst="rect">
-                            <a:avLst/>
-                          </a:prstGeom>
-                          <a:noFill/>
-                          <a:ln w="6350">
-                            <a:noFill/>
-                          </a:ln>
-                        </wps:spPr>
-                        <wps:txbx>
-                          <w:txbxContent>
-                            <w:p>
-                              <w:pPr>
-                                <w:rPr>
-                                  <w:color w:val="215E99" w:themeColor="text2" w:themeTint="BF"/>
-                                  <w:sz w:val="14"/>
-                                  <w:szCs w:val="14"/>
-                                </w:rPr>
-                              </w:pPr>
-                              <w:r>
-                                <w:rPr>
-                                  <w:color w:val="215E99" w:themeColor="text2" w:themeTint="BF"/>
-                                  <w:sz w:val="14"/>
-                                  <w:szCs w:val="14"/>
-                                </w:rPr>
-                                <w:t>Exit</w:t>
-                              </w:r>
-                            </w:p>
-                          </w:txbxContent>
-                        </wps:txbx>
-                        <wps:bodyPr rot="0" spcFirstLastPara="0" vertOverflow="overflow" horzOverflow="overflow" vert="horz" wrap="square" lIns="0" tIns="0" rIns="0" bIns="0" numCol="1" spcCol="0" rtlCol="0" fromWordArt="0" anchor="t" anchorCtr="0" forceAA="0" compatLnSpc="1">
-                          <a:prstTxWarp prst="textNoShape">
-                            <a:avLst/>
-                          </a:prstTxWarp>
-                          <a:noAutofit/>
-                        </wps:bodyPr>
-                      </wps:wsp>
-                      <wps:wsp>
-                        <wps:cNvPr id="528175533" name="Straight Connector 8"/>
-                        <wps:cNvCnPr/>
-                        <wps:spPr>
-                          <a:xfrm>
-                            <a:off x="197510" y="0"/>
-                            <a:ext cx="0" cy="914400"/>
-                          </a:xfrm>
-                          <a:prstGeom prst="line">
-                            <a:avLst/>
-                          </a:prstGeom>
-                          <a:ln>
-                            <a:solidFill>
-                              <a:schemeClr val="tx2">
-                                <a:lumMod val="75000"/>
-                                <a:lumOff val="25000"/>
-                              </a:schemeClr>
-                            </a:solidFill>
-                            <a:prstDash val="dash"/>
-                          </a:ln>
-                        </wps:spPr>
-                        <wps:style>
-                          <a:lnRef idx="1">
-                            <a:schemeClr val="accent1"/>
-                          </a:lnRef>
-                          <a:fillRef idx="0">
-                            <a:schemeClr val="accent1"/>
-                          </a:fillRef>
-                          <a:effectRef idx="0">
-                            <a:schemeClr val="accent1"/>
-                          </a:effectRef>
-                          <a:fontRef idx="minor">
-                            <a:schemeClr val="tx1"/>
-                          </a:fontRef>
-                        </wps:style>
-                        <wps:bodyPr/>
-                      </wps:wsp>
-                    </wpg:wgp>
-                  </a:graphicData>
-                </a:graphic>
-              </wp:anchor>
-            </w:drawing>
-          </mc:Choice>
-          <mc:Fallback>
-            <w:pict>
-              <v:group w14:anchorId="4A8FF138" id="Group 21" o:spid="_x0000_s1027" style="position:absolute;left:0;text-align:left;margin-left:239.6pt;margin-top:17pt;width:24.75pt;height:1in;z-index:251701248" coordsize="3143,9144" o:gfxdata="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">
-                <v:shapetype id="_x0000_t202" coordsize="21600,21600" o:spt="202" path="m,l,21600r21600,l21600,xe">
-                  <v:stroke joinstyle="miter"/>
-                  <v:path gradientshapeok="t" o:connecttype="rect"/>
-                </v:shapetype>
-                <v:shape id="_x0000_s1028" type="#_x0000_t202" style="position:absolute;top:146;width:3143;height:1238;visibility:visible;mso-wrap-style:square;v-text-anchor:top" o:gfxdata="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" filled="f" stroked="f" strokeweight=".5pt">
-                  <v:textbox inset="0,0,0,0">
-                    <w:txbxContent>
-                      <w:p>
-                        <w:pPr>
-                          <w:rPr>
-                            <w:color w:val="215E99" w:themeColor="text2" w:themeTint="BF"/>
-                            <w:sz w:val="14"/>
-                            <w:szCs w:val="14"/>
-                          </w:rPr>
-                        </w:pPr>
-                        <w:r>
-                          <w:rPr>
-                            <w:color w:val="215E99" w:themeColor="text2" w:themeTint="BF"/>
-                            <w:sz w:val="14"/>
-                            <w:szCs w:val="14"/>
-                          </w:rPr>
-                          <w:t>Exit</w:t>
-                        </w:r>
-                      </w:p>
-                    </w:txbxContent>
-                  </v:textbox>
-                </v:shape>
-                <v:line id="Straight Connector 8" o:spid="_x0000_s1029" style="position:absolute;visibility:visible;mso-wrap-style:square" from="1975,0" to="1975,9144" o:connectortype="straight" o:gfxdata="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" strokecolor="#215e99 [2431]" strokeweight=".5pt">
-                  <v:stroke dashstyle="dash" joinstyle="miter"/>
-                </v:line>
-              </v:group>
-            </w:pict>
-          </mc:Fallback>
-        </mc:AlternateContent>
-      </w:r>
-      <w:r>
-        <w:rPr>
-          <w:noProof/>
-        </w:rPr>
-        <mc:AlternateContent>
           <mc:Choice Requires="wps">
             <w:drawing>
-              <wp:anchor distT="0" distB="0" distL="114300" distR="114300" simplePos="0" relativeHeight="251694080" behindDoc="0" locked="0" layoutInCell="1" allowOverlap="1" wp14:anchorId="41530CCC" wp14:editId="667D37DA">
+              <wp:anchor distT="0" distB="0" distL="114300" distR="114300" simplePos="0" relativeHeight="251694080" behindDoc="0" locked="0" layoutInCell="1" allowOverlap="1" wp14:anchorId="41530CCC" wp14:editId="0B5238D5">
                 <wp:simplePos x="0" y="0"/>
                 <wp:positionH relativeFrom="column">
                   <wp:posOffset>2652395</wp:posOffset>
@@ -1942,7 +1575,7 @@
           </mc:Choice>
           <mc:Fallback>
             <w:pict>
-              <v:roundrect w14:anchorId="41530CCC" id="_x0000_s1030" style="position:absolute;left:0;text-align:left;margin-left:208.85pt;margin-top:31.2pt;width:43.2pt;height:43.2pt;z-index:251694080;visibility:visible;mso-wrap-style:square;mso-width-percent:0;mso-height-percent:0;mso-wrap-distance-left:9pt;mso-wrap-distance-top:0;mso-wrap-distance-right:9pt;mso-wrap-distance-bottom:0;mso-position-horizontal:absolute;mso-position-horizontal-relative:text;mso-position-vertical:absolute;mso-position-vertical-relative:text;mso-width-percent:0;mso-height-percent:0;mso-width-relative:margin;mso-height-relative:margin;v-text-anchor:middle" arcsize="10923f" o:gfxdata="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" fillcolor="#4ea72e [3209]" strokecolor="#0b1807 [489]" strokeweight="1pt">
+              <v:roundrect w14:anchorId="41530CCC" id="_x0000_s1027" style="position:absolute;left:0;text-align:left;margin-left:208.85pt;margin-top:31.2pt;width:43.2pt;height:43.2pt;z-index:251694080;visibility:visible;mso-wrap-style:square;mso-width-percent:0;mso-height-percent:0;mso-wrap-distance-left:9pt;mso-wrap-distance-top:0;mso-wrap-distance-right:9pt;mso-wrap-distance-bottom:0;mso-position-horizontal:absolute;mso-position-horizontal-relative:text;mso-position-vertical:absolute;mso-position-vertical-relative:text;mso-width-percent:0;mso-height-percent:0;mso-width-relative:margin;mso-height-relative:margin;v-text-anchor:middle" arcsize="10923f" o:gfxdata="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" fillcolor="#4ea72e [3209]" strokecolor="#0b1807 [489]" strokeweight="1pt">
                 <v:stroke joinstyle="miter"/>
                 <v:textbox inset="0,0,0,0">
                   <w:txbxContent>
@@ -2210,7 +1843,7 @@
           </mc:Choice>
           <mc:Fallback>
             <w:pict>
-              <v:roundrect w14:anchorId="57F13C5B" id="_x0000_s1031" style="position:absolute;left:0;text-align:left;margin-left:63pt;margin-top:31.25pt;width:43.2pt;height:43.2pt;z-index:251677696;visibility:visible;mso-wrap-style:square;mso-width-percent:0;mso-height-percent:0;mso-wrap-distance-left:9pt;mso-wrap-distance-top:0;mso-wrap-distance-right:9pt;mso-wrap-distance-bottom:0;mso-position-horizontal:absolute;mso-position-horizontal-relative:text;mso-position-vertical:absolute;mso-position-vertical-relative:text;mso-width-percent:0;mso-height-percent:0;mso-width-relative:margin;mso-height-relative:margin;v-text-anchor:middle" arcsize="10923f" o:gfxdata="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" fillcolor="#4ea72e [3209]" strokecolor="#0b1807 [489]" strokeweight="1pt">
+              <v:roundrect w14:anchorId="57F13C5B" id="_x0000_s1028" style="position:absolute;left:0;text-align:left;margin-left:63pt;margin-top:31.25pt;width:43.2pt;height:43.2pt;z-index:251677696;visibility:visible;mso-wrap-style:square;mso-width-percent:0;mso-height-percent:0;mso-wrap-distance-left:9pt;mso-wrap-distance-top:0;mso-wrap-distance-right:9pt;mso-wrap-distance-bottom:0;mso-position-horizontal:absolute;mso-position-horizontal-relative:text;mso-position-vertical:absolute;mso-position-vertical-relative:text;mso-width-percent:0;mso-height-percent:0;mso-width-relative:margin;mso-height-relative:margin;v-text-anchor:middle" arcsize="10923f" o:gfxdata="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" fillcolor="#4ea72e [3209]" strokecolor="#0b1807 [489]" strokeweight="1pt">
                 <v:stroke joinstyle="miter"/>
                 <v:textbox inset="0,0,0,0">
                   <w:txbxContent>
@@ -2605,7 +2238,7 @@
           </mc:Choice>
           <mc:Fallback>
             <w:pict>
-              <v:roundrect w14:anchorId="5BB26D04" id="_x0000_s1032" style="position:absolute;left:0;text-align:left;margin-left:135.25pt;margin-top:31.05pt;width:43.2pt;height:43.2pt;z-index:251667456;visibility:visible;mso-wrap-style:square;mso-width-percent:0;mso-height-percent:0;mso-wrap-distance-left:9pt;mso-wrap-distance-top:0;mso-wrap-distance-right:9pt;mso-wrap-distance-bottom:0;mso-position-horizontal:absolute;mso-position-horizontal-relative:text;mso-position-vertical:absolute;mso-position-vertical-relative:text;mso-width-percent:0;mso-height-percent:0;mso-width-relative:margin;mso-height-relative:margin;v-text-anchor:middle" arcsize="10923f" o:gfxdata="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" fillcolor="#4ea72e [3209]" strokecolor="#0b1807 [489]" strokeweight="1pt">
+              <v:roundrect w14:anchorId="5BB26D04" id="_x0000_s1029" style="position:absolute;left:0;text-align:left;margin-left:135.25pt;margin-top:31.05pt;width:43.2pt;height:43.2pt;z-index:251667456;visibility:visible;mso-wrap-style:square;mso-width-percent:0;mso-height-percent:0;mso-wrap-distance-left:9pt;mso-wrap-distance-top:0;mso-wrap-distance-right:9pt;mso-wrap-distance-bottom:0;mso-position-horizontal:absolute;mso-position-horizontal-relative:text;mso-position-vertical:absolute;mso-position-vertical-relative:text;mso-width-percent:0;mso-height-percent:0;mso-width-relative:margin;mso-height-relative:margin;v-text-anchor:middle" arcsize="10923f" o:gfxdata="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" fillcolor="#4ea72e [3209]" strokecolor="#0b1807 [489]" strokeweight="1pt">
                 <v:stroke joinstyle="miter"/>
                 <v:textbox inset="0,0,0,0">
                   <w:txbxContent>
@@ -2967,7 +2600,11 @@
           </mc:Choice>
           <mc:Fallback>
             <w:pict>
-              <v:shape w14:anchorId="32B14FCA" id="Text Box 9" o:spid="_x0000_s1033" type="#_x0000_t202" style="position:absolute;left:0;text-align:left;margin-left:187.05pt;margin-top:18.25pt;width:20.15pt;height:10.3pt;z-index:251696128;visibility:visible;mso-wrap-style:square;mso-width-percent:0;mso-height-percent:0;mso-wrap-distance-left:9pt;mso-wrap-distance-top:0;mso-wrap-distance-right:9pt;mso-wrap-distance-bottom:0;mso-position-horizontal:absolute;mso-position-horizontal-relative:text;mso-position-vertical:absolute;mso-position-vertical-relative:text;mso-width-percent:0;mso-height-percent:0;mso-width-relative:margin;mso-height-relative:margin;v-text-anchor:top" o:gfxdata="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" filled="f" stroked="f" strokeweight=".5pt">
+              <v:shapetype w14:anchorId="32B14FCA" id="_x0000_t202" coordsize="21600,21600" o:spt="202" path="m,l,21600r21600,l21600,xe">
+                <v:stroke joinstyle="miter"/>
+                <v:path gradientshapeok="t" o:connecttype="rect"/>
+              </v:shapetype>
+              <v:shape id="Text Box 9" o:spid="_x0000_s1030" type="#_x0000_t202" style="position:absolute;left:0;text-align:left;margin-left:187.05pt;margin-top:18.25pt;width:20.15pt;height:10.3pt;z-index:251696128;visibility:visible;mso-wrap-style:square;mso-width-percent:0;mso-height-percent:0;mso-wrap-distance-left:9pt;mso-wrap-distance-top:0;mso-wrap-distance-right:9pt;mso-wrap-distance-bottom:0;mso-position-horizontal:absolute;mso-position-horizontal-relative:text;mso-position-vertical:absolute;mso-position-vertical-relative:text;mso-width-percent:0;mso-height-percent:0;mso-width-relative:margin;mso-height-relative:margin;v-text-anchor:top" o:gfxdata="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" filled="f" stroked="f" strokeweight=".5pt">
                 <v:textbox inset="0,0,0,0">
                   <w:txbxContent>
                     <w:p>
@@ -3080,6 +2717,159 @@
           <w:szCs w:val="22"/>
         </w:rPr>
       </w:pPr>
+      <w:r>
+        <w:rPr>
+          <w:noProof/>
+        </w:rPr>
+        <mc:AlternateContent>
+          <mc:Choice Requires="wpg">
+            <w:drawing>
+              <wp:anchor distT="0" distB="0" distL="114300" distR="114300" simplePos="0" relativeHeight="251701248" behindDoc="0" locked="0" layoutInCell="1" allowOverlap="1" wp14:anchorId="4A8FF138" wp14:editId="2829F7AE">
+                <wp:simplePos x="0" y="0"/>
+                <wp:positionH relativeFrom="column">
+                  <wp:posOffset>3050235</wp:posOffset>
+                </wp:positionH>
+                <wp:positionV relativeFrom="paragraph">
+                  <wp:posOffset>11100</wp:posOffset>
+                </wp:positionV>
+                <wp:extent cx="314325" cy="914400"/>
+                <wp:effectExtent l="0" t="0" r="9525" b="19050"/>
+                <wp:wrapNone/>
+                <wp:docPr id="1700941268" name="Group 21"/>
+                <wp:cNvGraphicFramePr/>
+                <a:graphic xmlns:a="http://schemas.openxmlformats.org/drawingml/2006/main">
+                  <a:graphicData uri="http://schemas.microsoft.com/office/word/2010/wordprocessingGroup">
+                    <wpg:wgp>
+                      <wpg:cNvGrpSpPr/>
+                      <wpg:grpSpPr>
+                        <a:xfrm>
+                          <a:off x="0" y="0"/>
+                          <a:ext cx="314325" cy="914400"/>
+                          <a:chOff x="0" y="0"/>
+                          <a:chExt cx="314325" cy="914400"/>
+                        </a:xfrm>
+                      </wpg:grpSpPr>
+                      <wps:wsp>
+                        <wps:cNvPr id="1913799266" name="Text Box 9"/>
+                        <wps:cNvSpPr txBox="1"/>
+                        <wps:spPr>
+                          <a:xfrm>
+                            <a:off x="0" y="14630"/>
+                            <a:ext cx="314325" cy="123825"/>
+                          </a:xfrm>
+                          <a:prstGeom prst="rect">
+                            <a:avLst/>
+                          </a:prstGeom>
+                          <a:noFill/>
+                          <a:ln w="6350">
+                            <a:noFill/>
+                          </a:ln>
+                        </wps:spPr>
+                        <wps:txbx>
+                          <w:txbxContent>
+                            <w:p>
+                              <w:pPr>
+                                <w:rPr>
+                                  <w:color w:val="215E99" w:themeColor="text2" w:themeTint="BF"/>
+                                  <w:sz w:val="14"/>
+                                  <w:szCs w:val="14"/>
+                                </w:rPr>
+                              </w:pPr>
+                              <w:r>
+                                <w:rPr>
+                                  <w:color w:val="215E99" w:themeColor="text2" w:themeTint="BF"/>
+                                  <w:sz w:val="14"/>
+                                  <w:szCs w:val="14"/>
+                                </w:rPr>
+                                <w:t>Exit</w:t>
+                              </w:r>
+                            </w:p>
+                          </w:txbxContent>
+                        </wps:txbx>
+                        <wps:bodyPr rot="0" spcFirstLastPara="0" vertOverflow="overflow" horzOverflow="overflow" vert="horz" wrap="square" lIns="0" tIns="0" rIns="0" bIns="0" numCol="1" spcCol="0" rtlCol="0" fromWordArt="0" anchor="t" anchorCtr="0" forceAA="0" compatLnSpc="1">
+                          <a:prstTxWarp prst="textNoShape">
+                            <a:avLst/>
+                          </a:prstTxWarp>
+                          <a:noAutofit/>
+                        </wps:bodyPr>
+                      </wps:wsp>
+                      <wps:wsp>
+                        <wps:cNvPr id="528175533" name="Straight Connector 8"/>
+                        <wps:cNvCnPr/>
+                        <wps:spPr>
+                          <a:xfrm>
+                            <a:off x="197510" y="0"/>
+                            <a:ext cx="0" cy="914400"/>
+                          </a:xfrm>
+                          <a:prstGeom prst="line">
+                            <a:avLst/>
+                          </a:prstGeom>
+                          <a:ln>
+                            <a:solidFill>
+                              <a:schemeClr val="tx2">
+                                <a:lumMod val="75000"/>
+                                <a:lumOff val="25000"/>
+                              </a:schemeClr>
+                            </a:solidFill>
+                            <a:prstDash val="dash"/>
+                          </a:ln>
+                        </wps:spPr>
+                        <wps:style>
+                          <a:lnRef idx="1">
+                            <a:schemeClr val="accent1"/>
+                          </a:lnRef>
+                          <a:fillRef idx="0">
+                            <a:schemeClr val="accent1"/>
+                          </a:fillRef>
+                          <a:effectRef idx="0">
+                            <a:schemeClr val="accent1"/>
+                          </a:effectRef>
+                          <a:fontRef idx="minor">
+                            <a:schemeClr val="tx1"/>
+                          </a:fontRef>
+                        </wps:style>
+                        <wps:bodyPr/>
+                      </wps:wsp>
+                    </wpg:wgp>
+                  </a:graphicData>
+                </a:graphic>
+              </wp:anchor>
+            </w:drawing>
+          </mc:Choice>
+          <mc:Fallback>
+            <w:pict>
+              <v:group w14:anchorId="4A8FF138" id="Group 21" o:spid="_x0000_s1031" style="position:absolute;left:0;text-align:left;margin-left:240.2pt;margin-top:.85pt;width:24.75pt;height:1in;z-index:251701248" coordsize="3143,9144" o:gfxdata="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">
+                <v:shape id="_x0000_s1032" type="#_x0000_t202" style="position:absolute;top:146;width:3143;height:1238;visibility:visible;mso-wrap-style:square;v-text-anchor:top" o:gfxdata="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" filled="f" stroked="f" strokeweight=".5pt">
+                  <v:textbox inset="0,0,0,0">
+                    <w:txbxContent>
+                      <w:p>
+                        <w:pPr>
+                          <w:rPr>
+                            <w:color w:val="215E99" w:themeColor="text2" w:themeTint="BF"/>
+                            <w:sz w:val="14"/>
+                            <w:szCs w:val="14"/>
+                          </w:rPr>
+                        </w:pPr>
+                        <w:r>
+                          <w:rPr>
+                            <w:color w:val="215E99" w:themeColor="text2" w:themeTint="BF"/>
+                            <w:sz w:val="14"/>
+                            <w:szCs w:val="14"/>
+                          </w:rPr>
+                          <w:t>Exit</w:t>
+                        </w:r>
+                      </w:p>
+                    </w:txbxContent>
+                  </v:textbox>
+                </v:shape>
+                <v:line id="Straight Connector 8" o:spid="_x0000_s1033" style="position:absolute;visibility:visible;mso-wrap-style:square" from="1975,0" to="1975,9144" o:connectortype="straight" o:gfxdata="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" strokecolor="#215e99 [2431]" strokeweight=".5pt">
+                  <v:stroke dashstyle="dash" joinstyle="miter"/>
+                </v:line>
+              </v:group>
+            </w:pict>
+          </mc:Fallback>
+        </mc:AlternateContent>
+      </w:r>
       <w:r>
         <w:rPr>
           <w:noProof/>
@@ -3549,6 +3339,658 @@
           <w:szCs w:val="18"/>
           <w:u w:val="single"/>
         </w:rPr>
+        <w:t>Tasks</w:t>
+      </w:r>
+      <w:r>
+        <w:rPr>
+          <w:b/>
+          <w:bCs/>
+          <w:i/>
+          <w:iCs/>
+          <w:sz w:val="18"/>
+          <w:szCs w:val="18"/>
+          <w:u w:val="single"/>
+        </w:rPr>
+        <w:t>:</w:t>
+      </w:r>
+      <w:r>
+        <w:rPr>
+          <w:b/>
+          <w:bCs/>
+          <w:i/>
+          <w:iCs/>
+          <w:sz w:val="18"/>
+          <w:szCs w:val="18"/>
+          <w:u w:val="single"/>
+        </w:rPr>
+        <w:t>___________________________________________________________________________________________________________________________</w:t>
+      </w:r>
+    </w:p>
+    <w:p>
+      <w:pPr>
+        <w:pStyle w:val="ListParagraph"/>
+        <w:numPr>
+          <w:ilvl w:val="0"/>
+          <w:numId w:val="18"/>
+        </w:numPr>
+        <w:rPr>
+          <w:sz w:val="16"/>
+          <w:szCs w:val="16"/>
+        </w:rPr>
+      </w:pPr>
+      <w:r>
+        <w:rPr>
+          <w:b/>
+          <w:bCs/>
+          <w:sz w:val="16"/>
+          <w:szCs w:val="16"/>
+        </w:rPr>
+        <w:t>2:1</w:t>
+      </w:r>
+      <w:r>
+        <w:rPr>
+          <w:b/>
+          <w:bCs/>
+          <w:sz w:val="16"/>
+          <w:szCs w:val="16"/>
+        </w:rPr>
+        <w:t>2</w:t>
+      </w:r>
+      <w:r>
+        <w:rPr>
+          <w:b/>
+          <w:bCs/>
+          <w:sz w:val="16"/>
+          <w:szCs w:val="16"/>
+        </w:rPr>
+        <w:t>, 2:</w:t>
+      </w:r>
+      <w:r>
+        <w:rPr>
+          <w:b/>
+          <w:bCs/>
+          <w:sz w:val="16"/>
+          <w:szCs w:val="16"/>
+        </w:rPr>
+        <w:t>3</w:t>
+      </w:r>
+      <w:r>
+        <w:rPr>
+          <w:b/>
+          <w:bCs/>
+          <w:sz w:val="16"/>
+          <w:szCs w:val="16"/>
+        </w:rPr>
+        <w:t>0</w:t>
+      </w:r>
+      <w:r>
+        <w:rPr>
+          <w:b/>
+          <w:bCs/>
+          <w:sz w:val="16"/>
+          <w:szCs w:val="16"/>
+        </w:rPr>
+        <w:t>,</w:t>
+      </w:r>
+      <w:r>
+        <w:rPr>
+          <w:sz w:val="16"/>
+          <w:szCs w:val="16"/>
+        </w:rPr>
+        <w:t xml:space="preserve"> </w:t>
+      </w:r>
+      <w:r>
+        <w:rPr>
+          <w:sz w:val="16"/>
+          <w:szCs w:val="16"/>
+        </w:rPr>
+        <w:t>Open &amp; Close</w:t>
+      </w:r>
+      <w:r>
+        <w:rPr>
+          <w:sz w:val="16"/>
+          <w:szCs w:val="16"/>
+        </w:rPr>
+        <w:t xml:space="preserve"> Prices</w:t>
+      </w:r>
+      <w:r>
+        <w:rPr>
+          <w:sz w:val="16"/>
+          <w:szCs w:val="16"/>
+        </w:rPr>
+        <w:t xml:space="preserve"> Updated</w:t>
+      </w:r>
+      <w:r>
+        <w:rPr>
+          <w:sz w:val="16"/>
+          <w:szCs w:val="16"/>
+        </w:rPr>
+        <w:t>:</w:t>
+      </w:r>
+      <w:r>
+        <w:rPr>
+          <w:sz w:val="16"/>
+          <w:szCs w:val="16"/>
+        </w:rPr>
+        <w:t xml:space="preserve"> If only a zero (or blank is found), </w:t>
+      </w:r>
+      <w:r>
+        <w:rPr>
+          <w:sz w:val="16"/>
+          <w:szCs w:val="16"/>
+        </w:rPr>
+        <w:t>it</w:t>
+      </w:r>
+      <w:r>
+        <w:rPr>
+          <w:sz w:val="16"/>
+          <w:szCs w:val="16"/>
+        </w:rPr>
+        <w:t xml:space="preserve"> exit</w:t>
+      </w:r>
+      <w:r>
+        <w:rPr>
+          <w:sz w:val="16"/>
+          <w:szCs w:val="16"/>
+        </w:rPr>
+        <w:t>s</w:t>
+      </w:r>
+      <w:r>
+        <w:rPr>
+          <w:sz w:val="16"/>
+          <w:szCs w:val="16"/>
+        </w:rPr>
+        <w:t xml:space="preserve"> cleanly.</w:t>
+      </w:r>
+    </w:p>
+    <w:p>
+      <w:pPr>
+        <w:pStyle w:val="ListParagraph"/>
+        <w:numPr>
+          <w:ilvl w:val="0"/>
+          <w:numId w:val="18"/>
+        </w:numPr>
+        <w:rPr>
+          <w:sz w:val="16"/>
+          <w:szCs w:val="16"/>
+        </w:rPr>
+      </w:pPr>
+      <w:r>
+        <w:rPr>
+          <w:b/>
+          <w:bCs/>
+          <w:color w:val="0000FF"/>
+          <w:sz w:val="16"/>
+          <w:szCs w:val="16"/>
+        </w:rPr>
+        <w:t xml:space="preserve">Between </w:t>
+      </w:r>
+      <w:r>
+        <w:rPr>
+          <w:b/>
+          <w:bCs/>
+          <w:color w:val="0000FF"/>
+          <w:sz w:val="16"/>
+          <w:szCs w:val="16"/>
+        </w:rPr>
+        <w:t>2:</w:t>
+      </w:r>
+      <w:r>
+        <w:rPr>
+          <w:b/>
+          <w:bCs/>
+          <w:color w:val="0000FF"/>
+          <w:sz w:val="16"/>
+          <w:szCs w:val="16"/>
+        </w:rPr>
+        <w:t>31 –</w:t>
+      </w:r>
+      <w:r>
+        <w:rPr>
+          <w:b/>
+          <w:bCs/>
+          <w:color w:val="0000FF"/>
+          <w:sz w:val="16"/>
+          <w:szCs w:val="16"/>
+        </w:rPr>
+        <w:t xml:space="preserve"> </w:t>
+      </w:r>
+      <w:r>
+        <w:rPr>
+          <w:b/>
+          <w:bCs/>
+          <w:color w:val="0000FF"/>
+          <w:sz w:val="16"/>
+          <w:szCs w:val="16"/>
+        </w:rPr>
+        <w:t>7:</w:t>
+      </w:r>
+      <w:r>
+        <w:rPr>
+          <w:b/>
+          <w:bCs/>
+          <w:color w:val="0000FF"/>
+          <w:sz w:val="16"/>
+          <w:szCs w:val="16"/>
+        </w:rPr>
+        <w:t>45</w:t>
+      </w:r>
+      <w:r>
+        <w:rPr>
+          <w:b/>
+          <w:bCs/>
+          <w:color w:val="0000FF"/>
+          <w:sz w:val="16"/>
+          <w:szCs w:val="16"/>
+        </w:rPr>
+        <w:t>,</w:t>
+      </w:r>
+      <w:r>
+        <w:rPr>
+          <w:sz w:val="16"/>
+          <w:szCs w:val="16"/>
+        </w:rPr>
+        <w:t xml:space="preserve"> Leave only a zero staged if there are no trades, no opens, and/or no closing prices.</w:t>
+      </w:r>
+      <w:r>
+        <w:rPr>
+          <w:sz w:val="16"/>
+          <w:szCs w:val="16"/>
+        </w:rPr>
+        <w:t xml:space="preserve"> Perform QC.</w:t>
+      </w:r>
+    </w:p>
+    <w:p>
+      <w:pPr>
+        <w:pStyle w:val="ListParagraph"/>
+        <w:numPr>
+          <w:ilvl w:val="1"/>
+          <w:numId w:val="18"/>
+        </w:numPr>
+        <w:rPr>
+          <w:sz w:val="16"/>
+          <w:szCs w:val="16"/>
+        </w:rPr>
+      </w:pPr>
+      <w:r>
+        <w:rPr>
+          <w:b/>
+          <w:bCs/>
+          <w:sz w:val="16"/>
+          <w:szCs w:val="16"/>
+        </w:rPr>
+        <w:t>6:05</w:t>
+      </w:r>
+      <w:r>
+        <w:rPr>
+          <w:b/>
+          <w:bCs/>
+          <w:sz w:val="16"/>
+          <w:szCs w:val="16"/>
+        </w:rPr>
+        <w:t>,</w:t>
+      </w:r>
+      <w:r>
+        <w:rPr>
+          <w:sz w:val="16"/>
+          <w:szCs w:val="16"/>
+        </w:rPr>
+        <w:t xml:space="preserve"> </w:t>
+      </w:r>
+      <w:r>
+        <w:rPr>
+          <w:sz w:val="16"/>
+          <w:szCs w:val="16"/>
+        </w:rPr>
+        <w:t>Exit scripts run, u</w:t>
+      </w:r>
+      <w:r>
+        <w:rPr>
+          <w:sz w:val="16"/>
+          <w:szCs w:val="16"/>
+        </w:rPr>
+        <w:t>se</w:t>
+      </w:r>
+      <w:r>
+        <w:rPr>
+          <w:sz w:val="16"/>
+          <w:szCs w:val="16"/>
+        </w:rPr>
+        <w:t>s</w:t>
+      </w:r>
+      <w:r>
+        <w:rPr>
+          <w:sz w:val="16"/>
+          <w:szCs w:val="16"/>
+        </w:rPr>
+        <w:t xml:space="preserve"> </w:t>
+      </w:r>
+      <w:r>
+        <w:rPr>
+          <w:i/>
+          <w:iCs/>
+          <w:sz w:val="16"/>
+          <w:szCs w:val="16"/>
+        </w:rPr>
+        <w:t>Live_Trade_Info</w:t>
+      </w:r>
+      <w:r>
+        <w:rPr>
+          <w:sz w:val="16"/>
+          <w:szCs w:val="16"/>
+        </w:rPr>
+        <w:t xml:space="preserve"> </w:t>
+      </w:r>
+      <w:r>
+        <w:rPr>
+          <w:sz w:val="16"/>
+          <w:szCs w:val="16"/>
+        </w:rPr>
+        <w:t xml:space="preserve">from </w:t>
+      </w:r>
+      <w:r>
+        <w:rPr>
+          <w:sz w:val="16"/>
+          <w:szCs w:val="16"/>
+        </w:rPr>
+        <w:t xml:space="preserve">the </w:t>
+      </w:r>
+      <w:r>
+        <w:rPr>
+          <w:sz w:val="16"/>
+          <w:szCs w:val="16"/>
+        </w:rPr>
+        <w:t xml:space="preserve">last </w:t>
+      </w:r>
+      <w:r>
+        <w:rPr>
+          <w:sz w:val="16"/>
+          <w:szCs w:val="16"/>
+        </w:rPr>
+        <w:t>stage trades script</w:t>
+      </w:r>
+      <w:r>
+        <w:rPr>
+          <w:sz w:val="16"/>
+          <w:szCs w:val="16"/>
+        </w:rPr>
+        <w:t>.</w:t>
+      </w:r>
+    </w:p>
+    <w:p>
+      <w:pPr>
+        <w:pStyle w:val="ListParagraph"/>
+        <w:numPr>
+          <w:ilvl w:val="0"/>
+          <w:numId w:val="18"/>
+        </w:numPr>
+        <w:rPr>
+          <w:sz w:val="16"/>
+          <w:szCs w:val="16"/>
+        </w:rPr>
+      </w:pPr>
+      <w:r>
+        <w:rPr>
+          <w:b/>
+          <w:bCs/>
+          <w:sz w:val="16"/>
+          <w:szCs w:val="16"/>
+        </w:rPr>
+        <w:t>7:</w:t>
+      </w:r>
+      <w:r>
+        <w:rPr>
+          <w:b/>
+          <w:bCs/>
+          <w:sz w:val="16"/>
+          <w:szCs w:val="16"/>
+        </w:rPr>
+        <w:t>4</w:t>
+      </w:r>
+      <w:r>
+        <w:rPr>
+          <w:b/>
+          <w:bCs/>
+          <w:sz w:val="16"/>
+          <w:szCs w:val="16"/>
+        </w:rPr>
+        <w:t>5,</w:t>
+      </w:r>
+      <w:r>
+        <w:rPr>
+          <w:sz w:val="16"/>
+          <w:szCs w:val="16"/>
+        </w:rPr>
+        <w:t xml:space="preserve"> </w:t>
+      </w:r>
+      <w:r>
+        <w:rPr>
+          <w:sz w:val="16"/>
+          <w:szCs w:val="16"/>
+        </w:rPr>
+        <w:t xml:space="preserve">Stage </w:t>
+      </w:r>
+      <w:r>
+        <w:rPr>
+          <w:sz w:val="16"/>
+          <w:szCs w:val="16"/>
+        </w:rPr>
+        <w:t>script</w:t>
+      </w:r>
+      <w:r>
+        <w:rPr>
+          <w:sz w:val="16"/>
+          <w:szCs w:val="16"/>
+        </w:rPr>
+        <w:t xml:space="preserve"> </w:t>
+      </w:r>
+      <w:r>
+        <w:rPr>
+          <w:sz w:val="16"/>
+          <w:szCs w:val="16"/>
+        </w:rPr>
+        <w:t xml:space="preserve">runs, it </w:t>
+      </w:r>
+      <w:r>
+        <w:rPr>
+          <w:sz w:val="16"/>
+          <w:szCs w:val="16"/>
+        </w:rPr>
+        <w:t xml:space="preserve">will clear the </w:t>
+      </w:r>
+      <w:r>
+        <w:rPr>
+          <w:i/>
+          <w:iCs/>
+          <w:sz w:val="16"/>
+          <w:szCs w:val="16"/>
+        </w:rPr>
+        <w:t>Live_Trade_Info</w:t>
+      </w:r>
+      <w:r>
+        <w:rPr>
+          <w:sz w:val="16"/>
+          <w:szCs w:val="16"/>
+        </w:rPr>
+        <w:t xml:space="preserve"> file if no T’s are found</w:t>
+      </w:r>
+      <w:r>
+        <w:rPr>
+          <w:sz w:val="16"/>
+          <w:szCs w:val="16"/>
+        </w:rPr>
+        <w:t>.</w:t>
+      </w:r>
+    </w:p>
+    <w:p>
+      <w:pPr>
+        <w:pStyle w:val="ListParagraph"/>
+        <w:numPr>
+          <w:ilvl w:val="0"/>
+          <w:numId w:val="18"/>
+        </w:numPr>
+        <w:rPr>
+          <w:sz w:val="16"/>
+          <w:szCs w:val="16"/>
+        </w:rPr>
+      </w:pPr>
+      <w:r>
+        <w:rPr>
+          <w:b/>
+          <w:bCs/>
+          <w:sz w:val="16"/>
+          <w:szCs w:val="16"/>
+        </w:rPr>
+        <w:t>8:05,</w:t>
+      </w:r>
+      <w:r>
+        <w:rPr>
+          <w:sz w:val="16"/>
+          <w:szCs w:val="16"/>
+        </w:rPr>
+        <w:t xml:space="preserve"> </w:t>
+      </w:r>
+      <w:r>
+        <w:rPr>
+          <w:sz w:val="16"/>
+          <w:szCs w:val="16"/>
+        </w:rPr>
+        <w:t>Opening scripts</w:t>
+      </w:r>
+      <w:r>
+        <w:rPr>
+          <w:sz w:val="16"/>
+          <w:szCs w:val="16"/>
+        </w:rPr>
+        <w:t xml:space="preserve"> run, if there are no </w:t>
+      </w:r>
+      <w:r>
+        <w:rPr>
+          <w:sz w:val="16"/>
+          <w:szCs w:val="16"/>
+        </w:rPr>
+        <w:t xml:space="preserve">trades in the </w:t>
+      </w:r>
+      <w:r>
+        <w:rPr>
+          <w:i/>
+          <w:iCs/>
+          <w:sz w:val="16"/>
+          <w:szCs w:val="16"/>
+        </w:rPr>
+        <w:t>Live_Trade_Info</w:t>
+      </w:r>
+      <w:r>
+        <w:rPr>
+          <w:sz w:val="16"/>
+          <w:szCs w:val="16"/>
+        </w:rPr>
+        <w:t xml:space="preserve"> file</w:t>
+      </w:r>
+      <w:r>
+        <w:rPr>
+          <w:sz w:val="16"/>
+          <w:szCs w:val="16"/>
+        </w:rPr>
+        <w:t>, it</w:t>
+      </w:r>
+      <w:r>
+        <w:rPr>
+          <w:sz w:val="16"/>
+          <w:szCs w:val="16"/>
+        </w:rPr>
+        <w:t xml:space="preserve"> exit</w:t>
+      </w:r>
+      <w:r>
+        <w:rPr>
+          <w:sz w:val="16"/>
+          <w:szCs w:val="16"/>
+        </w:rPr>
+        <w:t>s</w:t>
+      </w:r>
+      <w:r>
+        <w:rPr>
+          <w:sz w:val="16"/>
+          <w:szCs w:val="16"/>
+        </w:rPr>
+        <w:t xml:space="preserve"> cleanly.</w:t>
+      </w:r>
+    </w:p>
+    <w:p>
+      <w:pPr>
+        <w:pStyle w:val="ListParagraph"/>
+        <w:numPr>
+          <w:ilvl w:val="0"/>
+          <w:numId w:val="18"/>
+        </w:numPr>
+        <w:rPr>
+          <w:sz w:val="16"/>
+          <w:szCs w:val="16"/>
+        </w:rPr>
+      </w:pPr>
+      <w:r>
+        <w:rPr>
+          <w:b/>
+          <w:bCs/>
+          <w:sz w:val="16"/>
+          <w:szCs w:val="16"/>
+        </w:rPr>
+        <w:t xml:space="preserve">Sunday: </w:t>
+      </w:r>
+      <w:r>
+        <w:rPr>
+          <w:sz w:val="16"/>
+          <w:szCs w:val="16"/>
+        </w:rPr>
+        <w:t>Re-authorize APIs</w:t>
+      </w:r>
+      <w:r>
+        <w:rPr>
+          <w:sz w:val="16"/>
+          <w:szCs w:val="16"/>
+        </w:rPr>
+        <w:t>.</w:t>
+      </w:r>
+    </w:p>
+    <w:p>
+      <w:pPr>
+        <w:pStyle w:val="ListParagraph"/>
+        <w:ind w:left="0"/>
+        <w:rPr>
+          <w:b/>
+          <w:bCs/>
+          <w:i/>
+          <w:iCs/>
+          <w:sz w:val="18"/>
+          <w:szCs w:val="18"/>
+          <w:u w:val="single"/>
+        </w:rPr>
+      </w:pPr>
+    </w:p>
+    <w:p>
+      <w:pPr>
+        <w:pStyle w:val="ListParagraph"/>
+        <w:ind w:left="0"/>
+        <w:rPr>
+          <w:b/>
+          <w:bCs/>
+          <w:i/>
+          <w:iCs/>
+          <w:sz w:val="18"/>
+          <w:szCs w:val="18"/>
+          <w:u w:val="single"/>
+        </w:rPr>
+      </w:pPr>
+      <w:r>
+        <w:rPr>
+          <w:b/>
+          <w:bCs/>
+          <w:i/>
+          <w:iCs/>
+          <w:sz w:val="18"/>
+          <w:szCs w:val="18"/>
+          <w:u w:val="single"/>
+        </w:rPr>
         <w:t>To-Do</w:t>
       </w:r>
       <w:r>
@@ -4951,6 +5393,119 @@
     </w:lvl>
   </w:abstractNum>
   <w:abstractNum w:abstractNumId="14" w15:restartNumberingAfterBreak="0">
+    <w:nsid w:val="59AA06B8"/>
+    <w:multiLevelType w:val="hybridMultilevel"/>
+    <w:tmpl w:val="6BA4EEF6"/>
+    <w:lvl w:ilvl="0" w:tplc="04090001">
+      <w:start w:val="1"/>
+      <w:numFmt w:val="bullet"/>
+      <w:lvlText w:val=""/>
+      <w:lvlJc w:val="left"/>
+      <w:pPr>
+        <w:ind w:left="720" w:hanging="360"/>
+      </w:pPr>
+      <w:rPr>
+        <w:rFonts w:ascii="Symbol" w:hAnsi="Symbol" w:hint="default"/>
+      </w:rPr>
+    </w:lvl>
+    <w:lvl w:ilvl="1" w:tplc="0409000D">
+      <w:start w:val="1"/>
+      <w:numFmt w:val="bullet"/>
+      <w:lvlText w:val=""/>
+      <w:lvlJc w:val="left"/>
+      <w:pPr>
+        <w:ind w:left="1440" w:hanging="360"/>
+      </w:pPr>
+      <w:rPr>
+        <w:rFonts w:ascii="Wingdings" w:hAnsi="Wingdings" w:hint="default"/>
+      </w:rPr>
+    </w:lvl>
+    <w:lvl w:ilvl="2" w:tplc="04090005" w:tentative="1">
+      <w:start w:val="1"/>
+      <w:numFmt w:val="bullet"/>
+      <w:lvlText w:val=""/>
+      <w:lvlJc w:val="left"/>
+      <w:pPr>
+        <w:ind w:left="2160" w:hanging="360"/>
+      </w:pPr>
+      <w:rPr>
+        <w:rFonts w:ascii="Wingdings" w:hAnsi="Wingdings" w:hint="default"/>
+      </w:rPr>
+    </w:lvl>
+    <w:lvl w:ilvl="3" w:tplc="04090001" w:tentative="1">
+      <w:start w:val="1"/>
+      <w:numFmt w:val="bullet"/>
+      <w:lvlText w:val=""/>
+      <w:lvlJc w:val="left"/>
+      <w:pPr>
+        <w:ind w:left="2880" w:hanging="360"/>
+      </w:pPr>
+      <w:rPr>
+        <w:rFonts w:ascii="Symbol" w:hAnsi="Symbol" w:hint="default"/>
+      </w:rPr>
+    </w:lvl>
+    <w:lvl w:ilvl="4" w:tplc="04090003" w:tentative="1">
+      <w:start w:val="1"/>
+      <w:numFmt w:val="bullet"/>
+      <w:lvlText w:val="o"/>
+      <w:lvlJc w:val="left"/>
+      <w:pPr>
+        <w:ind w:left="3600" w:hanging="360"/>
+      </w:pPr>
+      <w:rPr>
+        <w:rFonts w:ascii="Courier New" w:hAnsi="Courier New" w:cs="Courier New" w:hint="default"/>
+      </w:rPr>
+    </w:lvl>
+    <w:lvl w:ilvl="5" w:tplc="04090005" w:tentative="1">
+      <w:start w:val="1"/>
+      <w:numFmt w:val="bullet"/>
+      <w:lvlText w:val=""/>
+      <w:lvlJc w:val="left"/>
+      <w:pPr>
+        <w:ind w:left="4320" w:hanging="360"/>
+      </w:pPr>
+      <w:rPr>
+        <w:rFonts w:ascii="Wingdings" w:hAnsi="Wingdings" w:hint="default"/>
+      </w:rPr>
+    </w:lvl>
+    <w:lvl w:ilvl="6" w:tplc="04090001" w:tentative="1">
+      <w:start w:val="1"/>
+      <w:numFmt w:val="bullet"/>
+      <w:lvlText w:val=""/>
+      <w:lvlJc w:val="left"/>
+      <w:pPr>
+        <w:ind w:left="5040" w:hanging="360"/>
+      </w:pPr>
+      <w:rPr>
+        <w:rFonts w:ascii="Symbol" w:hAnsi="Symbol" w:hint="default"/>
+      </w:rPr>
+    </w:lvl>
+    <w:lvl w:ilvl="7" w:tplc="04090003" w:tentative="1">
+      <w:start w:val="1"/>
+      <w:numFmt w:val="bullet"/>
+      <w:lvlText w:val="o"/>
+      <w:lvlJc w:val="left"/>
+      <w:pPr>
+        <w:ind w:left="5760" w:hanging="360"/>
+      </w:pPr>
+      <w:rPr>
+        <w:rFonts w:ascii="Courier New" w:hAnsi="Courier New" w:cs="Courier New" w:hint="default"/>
+      </w:rPr>
+    </w:lvl>
+    <w:lvl w:ilvl="8" w:tplc="04090005" w:tentative="1">
+      <w:start w:val="1"/>
+      <w:numFmt w:val="bullet"/>
+      <w:lvlText w:val=""/>
+      <w:lvlJc w:val="left"/>
+      <w:pPr>
+        <w:ind w:left="6480" w:hanging="360"/>
+      </w:pPr>
+      <w:rPr>
+        <w:rFonts w:ascii="Wingdings" w:hAnsi="Wingdings" w:hint="default"/>
+      </w:rPr>
+    </w:lvl>
+  </w:abstractNum>
+  <w:abstractNum w:abstractNumId="15" w15:restartNumberingAfterBreak="0">
     <w:nsid w:val="65D73831"/>
     <w:multiLevelType w:val="hybridMultilevel"/>
     <w:tmpl w:val="E4ECC72C"/>
@@ -5043,7 +5598,7 @@
       </w:pPr>
     </w:lvl>
   </w:abstractNum>
-  <w:abstractNum w:abstractNumId="15" w15:restartNumberingAfterBreak="0">
+  <w:abstractNum w:abstractNumId="16" w15:restartNumberingAfterBreak="0">
     <w:nsid w:val="7D3E0A88"/>
     <w:multiLevelType w:val="hybridMultilevel"/>
     <w:tmpl w:val="65B66822"/>
@@ -5156,7 +5711,7 @@
       </w:rPr>
     </w:lvl>
   </w:abstractNum>
-  <w:abstractNum w:abstractNumId="16" w15:restartNumberingAfterBreak="0">
+  <w:abstractNum w:abstractNumId="17" w15:restartNumberingAfterBreak="0">
     <w:nsid w:val="7F9D070E"/>
     <w:multiLevelType w:val="hybridMultilevel"/>
     <w:tmpl w:val="8F88FCDC"/>
@@ -5294,7 +5849,7 @@
     <w:abstractNumId w:val="1"/>
   </w:num>
   <w:num w:numId="9" w16cid:durableId="1135215662">
-    <w:abstractNumId w:val="16"/>
+    <w:abstractNumId w:val="17"/>
   </w:num>
   <w:num w:numId="10" w16cid:durableId="774789966">
     <w:abstractNumId w:val="9"/>
@@ -5303,7 +5858,7 @@
     <w:abstractNumId w:val="4"/>
   </w:num>
   <w:num w:numId="12" w16cid:durableId="16583779">
-    <w:abstractNumId w:val="14"/>
+    <w:abstractNumId w:val="15"/>
   </w:num>
   <w:num w:numId="13" w16cid:durableId="1894541156">
     <w:abstractNumId w:val="5"/>
@@ -5315,10 +5870,13 @@
     <w:abstractNumId w:val="12"/>
   </w:num>
   <w:num w:numId="16" w16cid:durableId="2127573985">
-    <w:abstractNumId w:val="15"/>
+    <w:abstractNumId w:val="16"/>
   </w:num>
   <w:num w:numId="17" w16cid:durableId="386031212">
     <w:abstractNumId w:val="8"/>
+  </w:num>
+  <w:num w:numId="18" w16cid:durableId="1286042663">
+    <w:abstractNumId w:val="14"/>
   </w:num>
 </w:numbering>
 </file>

</xml_diff>

<commit_message>
Adding friday trading with the 5 flag
</commit_message>
<xml_diff>
--- a/Admin/Earnings Advantage Work Flow Doc.docx
+++ b/Admin/Earnings Advantage Work Flow Doc.docx
@@ -649,16 +649,7 @@
           <w:sz w:val="22"/>
           <w:szCs w:val="22"/>
         </w:rPr>
-        <w:t>I</w:t>
-      </w:r>
-      <w:r>
-        <w:rPr>
-          <w:b/>
-          <w:bCs/>
-          <w:sz w:val="22"/>
-          <w:szCs w:val="22"/>
-        </w:rPr>
-        <w:t>B</w:t>
+        <w:t>IB</w:t>
       </w:r>
     </w:p>
     <w:p>
@@ -709,27 +700,7 @@
           <w:sz w:val="22"/>
           <w:szCs w:val="22"/>
         </w:rPr>
-        <w:t>Do be</w:t>
-      </w:r>
-      <w:r>
-        <w:rPr>
-          <w:i/>
-          <w:iCs/>
-          <w:color w:val="4EA72E" w:themeColor="accent6"/>
-          <w:sz w:val="22"/>
-          <w:szCs w:val="22"/>
-        </w:rPr>
-        <w:t>tween 2:25 --</w:t>
-      </w:r>
-      <w:r>
-        <w:rPr>
-          <w:i/>
-          <w:iCs/>
-          <w:color w:val="4EA72E" w:themeColor="accent6"/>
-          <w:sz w:val="22"/>
-          <w:szCs w:val="22"/>
-        </w:rPr>
-        <w:t xml:space="preserve"> 7:45 daily</w:t>
+        <w:t>Must be done before staging script runs</w:t>
       </w:r>
     </w:p>
     <w:p>
@@ -749,28 +720,16 @@
           <w:sz w:val="22"/>
           <w:szCs w:val="22"/>
         </w:rPr>
-        <w:t xml:space="preserve">Update </w:t>
-      </w:r>
-      <w:r>
-        <w:rPr>
-          <w:sz w:val="22"/>
-          <w:szCs w:val="22"/>
-        </w:rPr>
-        <w:t xml:space="preserve">the </w:t>
-      </w:r>
-      <w:r>
-        <w:rPr>
-          <w:sz w:val="22"/>
-          <w:szCs w:val="22"/>
-        </w:rPr>
-        <w:t>3 flag columns</w:t>
-      </w:r>
-      <w:r>
-        <w:rPr>
-          <w:sz w:val="22"/>
-          <w:szCs w:val="22"/>
-        </w:rPr>
-        <w:t xml:space="preserve"> (O – Q)</w:t>
+        <w:t xml:space="preserve">Update Exit at Open actual price, for IB only </w:t>
+      </w:r>
+      <w:r>
+        <w:rPr>
+          <w:i/>
+          <w:iCs/>
+          <w:sz w:val="18"/>
+          <w:szCs w:val="18"/>
+        </w:rPr>
+        <w:t>(A.M. Optional)</w:t>
       </w:r>
     </w:p>
     <w:p>
@@ -790,14 +749,49 @@
           <w:sz w:val="22"/>
           <w:szCs w:val="22"/>
         </w:rPr>
-        <w:t>Update Exit order types (</w:t>
-      </w:r>
-      <w:r>
-        <w:rPr>
-          <w:sz w:val="22"/>
-          <w:szCs w:val="22"/>
-        </w:rPr>
-        <w:t>AA – AB)</w:t>
+        <w:t xml:space="preserve">Update </w:t>
+      </w:r>
+      <w:r>
+        <w:rPr>
+          <w:sz w:val="22"/>
+          <w:szCs w:val="22"/>
+        </w:rPr>
+        <w:t xml:space="preserve">the </w:t>
+      </w:r>
+      <w:r>
+        <w:rPr>
+          <w:sz w:val="22"/>
+          <w:szCs w:val="22"/>
+        </w:rPr>
+        <w:t>opening and closing</w:t>
+      </w:r>
+      <w:r>
+        <w:rPr>
+          <w:sz w:val="22"/>
+          <w:szCs w:val="22"/>
+        </w:rPr>
+        <w:t xml:space="preserve"> flag columns</w:t>
+      </w:r>
+      <w:r>
+        <w:rPr>
+          <w:sz w:val="22"/>
+          <w:szCs w:val="22"/>
+        </w:rPr>
+        <w:t xml:space="preserve"> (</w:t>
+      </w:r>
+      <w:r>
+        <w:rPr>
+          <w:sz w:val="22"/>
+          <w:szCs w:val="22"/>
+        </w:rPr>
+        <w:t xml:space="preserve">P, &amp; </w:t>
+      </w:r>
+      <w:r>
+        <w:rPr>
+          <w:sz w:val="22"/>
+          <w:szCs w:val="22"/>
+        </w:rPr>
+        <w:t>Q)</w:t>
       </w:r>
     </w:p>
     <w:p>
@@ -817,14 +811,14 @@
           <w:sz w:val="22"/>
           <w:szCs w:val="22"/>
         </w:rPr>
-        <w:t>Update Exit at Open actual price, for IB onl</w:t>
-      </w:r>
-      <w:r>
-        <w:rPr>
-          <w:sz w:val="22"/>
-          <w:szCs w:val="22"/>
-        </w:rPr>
-        <w:t>y (AC)</w:t>
+        <w:t>Make actualized closing prices black</w:t>
+      </w:r>
+      <w:r>
+        <w:rPr>
+          <w:sz w:val="22"/>
+          <w:szCs w:val="22"/>
+        </w:rPr>
+        <w:t xml:space="preserve"> and actualize share size</w:t>
       </w:r>
     </w:p>
     <w:p>
@@ -843,8 +837,16 @@
         <w:rPr>
           <w:sz w:val="22"/>
           <w:szCs w:val="22"/>
-        </w:rPr>
-        <w:t>Make actual closes black.</w:t>
+          <w:u w:val="single"/>
+        </w:rPr>
+        <w:t>If necessary</w:t>
+      </w:r>
+      <w:r>
+        <w:rPr>
+          <w:sz w:val="22"/>
+          <w:szCs w:val="22"/>
+        </w:rPr>
+        <w:t>, select the trend classification for future trades</w:t>
       </w:r>
     </w:p>
     <w:p>
@@ -863,8 +865,44 @@
         <w:rPr>
           <w:sz w:val="22"/>
           <w:szCs w:val="22"/>
-        </w:rPr>
-        <w:t>Flag all trades with a “T” and change opening and closing price range.</w:t>
+          <w:u w:val="single"/>
+        </w:rPr>
+        <w:t>If necessary</w:t>
+      </w:r>
+      <w:r>
+        <w:rPr>
+          <w:sz w:val="22"/>
+          <w:szCs w:val="22"/>
+        </w:rPr>
+        <w:t xml:space="preserve">, </w:t>
+      </w:r>
+      <w:r>
+        <w:rPr>
+          <w:sz w:val="22"/>
+          <w:szCs w:val="22"/>
+        </w:rPr>
+        <w:t xml:space="preserve">Flag all trades with a “T” </w:t>
+      </w:r>
+      <w:r>
+        <w:rPr>
+          <w:sz w:val="22"/>
+          <w:szCs w:val="22"/>
+        </w:rPr>
+        <w:t xml:space="preserve">(single day mode) </w:t>
+      </w:r>
+      <w:r>
+        <w:rPr>
+          <w:sz w:val="22"/>
+          <w:szCs w:val="22"/>
+        </w:rPr>
+        <w:t>or weekday flags</w:t>
+      </w:r>
+      <w:r>
+        <w:rPr>
+          <w:sz w:val="22"/>
+          <w:szCs w:val="22"/>
+        </w:rPr>
+        <w:t xml:space="preserve"> (multiday trading mode)</w:t>
       </w:r>
     </w:p>
     <w:p>
@@ -883,8 +921,30 @@
         <w:rPr>
           <w:sz w:val="22"/>
           <w:szCs w:val="22"/>
-        </w:rPr>
-        <w:t>Select the trend classification.</w:t>
+          <w:u w:val="single"/>
+        </w:rPr>
+        <w:t>If necessary</w:t>
+      </w:r>
+      <w:r>
+        <w:rPr>
+          <w:sz w:val="22"/>
+          <w:szCs w:val="22"/>
+        </w:rPr>
+        <w:t xml:space="preserve">, </w:t>
+      </w:r>
+      <w:r>
+        <w:rPr>
+          <w:sz w:val="22"/>
+          <w:szCs w:val="22"/>
+        </w:rPr>
+        <w:t>Change</w:t>
+      </w:r>
+      <w:r>
+        <w:rPr>
+          <w:sz w:val="22"/>
+          <w:szCs w:val="22"/>
+        </w:rPr>
+        <w:t xml:space="preserve"> Exit order types (AA – AB)</w:t>
       </w:r>
     </w:p>
     <w:p>

</xml_diff>

<commit_message>
Created Get_Open_ToS and Get_Closes_ToS in prep os using them
</commit_message>
<xml_diff>
--- a/Admin/Earnings Advantage Work Flow Doc.docx
+++ b/Admin/Earnings Advantage Work Flow Doc.docx
@@ -95,7 +95,31 @@
           <w:szCs w:val="32"/>
           <w:u w:val="single"/>
         </w:rPr>
-        <w:t>Earnings Advantage Work Flow:</w:t>
+        <w:t xml:space="preserve">Earnings Advantage </w:t>
+      </w:r>
+      <w:proofErr w:type="gramStart"/>
+      <w:r>
+        <w:rPr>
+          <w:b/>
+          <w:bCs/>
+          <w:color w:val="4EA72E" w:themeColor="accent6"/>
+          <w:sz w:val="32"/>
+          <w:szCs w:val="32"/>
+          <w:u w:val="single"/>
+        </w:rPr>
+        <w:t>Work Flow</w:t>
+      </w:r>
+      <w:proofErr w:type="gramEnd"/>
+      <w:r>
+        <w:rPr>
+          <w:b/>
+          <w:bCs/>
+          <w:color w:val="4EA72E" w:themeColor="accent6"/>
+          <w:sz w:val="32"/>
+          <w:szCs w:val="32"/>
+          <w:u w:val="single"/>
+        </w:rPr>
+        <w:t>:</w:t>
       </w:r>
     </w:p>
     <w:p>
@@ -116,7 +140,15 @@
           <w:sz w:val="22"/>
           <w:szCs w:val="22"/>
         </w:rPr>
-        <w:t>Update earnings date</w:t>
+        <w:t xml:space="preserve">Update earnings </w:t>
+      </w:r>
+      <w:proofErr w:type="gramStart"/>
+      <w:r>
+        <w:rPr>
+          <w:sz w:val="22"/>
+          <w:szCs w:val="22"/>
+        </w:rPr>
+        <w:t>date</w:t>
       </w:r>
       <w:r>
         <w:rPr>
@@ -125,6 +157,7 @@
         </w:rPr>
         <w:t>s</w:t>
       </w:r>
+      <w:proofErr w:type="gramEnd"/>
       <w:r>
         <w:rPr>
           <w:sz w:val="22"/>
@@ -165,7 +198,23 @@
           <w:sz w:val="22"/>
           <w:szCs w:val="22"/>
         </w:rPr>
-        <w:t>Schwab_Auth runs Sunday at 5PM.</w:t>
+        <w:t xml:space="preserve">Schwab_Auth </w:t>
+      </w:r>
+      <w:proofErr w:type="gramStart"/>
+      <w:r>
+        <w:rPr>
+          <w:sz w:val="22"/>
+          <w:szCs w:val="22"/>
+        </w:rPr>
+        <w:t>runs</w:t>
+      </w:r>
+      <w:proofErr w:type="gramEnd"/>
+      <w:r>
+        <w:rPr>
+          <w:sz w:val="22"/>
+          <w:szCs w:val="22"/>
+        </w:rPr>
+        <w:t xml:space="preserve"> Sunday at 5PM.</w:t>
       </w:r>
     </w:p>
     <w:p>
@@ -719,17 +768,45 @@
         <w:rPr>
           <w:sz w:val="22"/>
           <w:szCs w:val="22"/>
-        </w:rPr>
-        <w:t xml:space="preserve">Update Exit at Open actual price, for IB only </w:t>
-      </w:r>
-      <w:r>
-        <w:rPr>
-          <w:i/>
-          <w:iCs/>
-          <w:sz w:val="18"/>
-          <w:szCs w:val="18"/>
-        </w:rPr>
-        <w:t>(A.M. Optional)</w:t>
+          <w:u w:val="single"/>
+        </w:rPr>
+        <w:t>AM</w:t>
+      </w:r>
+      <w:r>
+        <w:rPr>
+          <w:sz w:val="22"/>
+          <w:szCs w:val="22"/>
+          <w:u w:val="single"/>
+        </w:rPr>
+        <w:t>:</w:t>
+      </w:r>
+      <w:r>
+        <w:rPr>
+          <w:sz w:val="22"/>
+          <w:szCs w:val="22"/>
+        </w:rPr>
+        <w:t xml:space="preserve"> </w:t>
+      </w:r>
+      <w:r>
+        <w:rPr>
+          <w:sz w:val="22"/>
+          <w:szCs w:val="22"/>
+        </w:rPr>
+        <w:t>If not done, u</w:t>
+      </w:r>
+      <w:r>
+        <w:rPr>
+          <w:sz w:val="22"/>
+          <w:szCs w:val="22"/>
+        </w:rPr>
+        <w:t>pdate Exit at Open actual price</w:t>
+      </w:r>
+      <w:r>
+        <w:rPr>
+          <w:sz w:val="22"/>
+          <w:szCs w:val="22"/>
+        </w:rPr>
+        <w:t>s.</w:t>
       </w:r>
     </w:p>
     <w:p>
@@ -784,7 +861,7 @@
           <w:sz w:val="22"/>
           <w:szCs w:val="22"/>
         </w:rPr>
-        <w:t xml:space="preserve">P, &amp; </w:t>
+        <w:t xml:space="preserve">Col. </w:t>
       </w:r>
       <w:r>
         <w:rPr>
@@ -813,13 +890,6 @@
         </w:rPr>
         <w:t>Make actualized closing prices black</w:t>
       </w:r>
-      <w:r>
-        <w:rPr>
-          <w:sz w:val="22"/>
-          <w:szCs w:val="22"/>
-        </w:rPr>
-        <w:t xml:space="preserve"> and actualize share size</w:t>
-      </w:r>
     </w:p>
     <w:p>
       <w:pPr>
@@ -837,114 +907,29 @@
         <w:rPr>
           <w:sz w:val="22"/>
           <w:szCs w:val="22"/>
-          <w:u w:val="single"/>
-        </w:rPr>
-        <w:t>If necessary</w:t>
-      </w:r>
-      <w:r>
-        <w:rPr>
-          <w:sz w:val="22"/>
-          <w:szCs w:val="22"/>
-        </w:rPr>
-        <w:t>, select the trend classification for future trades</w:t>
-      </w:r>
-    </w:p>
-    <w:p>
-      <w:pPr>
-        <w:pStyle w:val="ListParagraph"/>
-        <w:numPr>
-          <w:ilvl w:val="0"/>
-          <w:numId w:val="15"/>
-        </w:numPr>
-        <w:rPr>
-          <w:sz w:val="22"/>
-          <w:szCs w:val="22"/>
-        </w:rPr>
-      </w:pPr>
-      <w:r>
-        <w:rPr>
-          <w:sz w:val="22"/>
-          <w:szCs w:val="22"/>
-          <w:u w:val="single"/>
-        </w:rPr>
-        <w:t>If necessary</w:t>
-      </w:r>
-      <w:r>
-        <w:rPr>
-          <w:sz w:val="22"/>
-          <w:szCs w:val="22"/>
-        </w:rPr>
-        <w:t xml:space="preserve">, </w:t>
-      </w:r>
-      <w:r>
-        <w:rPr>
-          <w:sz w:val="22"/>
-          <w:szCs w:val="22"/>
-        </w:rPr>
-        <w:t xml:space="preserve">Flag all trades with a “T” </w:t>
-      </w:r>
-      <w:r>
-        <w:rPr>
-          <w:sz w:val="22"/>
-          <w:szCs w:val="22"/>
-        </w:rPr>
-        <w:t xml:space="preserve">(single day mode) </w:t>
-      </w:r>
-      <w:r>
-        <w:rPr>
-          <w:sz w:val="22"/>
-          <w:szCs w:val="22"/>
-        </w:rPr>
-        <w:t>or weekday flags</w:t>
-      </w:r>
-      <w:r>
-        <w:rPr>
-          <w:sz w:val="22"/>
-          <w:szCs w:val="22"/>
-        </w:rPr>
-        <w:t xml:space="preserve"> (multiday trading mode)</w:t>
-      </w:r>
-    </w:p>
-    <w:p>
-      <w:pPr>
-        <w:pStyle w:val="ListParagraph"/>
-        <w:numPr>
-          <w:ilvl w:val="0"/>
-          <w:numId w:val="15"/>
-        </w:numPr>
-        <w:rPr>
-          <w:sz w:val="22"/>
-          <w:szCs w:val="22"/>
-        </w:rPr>
-      </w:pPr>
-      <w:r>
-        <w:rPr>
-          <w:sz w:val="22"/>
-          <w:szCs w:val="22"/>
-          <w:u w:val="single"/>
-        </w:rPr>
-        <w:t>If necessary</w:t>
-      </w:r>
-      <w:r>
-        <w:rPr>
-          <w:sz w:val="22"/>
-          <w:szCs w:val="22"/>
-        </w:rPr>
-        <w:t xml:space="preserve">, </w:t>
-      </w:r>
-      <w:r>
-        <w:rPr>
-          <w:sz w:val="22"/>
-          <w:szCs w:val="22"/>
-        </w:rPr>
-        <w:t>Change</w:t>
-      </w:r>
-      <w:r>
-        <w:rPr>
-          <w:sz w:val="22"/>
-          <w:szCs w:val="22"/>
-        </w:rPr>
-        <w:t xml:space="preserve"> Exit order types (AA – AB)</w:t>
+        </w:rPr>
+        <w:t>C</w:t>
+      </w:r>
+      <w:r>
+        <w:rPr>
+          <w:sz w:val="22"/>
+          <w:szCs w:val="22"/>
+        </w:rPr>
+        <w:t>onfirm share sizes and hard code for to</w:t>
+      </w:r>
+      <w:r>
+        <w:rPr>
+          <w:sz w:val="22"/>
+          <w:szCs w:val="22"/>
+        </w:rPr>
+        <w:t>morrow’s</w:t>
+      </w:r>
+      <w:r>
+        <w:rPr>
+          <w:sz w:val="22"/>
+          <w:szCs w:val="22"/>
+        </w:rPr>
+        <w:t xml:space="preserve"> trades</w:t>
       </w:r>
     </w:p>
     <w:p>
@@ -3324,6 +3309,7 @@
           <w:u w:val="single"/>
         </w:rPr>
       </w:pPr>
+      <w:proofErr w:type="gramStart"/>
       <w:r>
         <w:rPr>
           <w:b/>
@@ -3358,7 +3344,20 @@
           <w:szCs w:val="18"/>
           <w:u w:val="single"/>
         </w:rPr>
-        <w:t>___________________________________________________________________________________________________________________________</w:t>
+        <w:t>_</w:t>
+      </w:r>
+      <w:proofErr w:type="gramEnd"/>
+      <w:r>
+        <w:rPr>
+          <w:b/>
+          <w:bCs/>
+          <w:i/>
+          <w:iCs/>
+          <w:sz w:val="18"/>
+          <w:szCs w:val="18"/>
+          <w:u w:val="single"/>
+        </w:rPr>
+        <w:t>__________________________________________________________________________________________________________________________</w:t>
       </w:r>
     </w:p>
     <w:p>
@@ -3380,7 +3379,7 @@
           <w:sz w:val="16"/>
           <w:szCs w:val="16"/>
         </w:rPr>
-        <w:t>7</w:t>
+        <w:t>8</w:t>
       </w:r>
       <w:r>
         <w:rPr>
@@ -3398,7 +3397,7 @@
           <w:sz w:val="16"/>
           <w:szCs w:val="16"/>
         </w:rPr>
-        <w:t>5</w:t>
+        <w:t>00</w:t>
       </w:r>
       <w:r>
         <w:rPr>
@@ -3407,7 +3406,7 @@
           <w:sz w:val="16"/>
           <w:szCs w:val="16"/>
         </w:rPr>
-        <w:t>5,</w:t>
+        <w:t>,</w:t>
       </w:r>
       <w:r>
         <w:rPr>
@@ -3461,7 +3460,7 @@
           <w:sz w:val="16"/>
           <w:szCs w:val="16"/>
         </w:rPr>
-        <w:t>20</w:t>
+        <w:t>3</w:t>
       </w:r>
       <w:r>
         <w:rPr>
@@ -3470,7 +3469,7 @@
           <w:sz w:val="16"/>
           <w:szCs w:val="16"/>
         </w:rPr>
-        <w:t>, 2:</w:t>
+        <w:t>0</w:t>
       </w:r>
       <w:r>
         <w:rPr>
@@ -3479,7 +3478,25 @@
           <w:sz w:val="16"/>
           <w:szCs w:val="16"/>
         </w:rPr>
-        <w:t>25</w:t>
+        <w:t>, 2:</w:t>
+      </w:r>
+      <w:r>
+        <w:rPr>
+          <w:b/>
+          <w:bCs/>
+          <w:sz w:val="16"/>
+          <w:szCs w:val="16"/>
+        </w:rPr>
+        <w:t>2</w:t>
+      </w:r>
+      <w:r>
+        <w:rPr>
+          <w:b/>
+          <w:bCs/>
+          <w:sz w:val="16"/>
+          <w:szCs w:val="16"/>
+        </w:rPr>
+        <w:t>5</w:t>
       </w:r>
       <w:r>
         <w:rPr>
@@ -3581,7 +3598,7 @@
           <w:sz w:val="16"/>
           <w:szCs w:val="16"/>
         </w:rPr>
-        <w:t xml:space="preserve">Between </w:t>
+        <w:t>Manual - b</w:t>
       </w:r>
       <w:r>
         <w:rPr>
@@ -3591,7 +3608,7 @@
           <w:sz w:val="16"/>
           <w:szCs w:val="16"/>
         </w:rPr>
-        <w:t>2:</w:t>
+        <w:t xml:space="preserve">etween </w:t>
       </w:r>
       <w:r>
         <w:rPr>
@@ -3601,7 +3618,7 @@
           <w:sz w:val="16"/>
           <w:szCs w:val="16"/>
         </w:rPr>
-        <w:t>25</w:t>
+        <w:t>2:</w:t>
       </w:r>
       <w:r>
         <w:rPr>
@@ -3611,7 +3628,7 @@
           <w:sz w:val="16"/>
           <w:szCs w:val="16"/>
         </w:rPr>
-        <w:t xml:space="preserve"> –</w:t>
+        <w:t>25</w:t>
       </w:r>
       <w:r>
         <w:rPr>
@@ -3621,7 +3638,7 @@
           <w:sz w:val="16"/>
           <w:szCs w:val="16"/>
         </w:rPr>
-        <w:t xml:space="preserve"> </w:t>
+        <w:t xml:space="preserve"> –</w:t>
       </w:r>
       <w:r>
         <w:rPr>
@@ -3631,7 +3648,7 @@
           <w:sz w:val="16"/>
           <w:szCs w:val="16"/>
         </w:rPr>
-        <w:t>7:</w:t>
+        <w:t xml:space="preserve"> </w:t>
       </w:r>
       <w:r>
         <w:rPr>
@@ -3641,7 +3658,7 @@
           <w:sz w:val="16"/>
           <w:szCs w:val="16"/>
         </w:rPr>
-        <w:t>45</w:t>
+        <w:t>7:</w:t>
       </w:r>
       <w:r>
         <w:rPr>
@@ -3651,21 +3668,59 @@
           <w:sz w:val="16"/>
           <w:szCs w:val="16"/>
         </w:rPr>
-        <w:t>,</w:t>
-      </w:r>
-      <w:r>
-        <w:rPr>
+        <w:t>45</w:t>
+      </w:r>
+      <w:r>
+        <w:rPr>
+          <w:b/>
+          <w:bCs/>
+          <w:color w:val="0000FF"/>
           <w:sz w:val="16"/>
           <w:szCs w:val="16"/>
         </w:rPr>
-        <w:t xml:space="preserve"> </w:t>
+        <w:t>,</w:t>
       </w:r>
       <w:r>
         <w:rPr>
           <w:sz w:val="16"/>
           <w:szCs w:val="16"/>
         </w:rPr>
+        <w:t xml:space="preserve"> </w:t>
+      </w:r>
+      <w:r>
+        <w:rPr>
+          <w:sz w:val="16"/>
+          <w:szCs w:val="16"/>
+        </w:rPr>
         <w:t>Perform Task D</w:t>
+      </w:r>
+      <w:r>
+        <w:rPr>
+          <w:sz w:val="16"/>
+          <w:szCs w:val="16"/>
+        </w:rPr>
+        <w:t xml:space="preserve">, Steps </w:t>
+      </w:r>
+      <w:r>
+        <w:rPr>
+          <w:sz w:val="16"/>
+          <w:szCs w:val="16"/>
+        </w:rPr>
+        <w:t>1</w:t>
+      </w:r>
+      <w:r>
+        <w:rPr>
+          <w:sz w:val="16"/>
+          <w:szCs w:val="16"/>
+        </w:rPr>
+        <w:t xml:space="preserve"> - </w:t>
+      </w:r>
+      <w:r>
+        <w:rPr>
+          <w:sz w:val="16"/>
+          <w:szCs w:val="16"/>
+        </w:rPr>
+        <w:t>4</w:t>
       </w:r>
     </w:p>
     <w:p>
@@ -3813,7 +3868,7 @@
           <w:sz w:val="16"/>
           <w:szCs w:val="16"/>
         </w:rPr>
-        <w:t>4</w:t>
+        <w:t>30</w:t>
       </w:r>
       <w:r>
         <w:rPr>
@@ -3822,7 +3877,7 @@
           <w:sz w:val="16"/>
           <w:szCs w:val="16"/>
         </w:rPr>
-        <w:t>5,</w:t>
+        <w:t>,</w:t>
       </w:r>
       <w:r>
         <w:rPr>
@@ -3880,66 +3935,31 @@
           <w:sz w:val="16"/>
           <w:szCs w:val="16"/>
         </w:rPr>
-        <w:t xml:space="preserve"> file if no T’s are found</w:t>
-      </w:r>
+        <w:t xml:space="preserve"> file if no </w:t>
+      </w:r>
+      <w:proofErr w:type="gramStart"/>
       <w:r>
         <w:rPr>
           <w:sz w:val="16"/>
           <w:szCs w:val="16"/>
         </w:rPr>
-        <w:t>.</w:t>
-      </w:r>
-    </w:p>
-    <w:p>
-      <w:pPr>
-        <w:pStyle w:val="ListParagraph"/>
-        <w:numPr>
-          <w:ilvl w:val="0"/>
-          <w:numId w:val="18"/>
-        </w:numPr>
+        <w:t>T’s</w:t>
+      </w:r>
+      <w:proofErr w:type="gramEnd"/>
+      <w:r>
         <w:rPr>
           <w:sz w:val="16"/>
           <w:szCs w:val="16"/>
         </w:rPr>
-      </w:pPr>
-      <w:r>
-        <w:rPr>
-          <w:b/>
-          <w:bCs/>
+        <w:t xml:space="preserve"> are found</w:t>
+      </w:r>
+      <w:r>
+        <w:rPr>
           <w:sz w:val="16"/>
           <w:szCs w:val="16"/>
         </w:rPr>
-        <w:t xml:space="preserve">Sunday: </w:t>
-      </w:r>
-      <w:r>
-        <w:rPr>
-          <w:sz w:val="16"/>
-          <w:szCs w:val="16"/>
-        </w:rPr>
-        <w:t>Re-authorize APIs</w:t>
-      </w:r>
-      <w:r>
-        <w:rPr>
-          <w:sz w:val="16"/>
-          <w:szCs w:val="16"/>
-        </w:rPr>
         <w:t>.</w:t>
       </w:r>
-    </w:p>
-    <w:p>
-      <w:pPr>
-        <w:pStyle w:val="ListParagraph"/>
-        <w:ind w:left="0"/>
-        <w:rPr>
-          <w:b/>
-          <w:bCs/>
-          <w:i/>
-          <w:iCs/>
-          <w:sz w:val="18"/>
-          <w:szCs w:val="18"/>
-          <w:u w:val="single"/>
-        </w:rPr>
-      </w:pPr>
     </w:p>
     <w:p>
       <w:pPr>

</xml_diff>